<commit_message>
Module 2: Netmiko inventory backup with env secrets and per-device error handling
</commit_message>
<xml_diff>
--- a/Blog/Network Automation Blog.docx
+++ b/Blog/Network Automation Blog.docx
@@ -1,6 +1,6 @@
 
 <file path=word/document.xml><?xml version="1.0" encoding="utf-8"?>
-<w:document xmlns:wpc="http://schemas.microsoft.com/office/word/2010/wordprocessingCanvas" xmlns:cx="http://schemas.microsoft.com/office/drawing/2014/chartex" xmlns:cx1="http://schemas.microsoft.com/office/drawing/2015/9/8/chartex" xmlns:cx2="http://schemas.microsoft.com/office/drawing/2015/10/21/chartex" xmlns:cx3="http://schemas.microsoft.com/office/drawing/2016/5/9/chartex" xmlns:cx4="http://schemas.microsoft.com/office/drawing/2016/5/10/chartex" xmlns:cx5="http://schemas.microsoft.com/office/drawing/2016/5/11/chartex" xmlns:cx6="http://schemas.microsoft.com/office/drawing/2016/5/12/chartex" xmlns:cx7="http://schemas.microsoft.com/office/drawing/2016/5/13/chartex" xmlns:cx8="http://schemas.microsoft.com/office/drawing/2016/5/14/chartex" xmlns:mc="http://schemas.openxmlformats.org/markup-compatibility/2006" xmlns:aink="http://schemas.microsoft.com/office/drawing/2016/ink" xmlns:am3d="http://schemas.microsoft.com/office/drawing/2017/model3d" xmlns:o="urn:schemas-microsoft-com:office:office" xmlns:oel="http://schemas.microsoft.com/office/2019/extlst" xmlns:r="http://schemas.openxmlformats.org/officeDocument/2006/relationships" xmlns:m="http://schemas.openxmlformats.org/officeDocument/2006/math" xmlns:v="urn:schemas-microsoft-com:vml" xmlns:wp14="http://schemas.microsoft.com/office/word/2010/wordprocessingDrawing" xmlns:wp="http://schemas.openxmlformats.org/drawingml/2006/wordprocessingDrawing" xmlns:w10="urn:schemas-microsoft-com:office:word" xmlns:w="http://schemas.openxmlformats.org/wordprocessingml/2006/main" xmlns:w14="http://schemas.microsoft.com/office/word/2010/wordml" xmlns:w15="http://schemas.microsoft.com/office/word/2012/wordml" xmlns:w16cex="http://schemas.microsoft.com/office/word/2018/wordml/cex" xmlns:w16cid="http://schemas.microsoft.com/office/word/2016/wordml/cid" xmlns:w16="http://schemas.microsoft.com/office/word/2018/wordml" xmlns:w16du="http://schemas.microsoft.com/office/word/2023/wordml/word16du" xmlns:w16sdtdh="http://schemas.microsoft.com/office/word/2020/wordml/sdtdatahash" xmlns:w16sdtfl="http://schemas.microsoft.com/office/word/2024/wordml/sdtformatlock" xmlns:w16se="http://schemas.microsoft.com/office/word/2015/wordml/symex" xmlns:wpg="http://schemas.microsoft.com/office/word/2010/wordprocessingGroup" xmlns:wpi="http://schemas.microsoft.com/office/word/2010/wordprocessingInk" xmlns:wne="http://schemas.microsoft.com/office/word/2006/wordml" xmlns:wps="http://schemas.microsoft.com/office/word/2010/wordprocessingShape" mc:Ignorable="w14 w15 w16se w16cid w16 w16cex w16sdtdh w16sdtfl w16du wp14">
+<w:document xmlns:wpc="http://schemas.microsoft.com/office/word/2010/wordprocessingCanvas" xmlns:cx="http://schemas.microsoft.com/office/drawing/2014/chartex" xmlns:cx1="http://schemas.microsoft.com/office/drawing/2015/9/8/chartex" xmlns:cx2="http://schemas.microsoft.com/office/drawing/2015/10/21/chartex" xmlns:cx3="http://schemas.microsoft.com/office/drawing/2016/5/9/chartex" xmlns:cx4="http://schemas.microsoft.com/office/drawing/2016/5/10/chartex" xmlns:cx5="http://schemas.microsoft.com/office/drawing/2016/5/11/chartex" xmlns:cx6="http://schemas.microsoft.com/office/drawing/2016/5/12/chartex" xmlns:cx7="http://schemas.microsoft.com/office/drawing/2016/5/13/chartex" xmlns:cx8="http://schemas.microsoft.com/office/drawing/2016/5/14/chartex" xmlns:mc="http://schemas.openxmlformats.org/markup-compatibility/2006" xmlns:m="http://schemas.openxmlformats.org/officeDocument/2006/math" xmlns:aink="http://schemas.microsoft.com/office/drawing/2016/ink" xmlns:am3d="http://schemas.microsoft.com/office/drawing/2017/model3d" xmlns:oel="http://schemas.microsoft.com/office/2019/extlst" xmlns:r="http://schemas.openxmlformats.org/officeDocument/2006/relationships" xmlns:wp14="http://schemas.microsoft.com/office/word/2010/wordprocessingDrawing" xmlns:wp="http://schemas.openxmlformats.org/drawingml/2006/wordprocessingDrawing" xmlns:wpg="http://schemas.microsoft.com/office/word/2010/wordprocessingGroup" xmlns:wpi="http://schemas.microsoft.com/office/word/2010/wordprocessingInk" xmlns:wps="http://schemas.microsoft.com/office/word/2010/wordprocessingShape" xmlns:o="urn:schemas-microsoft-com:office:office" xmlns:v="urn:schemas-microsoft-com:vml" xmlns:w10="urn:schemas-microsoft-com:office:word" xmlns:w="http://schemas.openxmlformats.org/wordprocessingml/2006/main" xmlns:w14="http://schemas.microsoft.com/office/word/2010/wordml" xmlns:w15="http://schemas.microsoft.com/office/word/2012/wordml" xmlns:w16cei="http://schemas.microsoft.com/office/word/2026/wordml/cei" xmlns:w16cex="http://schemas.microsoft.com/office/word/2018/wordml/cex" xmlns:w16cid="http://schemas.microsoft.com/office/word/2016/wordml/cid" xmlns:w16="http://schemas.microsoft.com/office/word/2018/wordml" xmlns:w16sdtdh="http://schemas.microsoft.com/office/word/2020/wordml/sdtdatahash" xmlns:w16sdtfl="http://schemas.microsoft.com/office/word/2024/wordml/sdtformatlock" xmlns:w16se="http://schemas.microsoft.com/office/word/2015/wordml/symex" xmlns:w16du="http://schemas.microsoft.com/office/word/2023/wordml/word16du" xmlns:wne="http://schemas.microsoft.com/office/word/2006/wordml" mc:Ignorable="w14 w15 w16se w16cid w16 w16cex w16sdtdh w16sdtfl w16du wp14">
   <w:body>
     <w:p>
       <w:r>
@@ -27,27 +27,56 @@
       <w:r>
         <w:t xml:space="preserve"> </w:t>
       </w:r>
-      <w:proofErr w:type="gramStart"/>
+      <w:proofErr w:type="spellStart"/>
       <w:r>
         <w:t>logging.basicConfig</w:t>
       </w:r>
-      <w:proofErr w:type="gramEnd"/>
-      <w:r>
-        <w:t>(</w:t>
-      </w:r>
-      <w:proofErr w:type="gramStart"/>
-      <w:r>
-        <w:t>level=logging.INFO,format</w:t>
-      </w:r>
-      <w:proofErr w:type="gramEnd"/>
-      <w:r>
-        <w:t>="%(asctime)s %(levelname)s %(message)s")</w:t>
+      <w:proofErr w:type="spellEnd"/>
+      <w:r>
+        <w:t>(level=</w:t>
+      </w:r>
+      <w:proofErr w:type="spellStart"/>
+      <w:r>
+        <w:t>logging.INFO,format</w:t>
+      </w:r>
+      <w:proofErr w:type="spellEnd"/>
+      <w:r>
+        <w:t>="%(</w:t>
+      </w:r>
+      <w:proofErr w:type="spellStart"/>
+      <w:r>
+        <w:t>asctime</w:t>
+      </w:r>
+      <w:proofErr w:type="spellEnd"/>
+      <w:r>
+        <w:t>)s %(</w:t>
+      </w:r>
+      <w:proofErr w:type="spellStart"/>
+      <w:r>
+        <w:t>levelname</w:t>
+      </w:r>
+      <w:proofErr w:type="spellEnd"/>
+      <w:r>
+        <w:t>)s %(message)s")</w:t>
       </w:r>
     </w:p>
     <w:p/>
     <w:p>
-      <w:r>
-        <w:t>asctime, levelname, message, name (and ~15 others) are a fixed, predefined vocabulary baked into the logging library</w:t>
+      <w:proofErr w:type="spellStart"/>
+      <w:r>
+        <w:t>asctime</w:t>
+      </w:r>
+      <w:proofErr w:type="spellEnd"/>
+      <w:r>
+        <w:t xml:space="preserve">, </w:t>
+      </w:r>
+      <w:proofErr w:type="spellStart"/>
+      <w:r>
+        <w:t>levelname</w:t>
+      </w:r>
+      <w:proofErr w:type="spellEnd"/>
+      <w:r>
+        <w:t>, message, name (and ~15 others) are a fixed, predefined vocabulary baked into the logging library</w:t>
       </w:r>
       <w:r>
         <w:t xml:space="preserve"> -CHOOSE from these. </w:t>
@@ -61,19 +90,24 @@
     </w:p>
     <w:p>
       <w:r>
-        <w:t>from time import asctime</w:t>
-      </w:r>
+        <w:t xml:space="preserve">from time import </w:t>
+      </w:r>
+      <w:proofErr w:type="spellStart"/>
+      <w:r>
+        <w:t>asctime</w:t>
+      </w:r>
+      <w:proofErr w:type="spellEnd"/>
     </w:p>
     <w:p/>
     <w:p>
       <w:r>
         <w:t xml:space="preserve">logger = </w:t>
       </w:r>
-      <w:proofErr w:type="gramStart"/>
+      <w:proofErr w:type="spellStart"/>
       <w:r>
         <w:t>logging.getLogger</w:t>
       </w:r>
-      <w:proofErr w:type="gramEnd"/>
+      <w:proofErr w:type="spellEnd"/>
       <w:r>
         <w:t>(__name__) #just grab a logger to talk to, not configured anything yet</w:t>
       </w:r>
@@ -218,6 +252,7 @@
         </w:rPr>
         <w:t xml:space="preserve">    </w:t>
       </w:r>
+      <w:proofErr w:type="spellStart"/>
       <w:r>
         <w:rPr>
           <w:rFonts w:ascii="Menlo" w:eastAsia="Times New Roman" w:hAnsi="Menlo" w:cs="Menlo"/>
@@ -254,6 +289,7 @@
         </w:rPr>
         <w:t>basicConfig</w:t>
       </w:r>
+      <w:proofErr w:type="spellEnd"/>
       <w:r>
         <w:rPr>
           <w:rFonts w:ascii="Menlo" w:eastAsia="Times New Roman" w:hAnsi="Menlo" w:cs="Menlo"/>
@@ -292,6 +328,7 @@
         </w:rPr>
         <w:t>=</w:t>
       </w:r>
+      <w:proofErr w:type="spellStart"/>
       <w:r>
         <w:rPr>
           <w:rFonts w:ascii="Menlo" w:eastAsia="Times New Roman" w:hAnsi="Menlo" w:cs="Menlo"/>
@@ -354,6 +391,7 @@
         </w:rPr>
         <w:t>format</w:t>
       </w:r>
+      <w:proofErr w:type="spellEnd"/>
       <w:r>
         <w:rPr>
           <w:rFonts w:ascii="Menlo" w:eastAsia="Times New Roman" w:hAnsi="Menlo" w:cs="Menlo"/>
@@ -388,7 +426,33 @@
           <w:lang w:val="en-IN" w:eastAsia="en-GB"/>
           <w14:ligatures w14:val="none"/>
         </w:rPr>
-        <w:t>%(asctime)s</w:t>
+        <w:t>%(</w:t>
+      </w:r>
+      <w:proofErr w:type="spellStart"/>
+      <w:r>
+        <w:rPr>
+          <w:rFonts w:ascii="Menlo" w:eastAsia="Times New Roman" w:hAnsi="Menlo" w:cs="Menlo"/>
+          <w:color w:val="F8C762"/>
+          <w:kern w:val="0"/>
+          <w:sz w:val="18"/>
+          <w:szCs w:val="18"/>
+          <w:lang w:val="en-IN" w:eastAsia="en-GB"/>
+          <w14:ligatures w14:val="none"/>
+        </w:rPr>
+        <w:t>asctime</w:t>
+      </w:r>
+      <w:proofErr w:type="spellEnd"/>
+      <w:r>
+        <w:rPr>
+          <w:rFonts w:ascii="Menlo" w:eastAsia="Times New Roman" w:hAnsi="Menlo" w:cs="Menlo"/>
+          <w:color w:val="F8C762"/>
+          <w:kern w:val="0"/>
+          <w:sz w:val="18"/>
+          <w:szCs w:val="18"/>
+          <w:lang w:val="en-IN" w:eastAsia="en-GB"/>
+          <w14:ligatures w14:val="none"/>
+        </w:rPr>
+        <w:t>)s</w:t>
       </w:r>
       <w:r>
         <w:rPr>
@@ -412,7 +476,33 @@
           <w:lang w:val="en-IN" w:eastAsia="en-GB"/>
           <w14:ligatures w14:val="none"/>
         </w:rPr>
-        <w:t>%(levelname)s</w:t>
+        <w:t>%(</w:t>
+      </w:r>
+      <w:proofErr w:type="spellStart"/>
+      <w:r>
+        <w:rPr>
+          <w:rFonts w:ascii="Menlo" w:eastAsia="Times New Roman" w:hAnsi="Menlo" w:cs="Menlo"/>
+          <w:color w:val="F8C762"/>
+          <w:kern w:val="0"/>
+          <w:sz w:val="18"/>
+          <w:szCs w:val="18"/>
+          <w:lang w:val="en-IN" w:eastAsia="en-GB"/>
+          <w14:ligatures w14:val="none"/>
+        </w:rPr>
+        <w:t>levelname</w:t>
+      </w:r>
+      <w:proofErr w:type="spellEnd"/>
+      <w:r>
+        <w:rPr>
+          <w:rFonts w:ascii="Menlo" w:eastAsia="Times New Roman" w:hAnsi="Menlo" w:cs="Menlo"/>
+          <w:color w:val="F8C762"/>
+          <w:kern w:val="0"/>
+          <w:sz w:val="18"/>
+          <w:szCs w:val="18"/>
+          <w:lang w:val="en-IN" w:eastAsia="en-GB"/>
+          <w14:ligatures w14:val="none"/>
+        </w:rPr>
+        <w:t>)s</w:t>
       </w:r>
       <w:r>
         <w:rPr>
@@ -489,6 +579,7 @@
         </w:rPr>
         <w:t xml:space="preserve">    </w:t>
       </w:r>
+      <w:proofErr w:type="spellStart"/>
       <w:r>
         <w:rPr>
           <w:rFonts w:ascii="Menlo" w:eastAsia="Times New Roman" w:hAnsi="Menlo" w:cs="Menlo"/>
@@ -525,6 +616,7 @@
         </w:rPr>
         <w:t>info</w:t>
       </w:r>
+      <w:proofErr w:type="spellEnd"/>
       <w:r>
         <w:rPr>
           <w:rFonts w:ascii="Menlo" w:eastAsia="Times New Roman" w:hAnsi="Menlo" w:cs="Menlo"/>
@@ -636,6 +728,7 @@
         </w:rPr>
         <w:t xml:space="preserve"> </w:t>
       </w:r>
+      <w:proofErr w:type="spellStart"/>
       <w:r>
         <w:rPr>
           <w:rFonts w:ascii="Menlo" w:eastAsia="Times New Roman" w:hAnsi="Menlo" w:cs="Menlo"/>
@@ -648,6 +741,7 @@
         </w:rPr>
         <w:t>build_data</w:t>
       </w:r>
+      <w:proofErr w:type="spellEnd"/>
       <w:r>
         <w:rPr>
           <w:rFonts w:ascii="Menlo" w:eastAsia="Times New Roman" w:hAnsi="Menlo" w:cs="Menlo"/>
@@ -747,7 +841,33 @@
           <w:lang w:val="en-IN" w:eastAsia="en-GB"/>
           <w14:ligatures w14:val="none"/>
         </w:rPr>
-        <w:t>"output.json"</w:t>
+        <w:t>"</w:t>
+      </w:r>
+      <w:proofErr w:type="spellStart"/>
+      <w:r>
+        <w:rPr>
+          <w:rFonts w:ascii="Menlo" w:eastAsia="Times New Roman" w:hAnsi="Menlo" w:cs="Menlo"/>
+          <w:color w:val="E394DC"/>
+          <w:kern w:val="0"/>
+          <w:sz w:val="18"/>
+          <w:szCs w:val="18"/>
+          <w:lang w:val="en-IN" w:eastAsia="en-GB"/>
+          <w14:ligatures w14:val="none"/>
+        </w:rPr>
+        <w:t>output.json</w:t>
+      </w:r>
+      <w:proofErr w:type="spellEnd"/>
+      <w:r>
+        <w:rPr>
+          <w:rFonts w:ascii="Menlo" w:eastAsia="Times New Roman" w:hAnsi="Menlo" w:cs="Menlo"/>
+          <w:color w:val="E394DC"/>
+          <w:kern w:val="0"/>
+          <w:sz w:val="18"/>
+          <w:szCs w:val="18"/>
+          <w:lang w:val="en-IN" w:eastAsia="en-GB"/>
+          <w14:ligatures w14:val="none"/>
+        </w:rPr>
+        <w:t>"</w:t>
       </w:r>
       <w:r>
         <w:rPr>
@@ -886,6 +1006,7 @@
         </w:rPr>
         <w:t xml:space="preserve">        </w:t>
       </w:r>
+      <w:proofErr w:type="spellStart"/>
       <w:r>
         <w:rPr>
           <w:rFonts w:ascii="Menlo" w:eastAsia="Times New Roman" w:hAnsi="Menlo" w:cs="Menlo"/>
@@ -922,6 +1043,7 @@
         </w:rPr>
         <w:t>dump</w:t>
       </w:r>
+      <w:proofErr w:type="spellEnd"/>
       <w:r>
         <w:rPr>
           <w:rFonts w:ascii="Menlo" w:eastAsia="Times New Roman" w:hAnsi="Menlo" w:cs="Menlo"/>
@@ -1083,6 +1205,7 @@
         </w:rPr>
         <w:t xml:space="preserve">    </w:t>
       </w:r>
+      <w:proofErr w:type="spellStart"/>
       <w:r>
         <w:rPr>
           <w:rFonts w:ascii="Menlo" w:eastAsia="Times New Roman" w:hAnsi="Menlo" w:cs="Menlo"/>
@@ -1119,6 +1242,7 @@
         </w:rPr>
         <w:t>info</w:t>
       </w:r>
+      <w:proofErr w:type="spellEnd"/>
       <w:r>
         <w:rPr>
           <w:rFonts w:ascii="Menlo" w:eastAsia="Times New Roman" w:hAnsi="Menlo" w:cs="Menlo"/>
@@ -1164,21 +1288,21 @@
       <w:r>
         <w:t xml:space="preserve">: </w:t>
       </w:r>
-      <w:proofErr w:type="gramStart"/>
+      <w:proofErr w:type="spellStart"/>
       <w:r>
         <w:t>logger.error</w:t>
       </w:r>
-      <w:proofErr w:type="gramEnd"/>
-      <w:r>
-        <w:t>(f"failed to open '{filename}</w:t>
-      </w:r>
-      <w:proofErr w:type="gramStart"/>
-      <w:r>
-        <w:t>' :</w:t>
-      </w:r>
-      <w:proofErr w:type="gramEnd"/>
-      <w:r>
-        <w:t xml:space="preserve"> {e}")</w:t>
+      <w:proofErr w:type="spellEnd"/>
+      <w:r>
+        <w:t>(</w:t>
+      </w:r>
+      <w:proofErr w:type="spellStart"/>
+      <w:r>
+        <w:t>f"failed</w:t>
+      </w:r>
+      <w:proofErr w:type="spellEnd"/>
+      <w:r>
+        <w:t xml:space="preserve"> to open '{filename}' : {e}")</w:t>
       </w:r>
     </w:p>
     <w:p/>
@@ -1189,13 +1313,37 @@
       <w:r>
         <w:t xml:space="preserve"> </w:t>
       </w:r>
-      <w:proofErr w:type="gramStart"/>
+      <w:proofErr w:type="spellStart"/>
       <w:r>
         <w:t>logger.debug</w:t>
       </w:r>
-      <w:proofErr w:type="gramEnd"/>
-      <w:r>
-        <w:t>(" file %s with hostname %s has %s interfaces and %d OSPF networks", filename, hostname, len(interface), len(ospf))</w:t>
+      <w:proofErr w:type="spellEnd"/>
+      <w:r>
+        <w:t xml:space="preserve">(" file %s with hostname %s has %s interfaces and %d OSPF networks", filename, hostname, </w:t>
+      </w:r>
+      <w:proofErr w:type="spellStart"/>
+      <w:r>
+        <w:t>len</w:t>
+      </w:r>
+      <w:proofErr w:type="spellEnd"/>
+      <w:r>
+        <w:t xml:space="preserve">(interface), </w:t>
+      </w:r>
+      <w:proofErr w:type="spellStart"/>
+      <w:r>
+        <w:t>len</w:t>
+      </w:r>
+      <w:proofErr w:type="spellEnd"/>
+      <w:r>
+        <w:t>(</w:t>
+      </w:r>
+      <w:proofErr w:type="spellStart"/>
+      <w:r>
+        <w:t>ospf</w:t>
+      </w:r>
+      <w:proofErr w:type="spellEnd"/>
+      <w:r>
+        <w:t>))</w:t>
       </w:r>
     </w:p>
     <w:p/>
@@ -1259,7 +1407,23 @@
     <w:p/>
     <w:p>
       <w:r>
-        <w:t>ok, so i was missing a list as input and that list was fed into get_hotname function which then was stored in result and matched with actual R1 output.</w:t>
+        <w:t xml:space="preserve">ok, so </w:t>
+      </w:r>
+      <w:proofErr w:type="spellStart"/>
+      <w:r>
+        <w:t>i</w:t>
+      </w:r>
+      <w:proofErr w:type="spellEnd"/>
+      <w:r>
+        <w:t xml:space="preserve"> was missing a list as input and that list was fed into </w:t>
+      </w:r>
+      <w:proofErr w:type="spellStart"/>
+      <w:r>
+        <w:t>get_hotname</w:t>
+      </w:r>
+      <w:proofErr w:type="spellEnd"/>
+      <w:r>
+        <w:t xml:space="preserve"> function which then was stored in result and matched with actual R1 output.</w:t>
       </w:r>
     </w:p>
     <w:p/>
@@ -1303,6 +1467,7 @@
         </w:rPr>
         <w:t xml:space="preserve"> </w:t>
       </w:r>
+      <w:proofErr w:type="spellStart"/>
       <w:r>
         <w:rPr>
           <w:rFonts w:ascii="Menlo" w:eastAsia="Times New Roman" w:hAnsi="Menlo" w:cs="Menlo"/>
@@ -1315,6 +1480,7 @@
         </w:rPr>
         <w:t>config_analyzer</w:t>
       </w:r>
+      <w:proofErr w:type="spellEnd"/>
       <w:r>
         <w:rPr>
           <w:rFonts w:ascii="Menlo" w:eastAsia="Times New Roman" w:hAnsi="Menlo" w:cs="Menlo"/>
@@ -1353,6 +1519,7 @@
         </w:rPr>
         <w:t xml:space="preserve"> </w:t>
       </w:r>
+      <w:proofErr w:type="spellStart"/>
       <w:r>
         <w:rPr>
           <w:rFonts w:ascii="Menlo" w:eastAsia="Times New Roman" w:hAnsi="Menlo" w:cs="Menlo"/>
@@ -1365,6 +1532,7 @@
         </w:rPr>
         <w:t>get_hostname</w:t>
       </w:r>
+      <w:proofErr w:type="spellEnd"/>
     </w:p>
     <w:p>
       <w:pPr>
@@ -1419,6 +1587,7 @@
         </w:rPr>
         <w:t xml:space="preserve"> </w:t>
       </w:r>
+      <w:proofErr w:type="spellStart"/>
       <w:r>
         <w:rPr>
           <w:rFonts w:ascii="Menlo" w:eastAsia="Times New Roman" w:hAnsi="Menlo" w:cs="Menlo"/>
@@ -1433,6 +1602,7 @@
         </w:rPr>
         <w:t>test_get_hostname</w:t>
       </w:r>
+      <w:proofErr w:type="spellEnd"/>
       <w:r>
         <w:rPr>
           <w:rFonts w:ascii="Menlo" w:eastAsia="Times New Roman" w:hAnsi="Menlo" w:cs="Menlo"/>
@@ -1775,6 +1945,7 @@
         </w:rPr>
         <w:t xml:space="preserve"> </w:t>
       </w:r>
+      <w:proofErr w:type="spellStart"/>
       <w:r>
         <w:rPr>
           <w:rFonts w:ascii="Menlo" w:eastAsia="Times New Roman" w:hAnsi="Menlo" w:cs="Menlo"/>
@@ -1787,6 +1958,7 @@
         </w:rPr>
         <w:t>get_hostname</w:t>
       </w:r>
+      <w:proofErr w:type="spellEnd"/>
       <w:r>
         <w:rPr>
           <w:rFonts w:ascii="Menlo" w:eastAsia="Times New Roman" w:hAnsi="Menlo" w:cs="Menlo"/>
@@ -2019,14 +2191,11 @@
       <w:r>
         <w:t>@</w:t>
       </w:r>
-      <w:proofErr w:type="gramStart"/>
-      <w:r>
-        <w:t>pytest.mark</w:t>
-      </w:r>
-      <w:proofErr w:type="gramEnd"/>
-      <w:r>
-        <w:t>.parametrize</w:t>
-      </w:r>
+      <w:proofErr w:type="spellStart"/>
+      <w:r>
+        <w:t>pytest.mark.parametrize</w:t>
+      </w:r>
+      <w:proofErr w:type="spellEnd"/>
       <w:r>
         <w:t xml:space="preserve"> </w:t>
       </w:r>
@@ -2039,8 +2208,13 @@
     </w:p>
     <w:p/>
     <w:p>
-      <w:r>
-        <w:t>Pytest -v to view all the tests status</w:t>
+      <w:proofErr w:type="spellStart"/>
+      <w:r>
+        <w:t>Pytest</w:t>
+      </w:r>
+      <w:proofErr w:type="spellEnd"/>
+      <w:r>
+        <w:t xml:space="preserve"> -v to view all the tests status</w:t>
       </w:r>
     </w:p>
     <w:p/>
@@ -2055,27 +2229,37 @@
         <w:t>fixture</w:t>
       </w:r>
       <w:r>
-        <w:t xml:space="preserve"> is setup that pytest prepares for you and hands to you</w:t>
+        <w:t xml:space="preserve"> is setup that </w:t>
+      </w:r>
+      <w:proofErr w:type="spellStart"/>
+      <w:r>
+        <w:t>pytest</w:t>
+      </w:r>
+      <w:proofErr w:type="spellEnd"/>
+      <w:r>
+        <w:t xml:space="preserve"> prepares for you and hands to you</w:t>
       </w:r>
       <w:r>
         <w:t xml:space="preserve">. </w:t>
       </w:r>
+      <w:proofErr w:type="spellStart"/>
       <w:r>
         <w:rPr>
           <w:u w:val="single"/>
         </w:rPr>
         <w:t>tmp_path</w:t>
       </w:r>
-      <w:r>
-        <w:t xml:space="preserve"> is a built-in fixture. When you ask for it, pytest gives you a brand-new, empty temporary directory — unique to that one </w:t>
-      </w:r>
-      <w:proofErr w:type="gramStart"/>
-      <w:r>
-        <w:t>test, and</w:t>
-      </w:r>
-      <w:proofErr w:type="gramEnd"/>
-      <w:r>
-        <w:t xml:space="preserve"> automatically deleted afterward.</w:t>
+      <w:proofErr w:type="spellEnd"/>
+      <w:r>
+        <w:t xml:space="preserve"> is a built-in fixture. When you ask for it, </w:t>
+      </w:r>
+      <w:proofErr w:type="spellStart"/>
+      <w:r>
+        <w:t>pytest</w:t>
+      </w:r>
+      <w:proofErr w:type="spellEnd"/>
+      <w:r>
+        <w:t xml:space="preserve"> gives you a brand-new, empty temporary directory — unique to that one test, and automatically deleted afterward.</w:t>
       </w:r>
     </w:p>
     <w:p/>
@@ -2096,7 +2280,15 @@
     </w:p>
     <w:p>
       <w:r>
-        <w:t>Else (do this if try suceeded)</w:t>
+        <w:t xml:space="preserve">Else (do this if try </w:t>
+      </w:r>
+      <w:proofErr w:type="spellStart"/>
+      <w:r>
+        <w:t>suceeded</w:t>
+      </w:r>
+      <w:proofErr w:type="spellEnd"/>
+      <w:r>
+        <w:t>)</w:t>
       </w:r>
     </w:p>
     <w:p>
@@ -2107,15 +2299,7 @@
     <w:p/>
     <w:p>
       <w:r>
-        <w:t xml:space="preserve">break does not act on if statements at all. if is not a loop, so there's nothing to "break out of." break only ever targets the nearest enclosing loop — here that's the </w:t>
-      </w:r>
-      <w:proofErr w:type="gramStart"/>
-      <w:r>
-        <w:t>for j</w:t>
-      </w:r>
-      <w:proofErr w:type="gramEnd"/>
-      <w:r>
-        <w:t xml:space="preserve"> loop</w:t>
+        <w:t>break does not act on if statements at all. if is not a loop, so there's nothing to "break out of." break only ever targets the nearest enclosing loop — here that's the for j loop</w:t>
       </w:r>
     </w:p>
     <w:p/>
@@ -2127,15 +2311,23 @@
     <w:p/>
     <w:p>
       <w:r>
-        <w:t xml:space="preserve">By naming (OSError, UnicodeDecodeError), you catch only the failures you </w:t>
-      </w:r>
-      <w:proofErr w:type="gramStart"/>
-      <w:r>
-        <w:t>actually know</w:t>
-      </w:r>
-      <w:proofErr w:type="gramEnd"/>
-      <w:r>
-        <w:t xml:space="preserve"> how to recover from ("this file is unreadable — record it and move on"), and you let everything else — bugs, Ctrl-C — fly past and surface honestly</w:t>
+        <w:t>By naming (</w:t>
+      </w:r>
+      <w:proofErr w:type="spellStart"/>
+      <w:r>
+        <w:t>OSError</w:t>
+      </w:r>
+      <w:proofErr w:type="spellEnd"/>
+      <w:r>
+        <w:t xml:space="preserve">, </w:t>
+      </w:r>
+      <w:proofErr w:type="spellStart"/>
+      <w:r>
+        <w:t>UnicodeDecodeError</w:t>
+      </w:r>
+      <w:proofErr w:type="spellEnd"/>
+      <w:r>
+        <w:t>), you catch only the failures you actually know how to recover from ("this file is unreadable — record it and move on"), and you let everything else — bugs, Ctrl-C — fly past and surface honestly</w:t>
       </w:r>
       <w:r>
         <w:t xml:space="preserve"> -loud crash</w:t>
@@ -2172,9 +2364,867 @@
           <w:szCs w:val="22"/>
           <w:shd w:val="clear" w:color="auto" w:fill="181818"/>
         </w:rPr>
-        <w:t xml:space="preserve">catch the narrowest exception you can </w:t>
-      </w:r>
-      <w:proofErr w:type="gramStart"/>
+        <w:t>catch the narrowest exception you can actually act on; let everything else propagate.</w:t>
+      </w:r>
+    </w:p>
+    <w:p/>
+    <w:p>
+      <w:r>
+        <w:rPr>
+          <w:highlight w:val="cyan"/>
+        </w:rPr>
+        <w:t>CLASS and OBJECTS</w:t>
+      </w:r>
+      <w:r>
+        <w:rPr>
+          <w:highlight w:val="cyan"/>
+        </w:rPr>
+        <w:t>:</w:t>
+      </w:r>
+    </w:p>
+    <w:p/>
+    <w:p>
+      <w:r>
+        <w:t>When</w:t>
+      </w:r>
+      <w:r>
+        <w:t xml:space="preserve"> you keep passing the same argument into a group of related functions, that's the universe telling you "make a class." Bundle the data (state) with the behavior that acts on it.</w:t>
+      </w:r>
+    </w:p>
+    <w:p/>
+    <w:p>
+      <w:r>
+        <w:lastRenderedPageBreak/>
+        <w:t>self inside the class = "me, the specific object this was called on." The data isn't shared across objects — each instance has its own attributes.</w:t>
+      </w:r>
+    </w:p>
+    <w:p/>
+    <w:p>
+      <w:r>
+        <w:rPr>
+          <w:b/>
+          <w:bCs/>
+          <w:i/>
+          <w:iCs/>
+          <w:u w:val="single"/>
+        </w:rPr>
+        <w:t>self</w:t>
+      </w:r>
+      <w:r>
+        <w:t xml:space="preserve"> — a parameter; it's how the object arrives into the method. Written bare because it is the object.</w:t>
+      </w:r>
+    </w:p>
+    <w:p>
+      <w:proofErr w:type="spellStart"/>
+      <w:r>
+        <w:rPr>
+          <w:b/>
+          <w:bCs/>
+          <w:i/>
+          <w:iCs/>
+          <w:u w:val="single"/>
+        </w:rPr>
+        <w:t>self.data</w:t>
+      </w:r>
+      <w:proofErr w:type="spellEnd"/>
+      <w:r>
+        <w:t xml:space="preserve"> — has self. because data is state the object remembers beyond this call. You reach it through the object.</w:t>
+      </w:r>
+    </w:p>
+    <w:p/>
+    <w:p>
+      <w:r>
+        <w:t xml:space="preserve">Self is handle to the entire object. </w:t>
+      </w:r>
+    </w:p>
+    <w:p/>
+    <w:p>
+      <w:r>
+        <w:rPr>
+          <w:color w:val="E97132" w:themeColor="accent2"/>
+        </w:rPr>
+        <w:t xml:space="preserve">a </w:t>
+      </w:r>
+      <w:r>
+        <w:t xml:space="preserve">becomes self automatically. So </w:t>
+      </w:r>
+      <w:proofErr w:type="spellStart"/>
+      <w:r>
+        <w:rPr>
+          <w:color w:val="E97132" w:themeColor="accent2"/>
+        </w:rPr>
+        <w:t>a.get_hostname</w:t>
+      </w:r>
+      <w:proofErr w:type="spellEnd"/>
+      <w:r>
+        <w:rPr>
+          <w:color w:val="E97132" w:themeColor="accent2"/>
+        </w:rPr>
+        <w:t xml:space="preserve">(self) is wrong </w:t>
+      </w:r>
+      <w:r>
+        <w:t xml:space="preserve">— you </w:t>
+      </w:r>
+      <w:r>
+        <w:rPr>
+          <w:b/>
+          <w:bCs/>
+        </w:rPr>
+        <w:t>never pass self</w:t>
+      </w:r>
+      <w:r>
+        <w:t xml:space="preserve"> when calling</w:t>
+      </w:r>
+    </w:p>
+    <w:p/>
+    <w:p>
+      <w:r>
+        <w:t xml:space="preserve">self = ONLY inside the class (in the method definition – first parameter). Meaningless outside. </w:t>
+      </w:r>
+    </w:p>
+    <w:p>
+      <w:proofErr w:type="spellStart"/>
+      <w:r>
+        <w:t>self.data</w:t>
+      </w:r>
+      <w:proofErr w:type="spellEnd"/>
+      <w:r>
+        <w:t xml:space="preserve"> = INSIDE the methods. To reach the object that self caught. To reach/get/call the lines. </w:t>
+      </w:r>
+    </w:p>
+    <w:p>
+      <w:proofErr w:type="spellStart"/>
+      <w:r>
+        <w:t>a.method</w:t>
+      </w:r>
+      <w:proofErr w:type="spellEnd"/>
+      <w:r>
+        <w:t xml:space="preserve">() = outside the class </w:t>
+      </w:r>
+      <w:r>
+        <w:t xml:space="preserve">(a test, </w:t>
+      </w:r>
+      <w:proofErr w:type="spellStart"/>
+      <w:r>
+        <w:t>build_data</w:t>
+      </w:r>
+      <w:proofErr w:type="spellEnd"/>
+      <w:r>
+        <w:t>, __main__</w:t>
+      </w:r>
+      <w:r>
+        <w:t>), no reference of self. M</w:t>
+      </w:r>
+      <w:r>
+        <w:t xml:space="preserve">ake the object (a = </w:t>
+      </w:r>
+      <w:proofErr w:type="spellStart"/>
+      <w:r>
+        <w:t>GetConfig</w:t>
+      </w:r>
+      <w:proofErr w:type="spellEnd"/>
+      <w:r>
+        <w:t>(lines)) and talk to it by its name.</w:t>
+      </w:r>
+    </w:p>
+    <w:p/>
+    <w:p>
+      <w:pPr>
+        <w:shd w:val="clear" w:color="auto" w:fill="181818"/>
+        <w:rPr>
+          <w:rFonts w:ascii="Menlo" w:eastAsia="Times New Roman" w:hAnsi="Menlo" w:cs="Menlo"/>
+          <w:kern w:val="0"/>
+          <w:sz w:val="18"/>
+          <w:szCs w:val="18"/>
+          <w:lang w:val="en-IN" w:eastAsia="en-GB"/>
+          <w14:ligatures w14:val="none"/>
+        </w:rPr>
+      </w:pPr>
+      <w:r>
+        <w:rPr>
+          <w:rFonts w:ascii="Menlo" w:eastAsia="Times New Roman" w:hAnsi="Menlo" w:cs="Menlo"/>
+          <w:kern w:val="0"/>
+          <w:sz w:val="18"/>
+          <w:szCs w:val="18"/>
+          <w:lang w:val="en-IN" w:eastAsia="en-GB"/>
+          <w14:ligatures w14:val="none"/>
+        </w:rPr>
+        <w:t xml:space="preserve">    </w:t>
+      </w:r>
+      <w:r>
+        <w:rPr>
+          <w:rFonts w:ascii="Menlo" w:eastAsia="Times New Roman" w:hAnsi="Menlo" w:cs="Menlo"/>
+          <w:color w:val="82D2CE"/>
+          <w:kern w:val="0"/>
+          <w:sz w:val="18"/>
+          <w:szCs w:val="18"/>
+          <w:lang w:val="en-IN" w:eastAsia="en-GB"/>
+          <w14:ligatures w14:val="none"/>
+        </w:rPr>
+        <w:t>def</w:t>
+      </w:r>
+      <w:r>
+        <w:rPr>
+          <w:rFonts w:ascii="Menlo" w:eastAsia="Times New Roman" w:hAnsi="Menlo" w:cs="Menlo"/>
+          <w:kern w:val="0"/>
+          <w:sz w:val="18"/>
+          <w:szCs w:val="18"/>
+          <w:lang w:val="en-IN" w:eastAsia="en-GB"/>
+          <w14:ligatures w14:val="none"/>
+        </w:rPr>
+        <w:t xml:space="preserve"> </w:t>
+      </w:r>
+      <w:r>
+        <w:rPr>
+          <w:rFonts w:ascii="Menlo" w:eastAsia="Times New Roman" w:hAnsi="Menlo" w:cs="Menlo"/>
+          <w:color w:val="EFB080"/>
+          <w:kern w:val="0"/>
+          <w:sz w:val="18"/>
+          <w:szCs w:val="18"/>
+          <w:lang w:val="en-IN" w:eastAsia="en-GB"/>
+          <w14:ligatures w14:val="none"/>
+        </w:rPr>
+        <w:t>__</w:t>
+      </w:r>
+      <w:proofErr w:type="spellStart"/>
+      <w:r>
+        <w:rPr>
+          <w:rFonts w:ascii="Menlo" w:eastAsia="Times New Roman" w:hAnsi="Menlo" w:cs="Menlo"/>
+          <w:color w:val="EFB080"/>
+          <w:kern w:val="0"/>
+          <w:sz w:val="18"/>
+          <w:szCs w:val="18"/>
+          <w:lang w:val="en-IN" w:eastAsia="en-GB"/>
+          <w14:ligatures w14:val="none"/>
+        </w:rPr>
+        <w:t>init</w:t>
+      </w:r>
+      <w:proofErr w:type="spellEnd"/>
+      <w:r>
+        <w:rPr>
+          <w:rFonts w:ascii="Menlo" w:eastAsia="Times New Roman" w:hAnsi="Menlo" w:cs="Menlo"/>
+          <w:color w:val="EFB080"/>
+          <w:kern w:val="0"/>
+          <w:sz w:val="18"/>
+          <w:szCs w:val="18"/>
+          <w:lang w:val="en-IN" w:eastAsia="en-GB"/>
+          <w14:ligatures w14:val="none"/>
+        </w:rPr>
+        <w:t>__</w:t>
+      </w:r>
+      <w:r>
+        <w:rPr>
+          <w:rFonts w:ascii="Menlo" w:eastAsia="Times New Roman" w:hAnsi="Menlo" w:cs="Menlo"/>
+          <w:kern w:val="0"/>
+          <w:sz w:val="18"/>
+          <w:szCs w:val="18"/>
+          <w:lang w:val="en-IN" w:eastAsia="en-GB"/>
+          <w14:ligatures w14:val="none"/>
+        </w:rPr>
+        <w:t>(</w:t>
+      </w:r>
+      <w:r>
+        <w:rPr>
+          <w:rFonts w:ascii="Menlo" w:eastAsia="Times New Roman" w:hAnsi="Menlo" w:cs="Menlo"/>
+          <w:color w:val="D6D6DD"/>
+          <w:kern w:val="0"/>
+          <w:sz w:val="18"/>
+          <w:szCs w:val="18"/>
+          <w:lang w:val="en-IN" w:eastAsia="en-GB"/>
+          <w14:ligatures w14:val="none"/>
+        </w:rPr>
+        <w:t>self</w:t>
+      </w:r>
+      <w:r>
+        <w:rPr>
+          <w:rFonts w:ascii="Menlo" w:eastAsia="Times New Roman" w:hAnsi="Menlo" w:cs="Menlo"/>
+          <w:kern w:val="0"/>
+          <w:sz w:val="18"/>
+          <w:szCs w:val="18"/>
+          <w:lang w:val="en-IN" w:eastAsia="en-GB"/>
+          <w14:ligatures w14:val="none"/>
+        </w:rPr>
+        <w:t xml:space="preserve">, </w:t>
+      </w:r>
+      <w:r>
+        <w:rPr>
+          <w:rFonts w:ascii="Menlo" w:eastAsia="Times New Roman" w:hAnsi="Menlo" w:cs="Menlo"/>
+          <w:color w:val="D6D6DD"/>
+          <w:kern w:val="0"/>
+          <w:sz w:val="18"/>
+          <w:szCs w:val="18"/>
+          <w:lang w:val="en-IN" w:eastAsia="en-GB"/>
+          <w14:ligatures w14:val="none"/>
+        </w:rPr>
+        <w:t>lines</w:t>
+      </w:r>
+      <w:r>
+        <w:rPr>
+          <w:rFonts w:ascii="Menlo" w:eastAsia="Times New Roman" w:hAnsi="Menlo" w:cs="Menlo"/>
+          <w:kern w:val="0"/>
+          <w:sz w:val="18"/>
+          <w:szCs w:val="18"/>
+          <w:lang w:val="en-IN" w:eastAsia="en-GB"/>
+          <w14:ligatures w14:val="none"/>
+        </w:rPr>
+        <w:t xml:space="preserve">):     </w:t>
+      </w:r>
+      <w:r>
+        <w:rPr>
+          <w:rFonts w:ascii="Menlo" w:eastAsia="Times New Roman" w:hAnsi="Menlo" w:cs="Menlo"/>
+          <w:i/>
+          <w:iCs/>
+          <w:kern w:val="0"/>
+          <w:sz w:val="18"/>
+          <w:szCs w:val="18"/>
+          <w:lang w:val="en-IN" w:eastAsia="en-GB"/>
+          <w14:ligatures w14:val="none"/>
+        </w:rPr>
+        <w:t># 'lines' = incoming value, only here at birth</w:t>
+      </w:r>
+    </w:p>
+    <w:p>
+      <w:pPr>
+        <w:shd w:val="clear" w:color="auto" w:fill="181818"/>
+        <w:rPr>
+          <w:rFonts w:ascii="Menlo" w:eastAsia="Times New Roman" w:hAnsi="Menlo" w:cs="Menlo"/>
+          <w:kern w:val="0"/>
+          <w:sz w:val="18"/>
+          <w:szCs w:val="18"/>
+          <w:lang w:val="en-IN" w:eastAsia="en-GB"/>
+          <w14:ligatures w14:val="none"/>
+        </w:rPr>
+      </w:pPr>
+      <w:r>
+        <w:rPr>
+          <w:rFonts w:ascii="Menlo" w:eastAsia="Times New Roman" w:hAnsi="Menlo" w:cs="Menlo"/>
+          <w:kern w:val="0"/>
+          <w:sz w:val="18"/>
+          <w:szCs w:val="18"/>
+          <w:lang w:val="en-IN" w:eastAsia="en-GB"/>
+          <w14:ligatures w14:val="none"/>
+        </w:rPr>
+        <w:t xml:space="preserve">        </w:t>
+      </w:r>
+      <w:proofErr w:type="spellStart"/>
+      <w:r>
+        <w:rPr>
+          <w:rFonts w:ascii="Menlo" w:eastAsia="Times New Roman" w:hAnsi="Menlo" w:cs="Menlo"/>
+          <w:color w:val="CC7C8A"/>
+          <w:kern w:val="0"/>
+          <w:sz w:val="18"/>
+          <w:szCs w:val="18"/>
+          <w:lang w:val="en-IN" w:eastAsia="en-GB"/>
+          <w14:ligatures w14:val="none"/>
+        </w:rPr>
+        <w:t>self</w:t>
+      </w:r>
+      <w:r>
+        <w:rPr>
+          <w:rFonts w:ascii="Menlo" w:eastAsia="Times New Roman" w:hAnsi="Menlo" w:cs="Menlo"/>
+          <w:kern w:val="0"/>
+          <w:sz w:val="18"/>
+          <w:szCs w:val="18"/>
+          <w:lang w:val="en-IN" w:eastAsia="en-GB"/>
+          <w14:ligatures w14:val="none"/>
+        </w:rPr>
+        <w:t>.data</w:t>
+      </w:r>
+      <w:proofErr w:type="spellEnd"/>
+      <w:r>
+        <w:rPr>
+          <w:rFonts w:ascii="Menlo" w:eastAsia="Times New Roman" w:hAnsi="Menlo" w:cs="Menlo"/>
+          <w:kern w:val="0"/>
+          <w:sz w:val="18"/>
+          <w:szCs w:val="18"/>
+          <w:lang w:val="en-IN" w:eastAsia="en-GB"/>
+          <w14:ligatures w14:val="none"/>
+        </w:rPr>
+        <w:t xml:space="preserve"> = lines          </w:t>
+      </w:r>
+      <w:r>
+        <w:rPr>
+          <w:rFonts w:ascii="Menlo" w:eastAsia="Times New Roman" w:hAnsi="Menlo" w:cs="Menlo"/>
+          <w:i/>
+          <w:iCs/>
+          <w:kern w:val="0"/>
+          <w:sz w:val="18"/>
+          <w:szCs w:val="18"/>
+          <w:lang w:val="en-IN" w:eastAsia="en-GB"/>
+          <w14:ligatures w14:val="none"/>
+        </w:rPr>
+        <w:t xml:space="preserve"># store it ON the object as </w:t>
+      </w:r>
+      <w:proofErr w:type="spellStart"/>
+      <w:r>
+        <w:rPr>
+          <w:rFonts w:ascii="Menlo" w:eastAsia="Times New Roman" w:hAnsi="Menlo" w:cs="Menlo"/>
+          <w:i/>
+          <w:iCs/>
+          <w:kern w:val="0"/>
+          <w:sz w:val="18"/>
+          <w:szCs w:val="18"/>
+          <w:lang w:val="en-IN" w:eastAsia="en-GB"/>
+          <w14:ligatures w14:val="none"/>
+        </w:rPr>
+        <w:t>self.data</w:t>
+      </w:r>
+      <w:proofErr w:type="spellEnd"/>
+    </w:p>
+    <w:p>
+      <w:pPr>
+        <w:shd w:val="clear" w:color="auto" w:fill="181818"/>
+        <w:rPr>
+          <w:rFonts w:ascii="Menlo" w:eastAsia="Times New Roman" w:hAnsi="Menlo" w:cs="Menlo"/>
+          <w:kern w:val="0"/>
+          <w:sz w:val="18"/>
+          <w:szCs w:val="18"/>
+          <w:lang w:val="en-IN" w:eastAsia="en-GB"/>
+          <w14:ligatures w14:val="none"/>
+        </w:rPr>
+      </w:pPr>
+      <w:r>
+        <w:rPr>
+          <w:rFonts w:ascii="Menlo" w:eastAsia="Times New Roman" w:hAnsi="Menlo" w:cs="Menlo"/>
+          <w:kern w:val="0"/>
+          <w:sz w:val="18"/>
+          <w:szCs w:val="18"/>
+          <w:lang w:val="en-IN" w:eastAsia="en-GB"/>
+          <w14:ligatures w14:val="none"/>
+        </w:rPr>
+        <w:t xml:space="preserve">    </w:t>
+      </w:r>
+    </w:p>
+    <w:p>
+      <w:pPr>
+        <w:shd w:val="clear" w:color="auto" w:fill="181818"/>
+        <w:rPr>
+          <w:rFonts w:ascii="Menlo" w:eastAsia="Times New Roman" w:hAnsi="Menlo" w:cs="Menlo"/>
+          <w:kern w:val="0"/>
+          <w:sz w:val="18"/>
+          <w:szCs w:val="18"/>
+          <w:lang w:val="en-IN" w:eastAsia="en-GB"/>
+          <w14:ligatures w14:val="none"/>
+        </w:rPr>
+      </w:pPr>
+      <w:r>
+        <w:rPr>
+          <w:rFonts w:ascii="Menlo" w:eastAsia="Times New Roman" w:hAnsi="Menlo" w:cs="Menlo"/>
+          <w:kern w:val="0"/>
+          <w:sz w:val="18"/>
+          <w:szCs w:val="18"/>
+          <w:lang w:val="en-IN" w:eastAsia="en-GB"/>
+          <w14:ligatures w14:val="none"/>
+        </w:rPr>
+        <w:t xml:space="preserve">    </w:t>
+      </w:r>
+      <w:r>
+        <w:rPr>
+          <w:rFonts w:ascii="Menlo" w:eastAsia="Times New Roman" w:hAnsi="Menlo" w:cs="Menlo"/>
+          <w:color w:val="82D2CE"/>
+          <w:kern w:val="0"/>
+          <w:sz w:val="18"/>
+          <w:szCs w:val="18"/>
+          <w:lang w:val="en-IN" w:eastAsia="en-GB"/>
+          <w14:ligatures w14:val="none"/>
+        </w:rPr>
+        <w:t>def</w:t>
+      </w:r>
+      <w:r>
+        <w:rPr>
+          <w:rFonts w:ascii="Menlo" w:eastAsia="Times New Roman" w:hAnsi="Menlo" w:cs="Menlo"/>
+          <w:kern w:val="0"/>
+          <w:sz w:val="18"/>
+          <w:szCs w:val="18"/>
+          <w:lang w:val="en-IN" w:eastAsia="en-GB"/>
+          <w14:ligatures w14:val="none"/>
+        </w:rPr>
+        <w:t xml:space="preserve"> </w:t>
+      </w:r>
+      <w:proofErr w:type="spellStart"/>
+      <w:r>
+        <w:rPr>
+          <w:rFonts w:ascii="Menlo" w:eastAsia="Times New Roman" w:hAnsi="Menlo" w:cs="Menlo"/>
+          <w:color w:val="EFB080"/>
+          <w:kern w:val="0"/>
+          <w:sz w:val="18"/>
+          <w:szCs w:val="18"/>
+          <w:lang w:val="en-IN" w:eastAsia="en-GB"/>
+          <w14:ligatures w14:val="none"/>
+        </w:rPr>
+        <w:t>get_hostname</w:t>
+      </w:r>
+      <w:proofErr w:type="spellEnd"/>
+      <w:r>
+        <w:rPr>
+          <w:rFonts w:ascii="Menlo" w:eastAsia="Times New Roman" w:hAnsi="Menlo" w:cs="Menlo"/>
+          <w:kern w:val="0"/>
+          <w:sz w:val="18"/>
+          <w:szCs w:val="18"/>
+          <w:lang w:val="en-IN" w:eastAsia="en-GB"/>
+          <w14:ligatures w14:val="none"/>
+        </w:rPr>
+        <w:t>(</w:t>
+      </w:r>
+      <w:r>
+        <w:rPr>
+          <w:rFonts w:ascii="Menlo" w:eastAsia="Times New Roman" w:hAnsi="Menlo" w:cs="Menlo"/>
+          <w:color w:val="D6D6DD"/>
+          <w:kern w:val="0"/>
+          <w:sz w:val="18"/>
+          <w:szCs w:val="18"/>
+          <w:lang w:val="en-IN" w:eastAsia="en-GB"/>
+          <w14:ligatures w14:val="none"/>
+        </w:rPr>
+        <w:t>self</w:t>
+      </w:r>
+      <w:r>
+        <w:rPr>
+          <w:rFonts w:ascii="Menlo" w:eastAsia="Times New Roman" w:hAnsi="Menlo" w:cs="Menlo"/>
+          <w:kern w:val="0"/>
+          <w:sz w:val="18"/>
+          <w:szCs w:val="18"/>
+          <w:lang w:val="en-IN" w:eastAsia="en-GB"/>
+          <w14:ligatures w14:val="none"/>
+        </w:rPr>
+        <w:t xml:space="preserve">):        </w:t>
+      </w:r>
+      <w:r>
+        <w:rPr>
+          <w:rFonts w:ascii="Menlo" w:eastAsia="Times New Roman" w:hAnsi="Menlo" w:cs="Menlo"/>
+          <w:i/>
+          <w:iCs/>
+          <w:kern w:val="0"/>
+          <w:sz w:val="18"/>
+          <w:szCs w:val="18"/>
+          <w:lang w:val="en-IN" w:eastAsia="en-GB"/>
+          <w14:ligatures w14:val="none"/>
+        </w:rPr>
+        <w:t># 'self' = the object this was called on</w:t>
+      </w:r>
+    </w:p>
+    <w:p>
+      <w:pPr>
+        <w:shd w:val="clear" w:color="auto" w:fill="181818"/>
+        <w:rPr>
+          <w:rFonts w:ascii="Menlo" w:eastAsia="Times New Roman" w:hAnsi="Menlo" w:cs="Menlo"/>
+          <w:kern w:val="0"/>
+          <w:sz w:val="18"/>
+          <w:szCs w:val="18"/>
+          <w:lang w:val="en-IN" w:eastAsia="en-GB"/>
+          <w14:ligatures w14:val="none"/>
+        </w:rPr>
+      </w:pPr>
+      <w:r>
+        <w:rPr>
+          <w:rFonts w:ascii="Menlo" w:eastAsia="Times New Roman" w:hAnsi="Menlo" w:cs="Menlo"/>
+          <w:kern w:val="0"/>
+          <w:sz w:val="18"/>
+          <w:szCs w:val="18"/>
+          <w:lang w:val="en-IN" w:eastAsia="en-GB"/>
+          <w14:ligatures w14:val="none"/>
+        </w:rPr>
+        <w:t xml:space="preserve">        </w:t>
+      </w:r>
+      <w:r>
+        <w:rPr>
+          <w:rFonts w:ascii="Menlo" w:eastAsia="Times New Roman" w:hAnsi="Menlo" w:cs="Menlo"/>
+          <w:color w:val="82D2CE"/>
+          <w:kern w:val="0"/>
+          <w:sz w:val="18"/>
+          <w:szCs w:val="18"/>
+          <w:lang w:val="en-IN" w:eastAsia="en-GB"/>
+          <w14:ligatures w14:val="none"/>
+        </w:rPr>
+        <w:t>for</w:t>
+      </w:r>
+      <w:r>
+        <w:rPr>
+          <w:rFonts w:ascii="Menlo" w:eastAsia="Times New Roman" w:hAnsi="Menlo" w:cs="Menlo"/>
+          <w:kern w:val="0"/>
+          <w:sz w:val="18"/>
+          <w:szCs w:val="18"/>
+          <w:lang w:val="en-IN" w:eastAsia="en-GB"/>
+          <w14:ligatures w14:val="none"/>
+        </w:rPr>
+        <w:t xml:space="preserve"> line </w:t>
+      </w:r>
+      <w:r>
+        <w:rPr>
+          <w:rFonts w:ascii="Menlo" w:eastAsia="Times New Roman" w:hAnsi="Menlo" w:cs="Menlo"/>
+          <w:color w:val="82D2CE"/>
+          <w:kern w:val="0"/>
+          <w:sz w:val="18"/>
+          <w:szCs w:val="18"/>
+          <w:lang w:val="en-IN" w:eastAsia="en-GB"/>
+          <w14:ligatures w14:val="none"/>
+        </w:rPr>
+        <w:t>in</w:t>
+      </w:r>
+      <w:r>
+        <w:rPr>
+          <w:rFonts w:ascii="Menlo" w:eastAsia="Times New Roman" w:hAnsi="Menlo" w:cs="Menlo"/>
+          <w:kern w:val="0"/>
+          <w:sz w:val="18"/>
+          <w:szCs w:val="18"/>
+          <w:lang w:val="en-IN" w:eastAsia="en-GB"/>
+          <w14:ligatures w14:val="none"/>
+        </w:rPr>
+        <w:t xml:space="preserve"> </w:t>
+      </w:r>
+      <w:proofErr w:type="spellStart"/>
+      <w:r>
+        <w:rPr>
+          <w:rFonts w:ascii="Menlo" w:eastAsia="Times New Roman" w:hAnsi="Menlo" w:cs="Menlo"/>
+          <w:color w:val="CC7C8A"/>
+          <w:kern w:val="0"/>
+          <w:sz w:val="18"/>
+          <w:szCs w:val="18"/>
+          <w:lang w:val="en-IN" w:eastAsia="en-GB"/>
+          <w14:ligatures w14:val="none"/>
+        </w:rPr>
+        <w:t>self</w:t>
+      </w:r>
+      <w:r>
+        <w:rPr>
+          <w:rFonts w:ascii="Menlo" w:eastAsia="Times New Roman" w:hAnsi="Menlo" w:cs="Menlo"/>
+          <w:kern w:val="0"/>
+          <w:sz w:val="18"/>
+          <w:szCs w:val="18"/>
+          <w:lang w:val="en-IN" w:eastAsia="en-GB"/>
+          <w14:ligatures w14:val="none"/>
+        </w:rPr>
+        <w:t>.data</w:t>
+      </w:r>
+      <w:proofErr w:type="spellEnd"/>
+      <w:r>
+        <w:rPr>
+          <w:rFonts w:ascii="Menlo" w:eastAsia="Times New Roman" w:hAnsi="Menlo" w:cs="Menlo"/>
+          <w:kern w:val="0"/>
+          <w:sz w:val="18"/>
+          <w:szCs w:val="18"/>
+          <w:lang w:val="en-IN" w:eastAsia="en-GB"/>
+          <w14:ligatures w14:val="none"/>
+        </w:rPr>
+        <w:t xml:space="preserve">:     </w:t>
+      </w:r>
+      <w:r>
+        <w:rPr>
+          <w:rFonts w:ascii="Menlo" w:eastAsia="Times New Roman" w:hAnsi="Menlo" w:cs="Menlo"/>
+          <w:i/>
+          <w:iCs/>
+          <w:kern w:val="0"/>
+          <w:sz w:val="18"/>
+          <w:szCs w:val="18"/>
+          <w:lang w:val="en-IN" w:eastAsia="en-GB"/>
+          <w14:ligatures w14:val="none"/>
+        </w:rPr>
+        <w:t xml:space="preserve"># reach the stored lines via </w:t>
+      </w:r>
+      <w:proofErr w:type="spellStart"/>
+      <w:r>
+        <w:rPr>
+          <w:rFonts w:ascii="Menlo" w:eastAsia="Times New Roman" w:hAnsi="Menlo" w:cs="Menlo"/>
+          <w:i/>
+          <w:iCs/>
+          <w:kern w:val="0"/>
+          <w:sz w:val="18"/>
+          <w:szCs w:val="18"/>
+          <w:lang w:val="en-IN" w:eastAsia="en-GB"/>
+          <w14:ligatures w14:val="none"/>
+        </w:rPr>
+        <w:t>self.data</w:t>
+      </w:r>
+      <w:proofErr w:type="spellEnd"/>
+      <w:r>
+        <w:rPr>
+          <w:rFonts w:ascii="Menlo" w:eastAsia="Times New Roman" w:hAnsi="Menlo" w:cs="Menlo"/>
+          <w:i/>
+          <w:iCs/>
+          <w:kern w:val="0"/>
+          <w:sz w:val="18"/>
+          <w:szCs w:val="18"/>
+          <w:lang w:val="en-IN" w:eastAsia="en-GB"/>
+          <w14:ligatures w14:val="none"/>
+        </w:rPr>
+        <w:t xml:space="preserve"> ('lines' is GONE here)</w:t>
+      </w:r>
+    </w:p>
+    <w:p/>
+    <w:p/>
+    <w:p>
+      <w:proofErr w:type="spellStart"/>
+      <w:r>
+        <w:rPr>
+          <w:color w:val="E97132" w:themeColor="accent2"/>
+        </w:rPr>
+        <w:t>self.data</w:t>
+      </w:r>
+      <w:proofErr w:type="spellEnd"/>
+      <w:r>
+        <w:rPr>
+          <w:color w:val="E97132" w:themeColor="accent2"/>
+        </w:rPr>
+        <w:t xml:space="preserve"> </w:t>
+      </w:r>
+      <w:r>
+        <w:t xml:space="preserve">and </w:t>
+      </w:r>
+      <w:proofErr w:type="spellStart"/>
+      <w:r>
+        <w:rPr>
+          <w:color w:val="E97132" w:themeColor="accent2"/>
+        </w:rPr>
+        <w:t>a.data</w:t>
+      </w:r>
+      <w:proofErr w:type="spellEnd"/>
+      <w:r>
+        <w:rPr>
+          <w:color w:val="E97132" w:themeColor="accent2"/>
+        </w:rPr>
+        <w:t xml:space="preserve"> </w:t>
+      </w:r>
+      <w:r>
+        <w:t xml:space="preserve">are the same attribute seen from two sides — </w:t>
+      </w:r>
+      <w:proofErr w:type="spellStart"/>
+      <w:r>
+        <w:t>self.data</w:t>
+      </w:r>
+      <w:proofErr w:type="spellEnd"/>
+      <w:r>
+        <w:t xml:space="preserve"> from inside the class, </w:t>
+      </w:r>
+      <w:proofErr w:type="spellStart"/>
+      <w:r>
+        <w:t>a.data</w:t>
+      </w:r>
+      <w:proofErr w:type="spellEnd"/>
+      <w:r>
+        <w:t xml:space="preserve"> from outside. self and a are two names for one object: the inside-name and the outside-name.</w:t>
+      </w:r>
+    </w:p>
+    <w:p/>
+    <w:p>
+      <w:r>
+        <w:t xml:space="preserve">a JSON file or a CSV file can't store "a Python object" — those formats only understand primitive data: </w:t>
+      </w:r>
+      <w:proofErr w:type="spellStart"/>
+      <w:r>
+        <w:t>dicts</w:t>
+      </w:r>
+      <w:proofErr w:type="spellEnd"/>
+      <w:r>
+        <w:t xml:space="preserve">, lists, strings, numbers. </w:t>
+      </w:r>
+    </w:p>
+    <w:p>
+      <w:r>
+        <w:t xml:space="preserve">So before you can save or send an object, you </w:t>
+      </w:r>
+      <w:r>
+        <w:rPr>
+          <w:b/>
+          <w:bCs/>
+        </w:rPr>
+        <w:t>must convert it into plain data</w:t>
+      </w:r>
+      <w:r>
+        <w:t xml:space="preserve">. That conversion is called </w:t>
+      </w:r>
+      <w:r>
+        <w:rPr>
+          <w:b/>
+          <w:bCs/>
+        </w:rPr>
+        <w:t>serialization</w:t>
+      </w:r>
+      <w:r>
+        <w:t xml:space="preserve">, and </w:t>
+      </w:r>
+      <w:proofErr w:type="spellStart"/>
+      <w:r>
+        <w:rPr>
+          <w:b/>
+          <w:bCs/>
+        </w:rPr>
+        <w:t>to_dict</w:t>
+      </w:r>
+      <w:proofErr w:type="spellEnd"/>
+      <w:r>
+        <w:rPr>
+          <w:b/>
+          <w:bCs/>
+        </w:rPr>
+        <w:t>() is the standard name</w:t>
+      </w:r>
+      <w:r>
+        <w:t xml:space="preserve"> for "serialize me into a dictionary."</w:t>
+      </w:r>
+    </w:p>
+    <w:p/>
+    <w:p>
+      <w:r>
+        <w:t xml:space="preserve">The </w:t>
+      </w:r>
+      <w:proofErr w:type="spellStart"/>
+      <w:r>
+        <w:t>dict</w:t>
+      </w:r>
+      <w:proofErr w:type="spellEnd"/>
+      <w:r>
+        <w:t xml:space="preserve"> is </w:t>
+      </w:r>
+      <w:r>
+        <w:rPr>
+          <w:b/>
+          <w:bCs/>
+        </w:rPr>
+        <w:t>the bridge</w:t>
+      </w:r>
+      <w:r>
+        <w:t xml:space="preserve"> between your </w:t>
+      </w:r>
+      <w:r>
+        <w:rPr>
+          <w:b/>
+          <w:bCs/>
+        </w:rPr>
+        <w:t>live object</w:t>
+      </w:r>
+      <w:r>
+        <w:t xml:space="preserve"> and </w:t>
+      </w:r>
+      <w:r>
+        <w:rPr>
+          <w:b/>
+          <w:bCs/>
+        </w:rPr>
+        <w:t>any file format</w:t>
+      </w:r>
+      <w:r>
+        <w:t>. That conversion is serialization.</w:t>
+      </w:r>
+    </w:p>
+    <w:p/>
+    <w:p>
+      <w:pPr>
+        <w:rPr>
+          <w:rFonts w:ascii="Arial" w:hAnsi="Arial" w:cs="Arial"/>
+          <w:sz w:val="22"/>
+          <w:szCs w:val="22"/>
+          <w:shd w:val="clear" w:color="auto" w:fill="181818"/>
+        </w:rPr>
+      </w:pPr>
+      <w:r>
+        <w:rPr>
+          <w:rFonts w:ascii="Arial" w:hAnsi="Arial" w:cs="Arial"/>
+          <w:sz w:val="22"/>
+          <w:szCs w:val="22"/>
+          <w:shd w:val="clear" w:color="auto" w:fill="181818"/>
+        </w:rPr>
+        <w:t>JSON is </w:t>
+      </w:r>
       <w:r>
         <w:rPr>
           <w:rStyle w:val="Emphasis"/>
@@ -2183,622 +3233,1457 @@
           <w:szCs w:val="22"/>
           <w:shd w:val="clear" w:color="auto" w:fill="181818"/>
         </w:rPr>
-        <w:t>actually act</w:t>
-      </w:r>
-      <w:proofErr w:type="gramEnd"/>
-      <w:r>
-        <w:rPr>
-          <w:rStyle w:val="Emphasis"/>
+        <w:t>not</w:t>
+      </w:r>
+      <w:r>
+        <w:rPr>
           <w:rFonts w:ascii="Arial" w:hAnsi="Arial" w:cs="Arial"/>
           <w:sz w:val="22"/>
           <w:szCs w:val="22"/>
           <w:shd w:val="clear" w:color="auto" w:fill="181818"/>
         </w:rPr>
-        <w:t xml:space="preserve"> on; let everything else propagate.</w:t>
+        <w:t> a data structure — it's a text encoding</w:t>
+      </w:r>
+    </w:p>
+    <w:p>
+      <w:pPr>
+        <w:rPr>
+          <w:rFonts w:ascii="Arial" w:hAnsi="Arial" w:cs="Arial"/>
+          <w:sz w:val="22"/>
+          <w:szCs w:val="22"/>
+          <w:shd w:val="clear" w:color="auto" w:fill="181818"/>
+        </w:rPr>
+      </w:pPr>
+    </w:p>
+    <w:p>
+      <w:r>
+        <w:t xml:space="preserve">Python </w:t>
+      </w:r>
+      <w:r>
+        <w:t>LIST</w:t>
+      </w:r>
+      <w:r>
+        <w:t xml:space="preserve"> maps to JSON </w:t>
+      </w:r>
+      <w:r>
+        <w:t>ARRAY</w:t>
       </w:r>
     </w:p>
     <w:p/>
     <w:p>
       <w:r>
-        <w:rPr>
-          <w:highlight w:val="cyan"/>
-        </w:rPr>
-        <w:t>CLASS and OBJECTS</w:t>
-      </w:r>
-      <w:r>
-        <w:rPr>
-          <w:highlight w:val="cyan"/>
-        </w:rPr>
-        <w:t>:</w:t>
+        <w:t xml:space="preserve">How to write a code or approach a solution. Think of what to give input and what you’ll get as output. Then the default in most </w:t>
+      </w:r>
+      <w:proofErr w:type="spellStart"/>
+      <w:r>
+        <w:t>caes</w:t>
+      </w:r>
+      <w:proofErr w:type="spellEnd"/>
+      <w:r>
+        <w:t xml:space="preserve"> would be function for that. If there are several functions that all share the same data </w:t>
+      </w:r>
+      <w:r>
+        <w:t>then we need Class. Main</w:t>
+      </w:r>
+      <w:r>
+        <w:t xml:space="preserve"> is just to run the program there’s no logic to it. </w:t>
       </w:r>
     </w:p>
     <w:p/>
     <w:p>
       <w:r>
-        <w:t>When</w:t>
-      </w:r>
-      <w:r>
-        <w:t xml:space="preserve"> you keep passing the same argument into a group of related functions, that's the universe telling </w:t>
-      </w:r>
-      <w:proofErr w:type="gramStart"/>
-      <w:r>
-        <w:t>you</w:t>
-      </w:r>
-      <w:proofErr w:type="gramEnd"/>
-      <w:r>
-        <w:t xml:space="preserve"> "make a class." Bundle the data (state) with the behavior that acts on it.</w:t>
+        <w:t xml:space="preserve">There are 3 stages: input (raw, files/lines) </w:t>
+      </w:r>
+      <w:r>
+        <w:sym w:font="Wingdings" w:char="F0E0"/>
+      </w:r>
+      <w:r>
+        <w:t xml:space="preserve"> parsed (in-memory – lists/</w:t>
+      </w:r>
+      <w:proofErr w:type="spellStart"/>
+      <w:r>
+        <w:t>dict</w:t>
+      </w:r>
+      <w:proofErr w:type="spellEnd"/>
+      <w:r>
+        <w:t xml:space="preserve">) </w:t>
+      </w:r>
+      <w:r>
+        <w:sym w:font="Wingdings" w:char="F0E0"/>
+      </w:r>
+      <w:r>
+        <w:t xml:space="preserve"> output </w:t>
+      </w:r>
+    </w:p>
+    <w:p>
+      <w:r>
+        <w:t>(</w:t>
+      </w:r>
+      <w:proofErr w:type="spellStart"/>
+      <w:r>
+        <w:t>json</w:t>
+      </w:r>
+      <w:proofErr w:type="spellEnd"/>
+      <w:r>
+        <w:t xml:space="preserve">/csv </w:t>
+      </w:r>
+      <w:proofErr w:type="spellStart"/>
+      <w:r>
+        <w:t>etc</w:t>
+      </w:r>
+      <w:proofErr w:type="spellEnd"/>
+      <w:r>
+        <w:t>)</w:t>
       </w:r>
     </w:p>
     <w:p/>
-    <w:p>
-      <w:r>
-        <w:lastRenderedPageBreak/>
-        <w:t>self inside the class = "me, the specific object this was called on." The data isn't shared across objects — each instance has its own attributes.</w:t>
-      </w:r>
-    </w:p>
     <w:p/>
-    <w:p>
-      <w:r>
+    <w:tbl>
+      <w:tblPr>
+        <w:tblStyle w:val="TableGrid"/>
+        <w:tblW w:w="0" w:type="auto"/>
+        <w:tblLook w:val="04A0" w:firstRow="1" w:lastRow="0" w:firstColumn="1" w:lastColumn="0" w:noHBand="0" w:noVBand="1"/>
+      </w:tblPr>
+      <w:tblGrid>
+        <w:gridCol w:w="2101"/>
+        <w:gridCol w:w="2566"/>
+        <w:gridCol w:w="4343"/>
+      </w:tblGrid>
+      <w:tr>
+        <w:tc>
+          <w:tcPr>
+            <w:tcW w:w="0" w:type="auto"/>
+            <w:noWrap/>
+            <w:hideMark/>
+          </w:tcPr>
+          <w:p>
+            <w:pPr>
+              <w:rPr>
+                <w:rFonts w:ascii="Arial" w:eastAsia="Times New Roman" w:hAnsi="Arial" w:cs="Arial"/>
+                <w:b/>
+                <w:bCs/>
+                <w:color w:val="4EA72E" w:themeColor="accent6"/>
+                <w:kern w:val="0"/>
+                <w:sz w:val="22"/>
+                <w:szCs w:val="22"/>
+                <w:lang w:val="en-IN" w:eastAsia="en-GB"/>
+                <w14:ligatures w14:val="none"/>
+              </w:rPr>
+            </w:pPr>
+            <w:r>
+              <w:rPr>
+                <w:rFonts w:ascii="Arial" w:eastAsia="Times New Roman" w:hAnsi="Arial" w:cs="Arial"/>
+                <w:b/>
+                <w:bCs/>
+                <w:color w:val="4EA72E" w:themeColor="accent6"/>
+                <w:kern w:val="0"/>
+                <w:sz w:val="22"/>
+                <w:szCs w:val="22"/>
+                <w:lang w:val="en-IN" w:eastAsia="en-GB"/>
+                <w14:ligatures w14:val="none"/>
+              </w:rPr>
+              <w:t>Keyword</w:t>
+            </w:r>
+          </w:p>
+        </w:tc>
+        <w:tc>
+          <w:tcPr>
+            <w:tcW w:w="0" w:type="auto"/>
+            <w:noWrap/>
+            <w:hideMark/>
+          </w:tcPr>
+          <w:p>
+            <w:pPr>
+              <w:rPr>
+                <w:rFonts w:ascii="Arial" w:eastAsia="Times New Roman" w:hAnsi="Arial" w:cs="Arial"/>
+                <w:b/>
+                <w:bCs/>
+                <w:color w:val="4EA72E" w:themeColor="accent6"/>
+                <w:kern w:val="0"/>
+                <w:sz w:val="22"/>
+                <w:szCs w:val="22"/>
+                <w:lang w:val="en-IN" w:eastAsia="en-GB"/>
+                <w14:ligatures w14:val="none"/>
+              </w:rPr>
+            </w:pPr>
+            <w:r>
+              <w:rPr>
+                <w:rFonts w:ascii="Arial" w:eastAsia="Times New Roman" w:hAnsi="Arial" w:cs="Arial"/>
+                <w:b/>
+                <w:bCs/>
+                <w:color w:val="4EA72E" w:themeColor="accent6"/>
+                <w:kern w:val="0"/>
+                <w:sz w:val="22"/>
+                <w:szCs w:val="22"/>
+                <w:lang w:val="en-IN" w:eastAsia="en-GB"/>
+                <w14:ligatures w14:val="none"/>
+              </w:rPr>
+              <w:t>What it exits</w:t>
+            </w:r>
+          </w:p>
+        </w:tc>
+        <w:tc>
+          <w:tcPr>
+            <w:tcW w:w="0" w:type="auto"/>
+            <w:noWrap/>
+            <w:hideMark/>
+          </w:tcPr>
+          <w:p>
+            <w:pPr>
+              <w:rPr>
+                <w:rFonts w:ascii="Arial" w:eastAsia="Times New Roman" w:hAnsi="Arial" w:cs="Arial"/>
+                <w:b/>
+                <w:bCs/>
+                <w:color w:val="4EA72E" w:themeColor="accent6"/>
+                <w:kern w:val="0"/>
+                <w:sz w:val="22"/>
+                <w:szCs w:val="22"/>
+                <w:lang w:val="en-IN" w:eastAsia="en-GB"/>
+                <w14:ligatures w14:val="none"/>
+              </w:rPr>
+            </w:pPr>
+            <w:r>
+              <w:rPr>
+                <w:rFonts w:ascii="Arial" w:eastAsia="Times New Roman" w:hAnsi="Arial" w:cs="Arial"/>
+                <w:b/>
+                <w:bCs/>
+                <w:color w:val="4EA72E" w:themeColor="accent6"/>
+                <w:kern w:val="0"/>
+                <w:sz w:val="22"/>
+                <w:szCs w:val="22"/>
+                <w:lang w:val="en-IN" w:eastAsia="en-GB"/>
+                <w14:ligatures w14:val="none"/>
+              </w:rPr>
+              <w:t>What happens next</w:t>
+            </w:r>
+          </w:p>
+        </w:tc>
+      </w:tr>
+      <w:tr>
+        <w:tc>
+          <w:tcPr>
+            <w:tcW w:w="0" w:type="auto"/>
+            <w:hideMark/>
+          </w:tcPr>
+          <w:p>
+            <w:pPr>
+              <w:rPr>
+                <w:rFonts w:ascii="Arial" w:eastAsia="Times New Roman" w:hAnsi="Arial" w:cs="Arial"/>
+                <w:color w:val="4EA72E" w:themeColor="accent6"/>
+                <w:kern w:val="0"/>
+                <w:sz w:val="22"/>
+                <w:szCs w:val="22"/>
+                <w:lang w:val="en-IN" w:eastAsia="en-GB"/>
+                <w14:ligatures w14:val="none"/>
+              </w:rPr>
+            </w:pPr>
+            <w:r>
+              <w:rPr>
+                <w:rFonts w:ascii="Menlo" w:eastAsia="Times New Roman" w:hAnsi="Menlo" w:cs="Menlo"/>
+                <w:color w:val="4EA72E" w:themeColor="accent6"/>
+                <w:kern w:val="0"/>
+                <w:sz w:val="20"/>
+                <w:szCs w:val="20"/>
+                <w:lang w:val="en-IN" w:eastAsia="en-GB"/>
+                <w14:ligatures w14:val="none"/>
+              </w:rPr>
+              <w:t>return</w:t>
+            </w:r>
+          </w:p>
+        </w:tc>
+        <w:tc>
+          <w:tcPr>
+            <w:tcW w:w="0" w:type="auto"/>
+            <w:hideMark/>
+          </w:tcPr>
+          <w:p>
+            <w:pPr>
+              <w:rPr>
+                <w:rFonts w:ascii="Arial" w:eastAsia="Times New Roman" w:hAnsi="Arial" w:cs="Arial"/>
+                <w:color w:val="4EA72E" w:themeColor="accent6"/>
+                <w:kern w:val="0"/>
+                <w:sz w:val="22"/>
+                <w:szCs w:val="22"/>
+                <w:lang w:val="en-IN" w:eastAsia="en-GB"/>
+                <w14:ligatures w14:val="none"/>
+              </w:rPr>
+            </w:pPr>
+            <w:r>
+              <w:rPr>
+                <w:rFonts w:ascii="Arial" w:eastAsia="Times New Roman" w:hAnsi="Arial" w:cs="Arial"/>
+                <w:color w:val="4EA72E" w:themeColor="accent6"/>
+                <w:kern w:val="0"/>
+                <w:sz w:val="22"/>
+                <w:szCs w:val="22"/>
+                <w:lang w:val="en-IN" w:eastAsia="en-GB"/>
+                <w14:ligatures w14:val="none"/>
+              </w:rPr>
+              <w:t>the </w:t>
+            </w:r>
+            <w:r>
+              <w:rPr>
+                <w:rFonts w:ascii="Arial" w:eastAsia="Times New Roman" w:hAnsi="Arial" w:cs="Arial"/>
+                <w:b/>
+                <w:bCs/>
+                <w:color w:val="4EA72E" w:themeColor="accent6"/>
+                <w:kern w:val="0"/>
+                <w:sz w:val="22"/>
+                <w:szCs w:val="22"/>
+                <w:lang w:val="en-IN" w:eastAsia="en-GB"/>
+                <w14:ligatures w14:val="none"/>
+              </w:rPr>
+              <w:t>entire function</w:t>
+            </w:r>
+            <w:r>
+              <w:rPr>
+                <w:rFonts w:ascii="Arial" w:eastAsia="Times New Roman" w:hAnsi="Arial" w:cs="Arial"/>
+                <w:color w:val="4EA72E" w:themeColor="accent6"/>
+                <w:kern w:val="0"/>
+                <w:sz w:val="22"/>
+                <w:szCs w:val="22"/>
+                <w:lang w:val="en-IN" w:eastAsia="en-GB"/>
+                <w14:ligatures w14:val="none"/>
+              </w:rPr>
+              <w:t>, immediately</w:t>
+            </w:r>
+          </w:p>
+        </w:tc>
+        <w:tc>
+          <w:tcPr>
+            <w:tcW w:w="0" w:type="auto"/>
+            <w:hideMark/>
+          </w:tcPr>
+          <w:p>
+            <w:pPr>
+              <w:rPr>
+                <w:rFonts w:ascii="Arial" w:eastAsia="Times New Roman" w:hAnsi="Arial" w:cs="Arial"/>
+                <w:color w:val="4EA72E" w:themeColor="accent6"/>
+                <w:kern w:val="0"/>
+                <w:sz w:val="22"/>
+                <w:szCs w:val="22"/>
+                <w:lang w:val="en-IN" w:eastAsia="en-GB"/>
+                <w14:ligatures w14:val="none"/>
+              </w:rPr>
+            </w:pPr>
+            <w:r>
+              <w:rPr>
+                <w:rFonts w:ascii="Arial" w:eastAsia="Times New Roman" w:hAnsi="Arial" w:cs="Arial"/>
+                <w:color w:val="4EA72E" w:themeColor="accent6"/>
+                <w:kern w:val="0"/>
+                <w:sz w:val="22"/>
+                <w:szCs w:val="22"/>
+                <w:lang w:val="en-IN" w:eastAsia="en-GB"/>
+                <w14:ligatures w14:val="none"/>
+              </w:rPr>
+              <w:t>nothing else in the function runs; caller gets the value</w:t>
+            </w:r>
+          </w:p>
+        </w:tc>
+      </w:tr>
+      <w:tr>
+        <w:tc>
+          <w:tcPr>
+            <w:tcW w:w="0" w:type="auto"/>
+            <w:hideMark/>
+          </w:tcPr>
+          <w:p>
+            <w:pPr>
+              <w:rPr>
+                <w:rFonts w:ascii="Arial" w:eastAsia="Times New Roman" w:hAnsi="Arial" w:cs="Arial"/>
+                <w:color w:val="4EA72E" w:themeColor="accent6"/>
+                <w:kern w:val="0"/>
+                <w:sz w:val="22"/>
+                <w:szCs w:val="22"/>
+                <w:lang w:val="en-IN" w:eastAsia="en-GB"/>
+                <w14:ligatures w14:val="none"/>
+              </w:rPr>
+            </w:pPr>
+            <w:r>
+              <w:rPr>
+                <w:rFonts w:ascii="Menlo" w:eastAsia="Times New Roman" w:hAnsi="Menlo" w:cs="Menlo"/>
+                <w:color w:val="4EA72E" w:themeColor="accent6"/>
+                <w:kern w:val="0"/>
+                <w:sz w:val="20"/>
+                <w:szCs w:val="20"/>
+                <w:lang w:val="en-IN" w:eastAsia="en-GB"/>
+                <w14:ligatures w14:val="none"/>
+              </w:rPr>
+              <w:t>break</w:t>
+            </w:r>
+          </w:p>
+        </w:tc>
+        <w:tc>
+          <w:tcPr>
+            <w:tcW w:w="0" w:type="auto"/>
+            <w:hideMark/>
+          </w:tcPr>
+          <w:p>
+            <w:pPr>
+              <w:rPr>
+                <w:rFonts w:ascii="Arial" w:eastAsia="Times New Roman" w:hAnsi="Arial" w:cs="Arial"/>
+                <w:color w:val="4EA72E" w:themeColor="accent6"/>
+                <w:kern w:val="0"/>
+                <w:sz w:val="22"/>
+                <w:szCs w:val="22"/>
+                <w:lang w:val="en-IN" w:eastAsia="en-GB"/>
+                <w14:ligatures w14:val="none"/>
+              </w:rPr>
+            </w:pPr>
+            <w:r>
+              <w:rPr>
+                <w:rFonts w:ascii="Arial" w:eastAsia="Times New Roman" w:hAnsi="Arial" w:cs="Arial"/>
+                <w:color w:val="4EA72E" w:themeColor="accent6"/>
+                <w:kern w:val="0"/>
+                <w:sz w:val="22"/>
+                <w:szCs w:val="22"/>
+                <w:lang w:val="en-IN" w:eastAsia="en-GB"/>
+                <w14:ligatures w14:val="none"/>
+              </w:rPr>
+              <w:t>only the </w:t>
+            </w:r>
+            <w:r>
+              <w:rPr>
+                <w:rFonts w:ascii="Arial" w:eastAsia="Times New Roman" w:hAnsi="Arial" w:cs="Arial"/>
+                <w:b/>
+                <w:bCs/>
+                <w:color w:val="4EA72E" w:themeColor="accent6"/>
+                <w:kern w:val="0"/>
+                <w:sz w:val="22"/>
+                <w:szCs w:val="22"/>
+                <w:lang w:val="en-IN" w:eastAsia="en-GB"/>
+                <w14:ligatures w14:val="none"/>
+              </w:rPr>
+              <w:t>innermost loop</w:t>
+            </w:r>
+            <w:r>
+              <w:rPr>
+                <w:rFonts w:ascii="Arial" w:eastAsia="Times New Roman" w:hAnsi="Arial" w:cs="Arial"/>
+                <w:color w:val="4EA72E" w:themeColor="accent6"/>
+                <w:kern w:val="0"/>
+                <w:sz w:val="22"/>
+                <w:szCs w:val="22"/>
+                <w:lang w:val="en-IN" w:eastAsia="en-GB"/>
+                <w14:ligatures w14:val="none"/>
+              </w:rPr>
+              <w:t> it sits in</w:t>
+            </w:r>
+          </w:p>
+        </w:tc>
+        <w:tc>
+          <w:tcPr>
+            <w:tcW w:w="0" w:type="auto"/>
+            <w:hideMark/>
+          </w:tcPr>
+          <w:p>
+            <w:pPr>
+              <w:rPr>
+                <w:rFonts w:ascii="Arial" w:eastAsia="Times New Roman" w:hAnsi="Arial" w:cs="Arial"/>
+                <w:color w:val="4EA72E" w:themeColor="accent6"/>
+                <w:kern w:val="0"/>
+                <w:sz w:val="22"/>
+                <w:szCs w:val="22"/>
+                <w:lang w:val="en-IN" w:eastAsia="en-GB"/>
+                <w14:ligatures w14:val="none"/>
+              </w:rPr>
+            </w:pPr>
+            <w:r>
+              <w:rPr>
+                <w:rFonts w:ascii="Arial" w:eastAsia="Times New Roman" w:hAnsi="Arial" w:cs="Arial"/>
+                <w:color w:val="4EA72E" w:themeColor="accent6"/>
+                <w:kern w:val="0"/>
+                <w:sz w:val="22"/>
+                <w:szCs w:val="22"/>
+                <w:lang w:val="en-IN" w:eastAsia="en-GB"/>
+                <w14:ligatures w14:val="none"/>
+              </w:rPr>
+              <w:t>execution continues </w:t>
+            </w:r>
+            <w:r>
+              <w:rPr>
+                <w:rFonts w:ascii="Arial" w:eastAsia="Times New Roman" w:hAnsi="Arial" w:cs="Arial"/>
+                <w:i/>
+                <w:iCs/>
+                <w:color w:val="4EA72E" w:themeColor="accent6"/>
+                <w:kern w:val="0"/>
+                <w:sz w:val="22"/>
+                <w:szCs w:val="22"/>
+                <w:lang w:val="en-IN" w:eastAsia="en-GB"/>
+                <w14:ligatures w14:val="none"/>
+              </w:rPr>
+              <w:t>after</w:t>
+            </w:r>
+            <w:r>
+              <w:rPr>
+                <w:rFonts w:ascii="Arial" w:eastAsia="Times New Roman" w:hAnsi="Arial" w:cs="Arial"/>
+                <w:color w:val="4EA72E" w:themeColor="accent6"/>
+                <w:kern w:val="0"/>
+                <w:sz w:val="22"/>
+                <w:szCs w:val="22"/>
+                <w:lang w:val="en-IN" w:eastAsia="en-GB"/>
+                <w14:ligatures w14:val="none"/>
+              </w:rPr>
+              <w:t> that loop; any outer loop keeps going</w:t>
+            </w:r>
+          </w:p>
+        </w:tc>
+      </w:tr>
+      <w:tr>
+        <w:tc>
+          <w:tcPr>
+            <w:tcW w:w="2101" w:type="dxa"/>
+          </w:tcPr>
+          <w:p/>
+        </w:tc>
+        <w:tc>
+          <w:tcPr>
+            <w:tcW w:w="2566" w:type="dxa"/>
+          </w:tcPr>
+          <w:p/>
+        </w:tc>
+        <w:tc>
+          <w:tcPr>
+            <w:tcW w:w="4343" w:type="dxa"/>
+          </w:tcPr>
+          <w:p/>
+        </w:tc>
+      </w:tr>
+    </w:tbl>
+    <w:p/>
+    <w:p>
+      <w:r>
+        <w:t>LEETCODE LEARNING: (LL)</w:t>
+      </w:r>
+    </w:p>
+    <w:p>
+      <w:r>
+        <w:t xml:space="preserve">Hash maps: </w:t>
+      </w:r>
+      <w:r>
+        <w:br/>
+        <w:t xml:space="preserve">key + value </w:t>
+      </w:r>
+      <w:r>
+        <w:br/>
+        <w:t>a         =  3</w:t>
+      </w:r>
+    </w:p>
+    <w:p>
+      <w:r>
+        <w:t>b         = 4</w:t>
+      </w:r>
+    </w:p>
+    <w:p/>
+    <w:p>
+      <w:r>
+        <w:t xml:space="preserve">SETS contain only </w:t>
+      </w:r>
+      <w:proofErr w:type="spellStart"/>
+      <w:r>
+        <w:t>hashable</w:t>
+      </w:r>
+      <w:proofErr w:type="spellEnd"/>
+      <w:r>
+        <w:t xml:space="preserve">. String and numbers are OK. Lists and </w:t>
+      </w:r>
+      <w:proofErr w:type="spellStart"/>
+      <w:r>
+        <w:t>Dicts</w:t>
+      </w:r>
+      <w:proofErr w:type="spellEnd"/>
+      <w:r>
+        <w:t xml:space="preserve"> are not. Convert those (list/</w:t>
+      </w:r>
+      <w:proofErr w:type="spellStart"/>
+      <w:r>
+        <w:t>dict</w:t>
+      </w:r>
+      <w:proofErr w:type="spellEnd"/>
+      <w:r>
+        <w:t xml:space="preserve">) to tuple and then set will accept. </w:t>
+      </w:r>
+    </w:p>
+    <w:p/>
+    <w:p>
+      <w:r>
+        <w:t xml:space="preserve">A Python </w:t>
+      </w:r>
+      <w:proofErr w:type="spellStart"/>
+      <w:r>
+        <w:t>dict</w:t>
+      </w:r>
+      <w:proofErr w:type="spellEnd"/>
+      <w:r>
+        <w:t xml:space="preserve"> is the </w:t>
+      </w:r>
+      <w:proofErr w:type="spellStart"/>
+      <w:r>
+        <w:t>hashmap</w:t>
+      </w:r>
+      <w:proofErr w:type="spellEnd"/>
+      <w:r>
+        <w:t xml:space="preserve"> (</w:t>
+      </w:r>
+      <w:proofErr w:type="spellStart"/>
+      <w:r>
+        <w:t>key→value</w:t>
+      </w:r>
+      <w:proofErr w:type="spellEnd"/>
+      <w:r>
+        <w:t xml:space="preserve">). A set is essentially a </w:t>
+      </w:r>
+      <w:proofErr w:type="spellStart"/>
+      <w:r>
+        <w:t>hashmap</w:t>
+      </w:r>
+      <w:proofErr w:type="spellEnd"/>
+      <w:r>
+        <w:t xml:space="preserve"> with only the keys, no values</w:t>
+      </w:r>
+      <w:r>
+        <w:t xml:space="preserve">. </w:t>
+      </w:r>
+      <w:r>
+        <w:t xml:space="preserve">So: dict = </w:t>
+      </w:r>
+      <w:proofErr w:type="spellStart"/>
+      <w:r>
+        <w:t>hashmap</w:t>
+      </w:r>
+      <w:proofErr w:type="spellEnd"/>
+      <w:r>
+        <w:t xml:space="preserve">; set = the keys of a </w:t>
+      </w:r>
+      <w:proofErr w:type="spellStart"/>
+      <w:r>
+        <w:t>hashmap</w:t>
+      </w:r>
+      <w:proofErr w:type="spellEnd"/>
+      <w:r>
+        <w:t xml:space="preserve"> on their own</w:t>
+      </w:r>
+      <w:r>
+        <w:t xml:space="preserve">. </w:t>
+      </w:r>
+    </w:p>
+    <w:p/>
+    <w:p>
+      <w:r>
+        <w:t xml:space="preserve">An object is </w:t>
+      </w:r>
+      <w:proofErr w:type="spellStart"/>
+      <w:r>
+        <w:t>hashable</w:t>
+      </w:r>
+      <w:proofErr w:type="spellEnd"/>
+      <w:r>
+        <w:t xml:space="preserve"> if Python can compute a fixed number (its hash) from its contents that never changes for its lifetime</w:t>
+      </w:r>
+    </w:p>
+    <w:p/>
+    <w:p>
+      <w:pPr>
+        <w:rPr>
+          <w:rFonts w:ascii="Apple Color Emoji" w:hAnsi="Apple Color Emoji" w:cs="Apple Color Emoji"/>
+        </w:rPr>
+      </w:pPr>
+      <w:r>
+        <w:t xml:space="preserve">if an object's contents could change, its hash would change, and it'd be filed in the wrong bucket → lookups break. So Python only allows immutable things to be </w:t>
+      </w:r>
+      <w:proofErr w:type="spellStart"/>
+      <w:r>
+        <w:t>hashable</w:t>
+      </w:r>
+      <w:proofErr w:type="spellEnd"/>
+      <w:r>
+        <w:t>. Strings, numbers, tuples</w:t>
+      </w:r>
+      <w:r>
+        <w:t>()</w:t>
+      </w:r>
+      <w:r>
+        <w:t xml:space="preserve"> = immutable = </w:t>
+      </w:r>
+      <w:proofErr w:type="spellStart"/>
+      <w:r>
+        <w:t>hashable</w:t>
+      </w:r>
+      <w:proofErr w:type="spellEnd"/>
+      <w:r>
+        <w:t xml:space="preserve"> </w:t>
+      </w:r>
+      <w:r>
+        <w:rPr>
+          <w:rFonts w:ascii="Apple Color Emoji" w:hAnsi="Apple Color Emoji" w:cs="Apple Color Emoji"/>
+        </w:rPr>
+        <w:t>✅</w:t>
+      </w:r>
+      <w:r>
+        <w:t>. Lists</w:t>
+      </w:r>
+      <w:r>
+        <w:t>[]</w:t>
+      </w:r>
+      <w:r>
+        <w:t xml:space="preserve">, </w:t>
+      </w:r>
+      <w:proofErr w:type="spellStart"/>
+      <w:r>
+        <w:t>dicts</w:t>
+      </w:r>
+      <w:proofErr w:type="spellEnd"/>
+      <w:r>
+        <w:t>{}</w:t>
+      </w:r>
+      <w:r>
+        <w:t xml:space="preserve"> = mutable = </w:t>
+      </w:r>
+      <w:proofErr w:type="spellStart"/>
+      <w:r>
+        <w:t>unhashable</w:t>
+      </w:r>
+      <w:proofErr w:type="spellEnd"/>
+      <w:r>
+        <w:t xml:space="preserve"> </w:t>
+      </w:r>
+      <w:r>
+        <w:rPr>
+          <w:rFonts w:ascii="Apple Color Emoji" w:hAnsi="Apple Color Emoji" w:cs="Apple Color Emoji"/>
+        </w:rPr>
+        <w:t>❌</w:t>
+      </w:r>
+    </w:p>
+    <w:p>
+      <w:pPr>
+        <w:rPr>
+          <w:rFonts w:ascii="Apple Color Emoji" w:hAnsi="Apple Color Emoji" w:cs="Apple Color Emoji"/>
+        </w:rPr>
+      </w:pPr>
+    </w:p>
+    <w:p>
+      <w:r>
+        <w:t xml:space="preserve">tuple is immutable, it's </w:t>
+      </w:r>
+      <w:proofErr w:type="spellStart"/>
+      <w:r>
+        <w:t>hashable</w:t>
+      </w:r>
+      <w:proofErr w:type="spellEnd"/>
+      <w:r>
+        <w:t xml:space="preserve"> ()</w:t>
+      </w:r>
+    </w:p>
+    <w:p/>
+    <w:p>
+      <w:r>
+        <w:t xml:space="preserve">example: </w:t>
+      </w:r>
+    </w:p>
+    <w:p/>
+    <w:p>
+      <w:pPr>
+        <w:rPr>
+          <w:lang w:val="en-IN"/>
+        </w:rPr>
+      </w:pPr>
+      <w:r>
+        <w:rPr>
+          <w:lang w:val="en-IN"/>
+        </w:rPr>
+        <w:t>s = "hello"</w:t>
+      </w:r>
+    </w:p>
+    <w:p>
+      <w:pPr>
+        <w:rPr>
+          <w:lang w:val="en-IN"/>
+        </w:rPr>
+      </w:pPr>
+      <w:r>
+        <w:rPr>
+          <w:lang w:val="en-IN"/>
+        </w:rPr>
+        <w:t xml:space="preserve">s[0] = "H"        </w:t>
+      </w:r>
+      <w:r>
+        <w:rPr>
+          <w:i/>
+          <w:iCs/>
+          <w:lang w:val="en-IN"/>
+        </w:rPr>
+        <w:t xml:space="preserve"># </w:t>
+      </w:r>
+      <w:proofErr w:type="spellStart"/>
+      <w:r>
+        <w:rPr>
+          <w:i/>
+          <w:iCs/>
+          <w:lang w:val="en-IN"/>
+        </w:rPr>
+        <w:t>TypeError</w:t>
+      </w:r>
+      <w:proofErr w:type="spellEnd"/>
+      <w:r>
+        <w:rPr>
+          <w:i/>
+          <w:iCs/>
+          <w:lang w:val="en-IN"/>
+        </w:rPr>
+        <w:t>: 'str' object does not support item assignment</w:t>
+      </w:r>
+    </w:p>
+    <w:p>
+      <w:pPr>
+        <w:rPr>
+          <w:lang w:val="en-IN"/>
+        </w:rPr>
+      </w:pPr>
+      <w:r>
+        <w:rPr>
+          <w:lang w:val="en-IN"/>
+        </w:rPr>
+        <w:t xml:space="preserve">s = </w:t>
+      </w:r>
+      <w:proofErr w:type="spellStart"/>
+      <w:r>
+        <w:rPr>
+          <w:lang w:val="en-IN"/>
+        </w:rPr>
+        <w:t>s.upper</w:t>
+      </w:r>
+      <w:proofErr w:type="spellEnd"/>
+      <w:r>
+        <w:rPr>
+          <w:lang w:val="en-IN"/>
+        </w:rPr>
+        <w:t xml:space="preserve">()     </w:t>
+      </w:r>
+      <w:r>
+        <w:rPr>
+          <w:i/>
+          <w:iCs/>
+          <w:lang w:val="en-IN"/>
+        </w:rPr>
+        <w:t># this works — but it does NOT edit "hello";</w:t>
+      </w:r>
+    </w:p>
+    <w:p>
+      <w:pPr>
+        <w:rPr>
+          <w:lang w:val="en-IN"/>
+        </w:rPr>
+      </w:pPr>
+      <w:r>
+        <w:rPr>
+          <w:lang w:val="en-IN"/>
+        </w:rPr>
+        <w:t xml:space="preserve">                  </w:t>
+      </w:r>
+      <w:r>
+        <w:rPr>
+          <w:i/>
+          <w:iCs/>
+          <w:lang w:val="en-IN"/>
+        </w:rPr>
+        <w:t># it builds a NEW string "HELLO" and points s at it</w:t>
+      </w:r>
+    </w:p>
+    <w:p>
+      <w:pPr>
+        <w:rPr>
+          <w:lang w:val="en-IN"/>
+        </w:rPr>
+      </w:pPr>
+    </w:p>
+    <w:p>
+      <w:pPr>
+        <w:rPr>
+          <w:rFonts w:ascii="Menlo" w:hAnsi="Menlo" w:cs="Menlo"/>
+          <w:i/>
+          <w:iCs/>
+          <w:sz w:val="18"/>
+          <w:szCs w:val="18"/>
+          <w:shd w:val="clear" w:color="auto" w:fill="181818"/>
+        </w:rPr>
+      </w:pPr>
+      <w:r>
+        <w:rPr>
+          <w:rFonts w:ascii="Menlo" w:hAnsi="Menlo" w:cs="Menlo"/>
+          <w:color w:val="F0F0F0"/>
+          <w:sz w:val="18"/>
+          <w:szCs w:val="18"/>
+          <w:shd w:val="clear" w:color="auto" w:fill="181818"/>
+        </w:rPr>
+        <w:t>d["</w:t>
+      </w:r>
+      <w:r>
+        <w:rPr>
+          <w:rFonts w:ascii="Menlo" w:hAnsi="Menlo" w:cs="Menlo"/>
+          <w:color w:val="E394DC"/>
+          <w:sz w:val="18"/>
+          <w:szCs w:val="18"/>
+          <w:shd w:val="clear" w:color="auto" w:fill="181818"/>
+        </w:rPr>
+        <w:t>network</w:t>
+      </w:r>
+      <w:r>
+        <w:rPr>
+          <w:rFonts w:ascii="Menlo" w:hAnsi="Menlo" w:cs="Menlo"/>
+          <w:color w:val="F0F0F0"/>
+          <w:sz w:val="18"/>
+          <w:szCs w:val="18"/>
+          <w:shd w:val="clear" w:color="auto" w:fill="181818"/>
+        </w:rPr>
+        <w:t>"] = "</w:t>
+      </w:r>
+      <w:r>
+        <w:rPr>
+          <w:rFonts w:ascii="Menlo" w:hAnsi="Menlo" w:cs="Menlo"/>
+          <w:color w:val="E394DC"/>
+          <w:sz w:val="18"/>
+          <w:szCs w:val="18"/>
+          <w:shd w:val="clear" w:color="auto" w:fill="181818"/>
+        </w:rPr>
+        <w:t>10.1.1.0</w:t>
+      </w:r>
+      <w:r>
+        <w:rPr>
+          <w:rFonts w:ascii="Menlo" w:hAnsi="Menlo" w:cs="Menlo"/>
+          <w:color w:val="F0F0F0"/>
+          <w:sz w:val="18"/>
+          <w:szCs w:val="18"/>
+          <w:shd w:val="clear" w:color="auto" w:fill="181818"/>
+        </w:rPr>
+        <w:t xml:space="preserve">"   </w:t>
+      </w:r>
+      <w:r>
+        <w:rPr>
+          <w:rFonts w:ascii="Menlo" w:hAnsi="Menlo" w:cs="Menlo"/>
+          <w:i/>
+          <w:iCs/>
+          <w:sz w:val="18"/>
+          <w:szCs w:val="18"/>
+          <w:shd w:val="clear" w:color="auto" w:fill="181818"/>
+        </w:rPr>
+        <w:t xml:space="preserve"># works — the SAME </w:t>
+      </w:r>
+      <w:proofErr w:type="spellStart"/>
+      <w:r>
+        <w:rPr>
+          <w:rFonts w:ascii="Menlo" w:hAnsi="Menlo" w:cs="Menlo"/>
+          <w:i/>
+          <w:iCs/>
+          <w:sz w:val="18"/>
+          <w:szCs w:val="18"/>
+          <w:shd w:val="clear" w:color="auto" w:fill="181818"/>
+        </w:rPr>
+        <w:t>dict</w:t>
+      </w:r>
+      <w:proofErr w:type="spellEnd"/>
+      <w:r>
+        <w:rPr>
+          <w:rFonts w:ascii="Menlo" w:hAnsi="Menlo" w:cs="Menlo"/>
+          <w:i/>
+          <w:iCs/>
+          <w:sz w:val="18"/>
+          <w:szCs w:val="18"/>
+          <w:shd w:val="clear" w:color="auto" w:fill="181818"/>
+        </w:rPr>
+        <w:t xml:space="preserve"> is edited in place</w:t>
+      </w:r>
+    </w:p>
+    <w:p>
+      <w:pPr>
+        <w:rPr>
+          <w:rFonts w:ascii="Menlo" w:hAnsi="Menlo" w:cs="Menlo"/>
+          <w:i/>
+          <w:iCs/>
+          <w:sz w:val="18"/>
+          <w:szCs w:val="18"/>
+          <w:shd w:val="clear" w:color="auto" w:fill="181818"/>
+        </w:rPr>
+      </w:pPr>
+    </w:p>
+    <w:p>
+      <w:r>
+        <w:t xml:space="preserve">the existing </w:t>
+      </w:r>
+      <w:proofErr w:type="spellStart"/>
+      <w:r>
+        <w:t>dict</w:t>
+      </w:r>
+      <w:proofErr w:type="spellEnd"/>
+      <w:r>
+        <w:t xml:space="preserve"> changed. That in-place changeability is exactly why a </w:t>
+      </w:r>
+      <w:proofErr w:type="spellStart"/>
+      <w:r>
+        <w:t>dict</w:t>
+      </w:r>
+      <w:proofErr w:type="spellEnd"/>
+      <w:r>
+        <w:t xml:space="preserve"> can't be hashed (its hash would move)</w:t>
+      </w:r>
+    </w:p>
+    <w:p/>
+    <w:tbl>
+      <w:tblPr>
+        <w:tblW w:w="0" w:type="auto"/>
+        <w:tblCellMar>
+          <w:top w:w="15" w:type="dxa"/>
+          <w:left w:w="15" w:type="dxa"/>
+          <w:bottom w:w="15" w:type="dxa"/>
+          <w:right w:w="15" w:type="dxa"/>
+        </w:tblCellMar>
+        <w:tblLook w:val="04A0" w:firstRow="1" w:lastRow="0" w:firstColumn="1" w:lastColumn="0" w:noHBand="0" w:noVBand="1"/>
+      </w:tblPr>
+      <w:tblGrid>
+        <w:gridCol w:w="4179"/>
+        <w:gridCol w:w="3646"/>
+      </w:tblGrid>
+      <w:tr>
+        <w:trPr>
+          <w:tblHeader/>
+        </w:trPr>
+        <w:tc>
+          <w:tcPr>
+            <w:tcW w:w="0" w:type="auto"/>
+            <w:noWrap/>
+            <w:tcMar>
+              <w:top w:w="75" w:type="dxa"/>
+              <w:left w:w="135" w:type="dxa"/>
+              <w:bottom w:w="75" w:type="dxa"/>
+              <w:right w:w="135" w:type="dxa"/>
+            </w:tcMar>
+            <w:hideMark/>
+          </w:tcPr>
+          <w:p>
+            <w:pPr>
+              <w:rPr>
+                <w:b/>
+                <w:bCs/>
+                <w:lang w:val="en-IN"/>
+              </w:rPr>
+            </w:pPr>
+            <w:r>
+              <w:rPr>
+                <w:b/>
+                <w:bCs/>
+                <w:lang w:val="en-IN"/>
+              </w:rPr>
+              <w:lastRenderedPageBreak/>
+              <w:t>Mutable (can change</w:t>
+            </w:r>
+            <w:r>
+              <w:rPr>
+                <w:b/>
+                <w:bCs/>
+                <w:lang w:val="en-IN"/>
+              </w:rPr>
+              <w:sym w:font="Wingdings" w:char="F0E0"/>
+            </w:r>
+            <w:r>
+              <w:rPr>
+                <w:b/>
+                <w:bCs/>
+                <w:lang w:val="en-IN"/>
+              </w:rPr>
+              <w:t xml:space="preserve"> unhashable</w:t>
+            </w:r>
+            <w:r>
+              <w:rPr>
+                <w:b/>
+                <w:bCs/>
+                <w:lang w:val="en-IN"/>
+              </w:rPr>
+              <w:t>)</w:t>
+            </w:r>
+          </w:p>
+        </w:tc>
+        <w:tc>
+          <w:tcPr>
+            <w:tcW w:w="0" w:type="auto"/>
+            <w:noWrap/>
+            <w:tcMar>
+              <w:top w:w="75" w:type="dxa"/>
+              <w:left w:w="135" w:type="dxa"/>
+              <w:bottom w:w="75" w:type="dxa"/>
+              <w:right w:w="135" w:type="dxa"/>
+            </w:tcMar>
+            <w:hideMark/>
+          </w:tcPr>
+          <w:p>
+            <w:pPr>
+              <w:rPr>
+                <w:b/>
+                <w:bCs/>
+                <w:lang w:val="en-IN"/>
+              </w:rPr>
+            </w:pPr>
+            <w:r>
+              <w:rPr>
+                <w:b/>
+                <w:bCs/>
+                <w:lang w:val="en-IN"/>
+              </w:rPr>
+              <w:t>Immutable (sealed → hashable)</w:t>
+            </w:r>
+          </w:p>
+        </w:tc>
+      </w:tr>
+      <w:tr>
+        <w:tc>
+          <w:tcPr>
+            <w:tcW w:w="0" w:type="auto"/>
+            <w:tcMar>
+              <w:top w:w="75" w:type="dxa"/>
+              <w:left w:w="135" w:type="dxa"/>
+              <w:bottom w:w="75" w:type="dxa"/>
+              <w:right w:w="135" w:type="dxa"/>
+            </w:tcMar>
+            <w:hideMark/>
+          </w:tcPr>
+          <w:p>
+            <w:pPr>
+              <w:rPr>
+                <w:lang w:val="en-IN"/>
+              </w:rPr>
+            </w:pPr>
+            <w:r>
+              <w:rPr>
+                <w:lang w:val="en-IN"/>
+              </w:rPr>
+              <w:t>list [...]</w:t>
+            </w:r>
+          </w:p>
+        </w:tc>
+        <w:tc>
+          <w:tcPr>
+            <w:tcW w:w="0" w:type="auto"/>
+            <w:tcMar>
+              <w:top w:w="75" w:type="dxa"/>
+              <w:left w:w="135" w:type="dxa"/>
+              <w:bottom w:w="75" w:type="dxa"/>
+              <w:right w:w="135" w:type="dxa"/>
+            </w:tcMar>
+            <w:hideMark/>
+          </w:tcPr>
+          <w:p>
+            <w:pPr>
+              <w:rPr>
+                <w:lang w:val="en-IN"/>
+              </w:rPr>
+            </w:pPr>
+            <w:r>
+              <w:rPr>
+                <w:lang w:val="en-IN"/>
+              </w:rPr>
+              <w:t>int, float, bool, complex</w:t>
+            </w:r>
+          </w:p>
+        </w:tc>
+      </w:tr>
+      <w:tr>
+        <w:tc>
+          <w:tcPr>
+            <w:tcW w:w="0" w:type="auto"/>
+            <w:tcMar>
+              <w:top w:w="75" w:type="dxa"/>
+              <w:left w:w="135" w:type="dxa"/>
+              <w:bottom w:w="75" w:type="dxa"/>
+              <w:right w:w="135" w:type="dxa"/>
+            </w:tcMar>
+            <w:hideMark/>
+          </w:tcPr>
+          <w:p>
+            <w:pPr>
+              <w:rPr>
+                <w:lang w:val="en-IN"/>
+              </w:rPr>
+            </w:pPr>
+            <w:proofErr w:type="spellStart"/>
+            <w:r>
+              <w:rPr>
+                <w:lang w:val="en-IN"/>
+              </w:rPr>
+              <w:t>dict</w:t>
+            </w:r>
+            <w:proofErr w:type="spellEnd"/>
+            <w:r>
+              <w:rPr>
+                <w:lang w:val="en-IN"/>
+              </w:rPr>
+              <w:t> {k: v}</w:t>
+            </w:r>
+          </w:p>
+        </w:tc>
+        <w:tc>
+          <w:tcPr>
+            <w:tcW w:w="0" w:type="auto"/>
+            <w:tcMar>
+              <w:top w:w="75" w:type="dxa"/>
+              <w:left w:w="135" w:type="dxa"/>
+              <w:bottom w:w="75" w:type="dxa"/>
+              <w:right w:w="135" w:type="dxa"/>
+            </w:tcMar>
+            <w:hideMark/>
+          </w:tcPr>
+          <w:p>
+            <w:pPr>
+              <w:rPr>
+                <w:lang w:val="en-IN"/>
+              </w:rPr>
+            </w:pPr>
+            <w:r>
+              <w:rPr>
+                <w:lang w:val="en-IN"/>
+              </w:rPr>
+              <w:t>str</w:t>
+            </w:r>
+          </w:p>
+        </w:tc>
+      </w:tr>
+      <w:tr>
+        <w:tc>
+          <w:tcPr>
+            <w:tcW w:w="0" w:type="auto"/>
+            <w:tcMar>
+              <w:top w:w="75" w:type="dxa"/>
+              <w:left w:w="135" w:type="dxa"/>
+              <w:bottom w:w="75" w:type="dxa"/>
+              <w:right w:w="135" w:type="dxa"/>
+            </w:tcMar>
+            <w:hideMark/>
+          </w:tcPr>
+          <w:p>
+            <w:pPr>
+              <w:rPr>
+                <w:lang w:val="en-IN"/>
+              </w:rPr>
+            </w:pPr>
+            <w:r>
+              <w:rPr>
+                <w:lang w:val="en-IN"/>
+              </w:rPr>
+              <w:t>set {...}</w:t>
+            </w:r>
+          </w:p>
+        </w:tc>
+        <w:tc>
+          <w:tcPr>
+            <w:tcW w:w="0" w:type="auto"/>
+            <w:tcMar>
+              <w:top w:w="75" w:type="dxa"/>
+              <w:left w:w="135" w:type="dxa"/>
+              <w:bottom w:w="75" w:type="dxa"/>
+              <w:right w:w="135" w:type="dxa"/>
+            </w:tcMar>
+            <w:hideMark/>
+          </w:tcPr>
+          <w:p>
+            <w:pPr>
+              <w:rPr>
+                <w:lang w:val="en-IN"/>
+              </w:rPr>
+            </w:pPr>
+            <w:r>
+              <w:rPr>
+                <w:lang w:val="en-IN"/>
+              </w:rPr>
+              <w:t>tuple (...)</w:t>
+            </w:r>
+          </w:p>
+        </w:tc>
+      </w:tr>
+      <w:tr>
+        <w:tc>
+          <w:tcPr>
+            <w:tcW w:w="0" w:type="auto"/>
+            <w:tcMar>
+              <w:top w:w="75" w:type="dxa"/>
+              <w:left w:w="135" w:type="dxa"/>
+              <w:bottom w:w="75" w:type="dxa"/>
+              <w:right w:w="135" w:type="dxa"/>
+            </w:tcMar>
+            <w:hideMark/>
+          </w:tcPr>
+          <w:p>
+            <w:pPr>
+              <w:rPr>
+                <w:lang w:val="en-IN"/>
+              </w:rPr>
+            </w:pPr>
+            <w:proofErr w:type="spellStart"/>
+            <w:r>
+              <w:rPr>
+                <w:lang w:val="en-IN"/>
+              </w:rPr>
+              <w:t>bytearray</w:t>
+            </w:r>
+            <w:proofErr w:type="spellEnd"/>
+          </w:p>
+        </w:tc>
+        <w:tc>
+          <w:tcPr>
+            <w:tcW w:w="0" w:type="auto"/>
+            <w:tcMar>
+              <w:top w:w="75" w:type="dxa"/>
+              <w:left w:w="135" w:type="dxa"/>
+              <w:bottom w:w="75" w:type="dxa"/>
+              <w:right w:w="135" w:type="dxa"/>
+            </w:tcMar>
+            <w:hideMark/>
+          </w:tcPr>
+          <w:p>
+            <w:pPr>
+              <w:rPr>
+                <w:lang w:val="en-IN"/>
+              </w:rPr>
+            </w:pPr>
+            <w:proofErr w:type="spellStart"/>
+            <w:r>
+              <w:rPr>
+                <w:lang w:val="en-IN"/>
+              </w:rPr>
+              <w:t>frozenset</w:t>
+            </w:r>
+            <w:proofErr w:type="spellEnd"/>
+            <w:r>
+              <w:rPr>
+                <w:lang w:val="en-IN"/>
+              </w:rPr>
+              <w:t> (an immutable set)</w:t>
+            </w:r>
+          </w:p>
+        </w:tc>
+      </w:tr>
+      <w:tr>
+        <w:tc>
+          <w:tcPr>
+            <w:tcW w:w="0" w:type="auto"/>
+            <w:tcMar>
+              <w:top w:w="75" w:type="dxa"/>
+              <w:left w:w="135" w:type="dxa"/>
+              <w:bottom w:w="75" w:type="dxa"/>
+              <w:right w:w="135" w:type="dxa"/>
+            </w:tcMar>
+            <w:hideMark/>
+          </w:tcPr>
+          <w:p>
+            <w:pPr>
+              <w:rPr>
+                <w:lang w:val="en-IN"/>
+              </w:rPr>
+            </w:pPr>
+          </w:p>
+        </w:tc>
+        <w:tc>
+          <w:tcPr>
+            <w:tcW w:w="0" w:type="auto"/>
+            <w:tcMar>
+              <w:top w:w="75" w:type="dxa"/>
+              <w:left w:w="135" w:type="dxa"/>
+              <w:bottom w:w="75" w:type="dxa"/>
+              <w:right w:w="135" w:type="dxa"/>
+            </w:tcMar>
+            <w:hideMark/>
+          </w:tcPr>
+          <w:p>
+            <w:pPr>
+              <w:rPr>
+                <w:lang w:val="en-IN"/>
+              </w:rPr>
+            </w:pPr>
+            <w:r>
+              <w:rPr>
+                <w:lang w:val="en-IN"/>
+              </w:rPr>
+              <w:t>bytes, None</w:t>
+            </w:r>
+          </w:p>
+        </w:tc>
+      </w:tr>
+    </w:tbl>
+    <w:p>
+      <w:pPr>
+        <w:rPr>
+          <w:lang w:val="en-IN"/>
+        </w:rPr>
+      </w:pPr>
+    </w:p>
+    <w:p>
+      <w:pPr>
+        <w:rPr>
+          <w:lang w:val="en-IN"/>
+        </w:rPr>
+      </w:pPr>
+    </w:p>
+    <w:p>
+      <w:pPr>
         <w:rPr>
           <w:b/>
           <w:bCs/>
-          <w:i/>
-          <w:iCs/>
-          <w:u w:val="single"/>
-        </w:rPr>
-        <w:t>self</w:t>
-      </w:r>
-      <w:r>
-        <w:t xml:space="preserve"> — a parameter; it's how the object arrives </w:t>
-      </w:r>
-      <w:proofErr w:type="gramStart"/>
-      <w:r>
-        <w:t>into</w:t>
-      </w:r>
-      <w:proofErr w:type="gramEnd"/>
-      <w:r>
-        <w:t xml:space="preserve"> the method. Written bare because it is the object.</w:t>
-      </w:r>
-    </w:p>
-    <w:p>
+          <w:lang w:val="en-IN"/>
+        </w:rPr>
+      </w:pPr>
+      <w:r>
+        <w:rPr>
+          <w:lang w:val="en-IN"/>
+        </w:rPr>
+        <w:t xml:space="preserve">JSON as a format only has six value types: </w:t>
+      </w:r>
       <w:r>
         <w:rPr>
           <w:b/>
           <w:bCs/>
-          <w:i/>
-          <w:iCs/>
-          <w:u w:val="single"/>
-        </w:rPr>
-        <w:t>self.data</w:t>
-      </w:r>
-      <w:r>
-        <w:t xml:space="preserve"> — has self. because data is state the object remembers beyond this call. You reach it through the object.</w:t>
-      </w:r>
-    </w:p>
-    <w:p/>
-    <w:p>
-      <w:r>
-        <w:t xml:space="preserve">Self is </w:t>
-      </w:r>
-      <w:proofErr w:type="gramStart"/>
-      <w:r>
-        <w:t>handle</w:t>
-      </w:r>
-      <w:proofErr w:type="gramEnd"/>
-      <w:r>
-        <w:t xml:space="preserve"> to the entire object. </w:t>
-      </w:r>
-    </w:p>
-    <w:p/>
-    <w:p>
-      <w:r>
-        <w:rPr>
-          <w:color w:val="E97132" w:themeColor="accent2"/>
-        </w:rPr>
-        <w:t xml:space="preserve">a </w:t>
-      </w:r>
-      <w:r>
-        <w:t xml:space="preserve">becomes self automatically. So </w:t>
-      </w:r>
-      <w:r>
-        <w:rPr>
-          <w:color w:val="E97132" w:themeColor="accent2"/>
-        </w:rPr>
-        <w:t xml:space="preserve">a.get_hostname(self) is wrong </w:t>
-      </w:r>
-      <w:r>
-        <w:t xml:space="preserve">— you </w:t>
-      </w:r>
+          <w:lang w:val="en-IN"/>
+        </w:rPr>
+        <w:t xml:space="preserve">object (↔ Python </w:t>
+      </w:r>
+      <w:proofErr w:type="spellStart"/>
       <w:r>
         <w:rPr>
           <w:b/>
           <w:bCs/>
-        </w:rPr>
-        <w:t>never pass self</w:t>
-      </w:r>
-      <w:r>
-        <w:t xml:space="preserve"> when calling</w:t>
-      </w:r>
-    </w:p>
-    <w:p/>
-    <w:p>
-      <w:r>
-        <w:t xml:space="preserve">self = ONLY inside the class (in the method definition – first parameter). Meaningless outside. </w:t>
-      </w:r>
-    </w:p>
-    <w:p>
-      <w:r>
-        <w:t xml:space="preserve">self.data = INSIDE the methods. To reach the object that self caught. To reach/get/call the lines. </w:t>
-      </w:r>
-    </w:p>
-    <w:p>
-      <w:proofErr w:type="gramStart"/>
-      <w:r>
-        <w:t>a.method</w:t>
-      </w:r>
-      <w:proofErr w:type="gramEnd"/>
-      <w:r>
-        <w:t xml:space="preserve">() = outside the class </w:t>
-      </w:r>
-      <w:r>
-        <w:t>(a test, build_data, __main__</w:t>
-      </w:r>
-      <w:r>
-        <w:t>), no reference of self. M</w:t>
-      </w:r>
-      <w:r>
-        <w:t>ake the object (a = GetConfig(lines)) and talk to it by its name.</w:t>
-      </w:r>
-    </w:p>
-    <w:p/>
+          <w:lang w:val="en-IN"/>
+        </w:rPr>
+        <w:t>dict</w:t>
+      </w:r>
+      <w:proofErr w:type="spellEnd"/>
+      <w:r>
+        <w:rPr>
+          <w:b/>
+          <w:bCs/>
+          <w:lang w:val="en-IN"/>
+        </w:rPr>
+        <w:t xml:space="preserve">), array (↔ list), string, number, </w:t>
+      </w:r>
+      <w:proofErr w:type="spellStart"/>
+      <w:r>
+        <w:rPr>
+          <w:b/>
+          <w:bCs/>
+          <w:lang w:val="en-IN"/>
+        </w:rPr>
+        <w:t>boolean</w:t>
+      </w:r>
+      <w:proofErr w:type="spellEnd"/>
+      <w:r>
+        <w:rPr>
+          <w:b/>
+          <w:bCs/>
+          <w:lang w:val="en-IN"/>
+        </w:rPr>
+        <w:t>, null.</w:t>
+      </w:r>
+    </w:p>
     <w:p>
       <w:pPr>
-        <w:shd w:val="clear" w:color="auto" w:fill="181818"/>
-        <w:rPr>
-          <w:rFonts w:ascii="Menlo" w:eastAsia="Times New Roman" w:hAnsi="Menlo" w:cs="Menlo"/>
-          <w:kern w:val="0"/>
-          <w:sz w:val="18"/>
-          <w:szCs w:val="18"/>
-          <w:lang w:val="en-IN" w:eastAsia="en-GB"/>
-          <w14:ligatures w14:val="none"/>
+        <w:rPr>
+          <w:b/>
+          <w:bCs/>
         </w:rPr>
       </w:pPr>
-      <w:r>
-        <w:rPr>
-          <w:rFonts w:ascii="Menlo" w:eastAsia="Times New Roman" w:hAnsi="Menlo" w:cs="Menlo"/>
-          <w:kern w:val="0"/>
-          <w:sz w:val="18"/>
-          <w:szCs w:val="18"/>
-          <w:lang w:val="en-IN" w:eastAsia="en-GB"/>
-          <w14:ligatures w14:val="none"/>
-        </w:rPr>
-        <w:t xml:space="preserve">    </w:t>
-      </w:r>
-      <w:r>
-        <w:rPr>
-          <w:rFonts w:ascii="Menlo" w:eastAsia="Times New Roman" w:hAnsi="Menlo" w:cs="Menlo"/>
-          <w:color w:val="82D2CE"/>
-          <w:kern w:val="0"/>
-          <w:sz w:val="18"/>
-          <w:szCs w:val="18"/>
-          <w:lang w:val="en-IN" w:eastAsia="en-GB"/>
-          <w14:ligatures w14:val="none"/>
-        </w:rPr>
-        <w:t>def</w:t>
-      </w:r>
-      <w:r>
-        <w:rPr>
-          <w:rFonts w:ascii="Menlo" w:eastAsia="Times New Roman" w:hAnsi="Menlo" w:cs="Menlo"/>
-          <w:kern w:val="0"/>
-          <w:sz w:val="18"/>
-          <w:szCs w:val="18"/>
-          <w:lang w:val="en-IN" w:eastAsia="en-GB"/>
-          <w14:ligatures w14:val="none"/>
-        </w:rPr>
-        <w:t xml:space="preserve"> </w:t>
-      </w:r>
-      <w:r>
-        <w:rPr>
-          <w:rFonts w:ascii="Menlo" w:eastAsia="Times New Roman" w:hAnsi="Menlo" w:cs="Menlo"/>
-          <w:color w:val="EFB080"/>
-          <w:kern w:val="0"/>
-          <w:sz w:val="18"/>
-          <w:szCs w:val="18"/>
-          <w:lang w:val="en-IN" w:eastAsia="en-GB"/>
-          <w14:ligatures w14:val="none"/>
-        </w:rPr>
-        <w:t>__init__</w:t>
-      </w:r>
-      <w:r>
-        <w:rPr>
-          <w:rFonts w:ascii="Menlo" w:eastAsia="Times New Roman" w:hAnsi="Menlo" w:cs="Menlo"/>
-          <w:kern w:val="0"/>
-          <w:sz w:val="18"/>
-          <w:szCs w:val="18"/>
-          <w:lang w:val="en-IN" w:eastAsia="en-GB"/>
-          <w14:ligatures w14:val="none"/>
-        </w:rPr>
-        <w:t>(</w:t>
-      </w:r>
-      <w:r>
-        <w:rPr>
-          <w:rFonts w:ascii="Menlo" w:eastAsia="Times New Roman" w:hAnsi="Menlo" w:cs="Menlo"/>
-          <w:color w:val="D6D6DD"/>
-          <w:kern w:val="0"/>
-          <w:sz w:val="18"/>
-          <w:szCs w:val="18"/>
-          <w:lang w:val="en-IN" w:eastAsia="en-GB"/>
-          <w14:ligatures w14:val="none"/>
-        </w:rPr>
-        <w:t>self</w:t>
-      </w:r>
-      <w:r>
-        <w:rPr>
-          <w:rFonts w:ascii="Menlo" w:eastAsia="Times New Roman" w:hAnsi="Menlo" w:cs="Menlo"/>
-          <w:kern w:val="0"/>
-          <w:sz w:val="18"/>
-          <w:szCs w:val="18"/>
-          <w:lang w:val="en-IN" w:eastAsia="en-GB"/>
-          <w14:ligatures w14:val="none"/>
-        </w:rPr>
-        <w:t xml:space="preserve">, </w:t>
-      </w:r>
-      <w:r>
-        <w:rPr>
-          <w:rFonts w:ascii="Menlo" w:eastAsia="Times New Roman" w:hAnsi="Menlo" w:cs="Menlo"/>
-          <w:color w:val="D6D6DD"/>
-          <w:kern w:val="0"/>
-          <w:sz w:val="18"/>
-          <w:szCs w:val="18"/>
-          <w:lang w:val="en-IN" w:eastAsia="en-GB"/>
-          <w14:ligatures w14:val="none"/>
-        </w:rPr>
-        <w:t>lines</w:t>
-      </w:r>
-      <w:r>
-        <w:rPr>
-          <w:rFonts w:ascii="Menlo" w:eastAsia="Times New Roman" w:hAnsi="Menlo" w:cs="Menlo"/>
-          <w:kern w:val="0"/>
-          <w:sz w:val="18"/>
-          <w:szCs w:val="18"/>
-          <w:lang w:val="en-IN" w:eastAsia="en-GB"/>
-          <w14:ligatures w14:val="none"/>
-        </w:rPr>
-        <w:t xml:space="preserve">):     </w:t>
-      </w:r>
-      <w:r>
-        <w:rPr>
-          <w:rFonts w:ascii="Menlo" w:eastAsia="Times New Roman" w:hAnsi="Menlo" w:cs="Menlo"/>
-          <w:i/>
-          <w:iCs/>
-          <w:kern w:val="0"/>
-          <w:sz w:val="18"/>
-          <w:szCs w:val="18"/>
-          <w:lang w:val="en-IN" w:eastAsia="en-GB"/>
-          <w14:ligatures w14:val="none"/>
-        </w:rPr>
-        <w:t># 'lines' = incoming value, only here at birth</w:t>
-      </w:r>
-    </w:p>
-    <w:p>
-      <w:pPr>
-        <w:shd w:val="clear" w:color="auto" w:fill="181818"/>
-        <w:rPr>
-          <w:rFonts w:ascii="Menlo" w:eastAsia="Times New Roman" w:hAnsi="Menlo" w:cs="Menlo"/>
-          <w:kern w:val="0"/>
-          <w:sz w:val="18"/>
-          <w:szCs w:val="18"/>
-          <w:lang w:val="en-IN" w:eastAsia="en-GB"/>
-          <w14:ligatures w14:val="none"/>
-        </w:rPr>
-      </w:pPr>
-      <w:r>
-        <w:rPr>
-          <w:rFonts w:ascii="Menlo" w:eastAsia="Times New Roman" w:hAnsi="Menlo" w:cs="Menlo"/>
-          <w:kern w:val="0"/>
-          <w:sz w:val="18"/>
-          <w:szCs w:val="18"/>
-          <w:lang w:val="en-IN" w:eastAsia="en-GB"/>
-          <w14:ligatures w14:val="none"/>
-        </w:rPr>
-        <w:t xml:space="preserve">        </w:t>
-      </w:r>
-      <w:r>
-        <w:rPr>
-          <w:rFonts w:ascii="Menlo" w:eastAsia="Times New Roman" w:hAnsi="Menlo" w:cs="Menlo"/>
-          <w:color w:val="CC7C8A"/>
-          <w:kern w:val="0"/>
-          <w:sz w:val="18"/>
-          <w:szCs w:val="18"/>
-          <w:lang w:val="en-IN" w:eastAsia="en-GB"/>
-          <w14:ligatures w14:val="none"/>
-        </w:rPr>
-        <w:t>self</w:t>
-      </w:r>
-      <w:r>
-        <w:rPr>
-          <w:rFonts w:ascii="Menlo" w:eastAsia="Times New Roman" w:hAnsi="Menlo" w:cs="Menlo"/>
-          <w:kern w:val="0"/>
-          <w:sz w:val="18"/>
-          <w:szCs w:val="18"/>
-          <w:lang w:val="en-IN" w:eastAsia="en-GB"/>
-          <w14:ligatures w14:val="none"/>
-        </w:rPr>
-        <w:t xml:space="preserve">.data = lines          </w:t>
-      </w:r>
-      <w:r>
-        <w:rPr>
-          <w:rFonts w:ascii="Menlo" w:eastAsia="Times New Roman" w:hAnsi="Menlo" w:cs="Menlo"/>
-          <w:i/>
-          <w:iCs/>
-          <w:kern w:val="0"/>
-          <w:sz w:val="18"/>
-          <w:szCs w:val="18"/>
-          <w:lang w:val="en-IN" w:eastAsia="en-GB"/>
-          <w14:ligatures w14:val="none"/>
-        </w:rPr>
-        <w:t># store it ON the object as self.data</w:t>
-      </w:r>
-    </w:p>
-    <w:p>
-      <w:pPr>
-        <w:shd w:val="clear" w:color="auto" w:fill="181818"/>
-        <w:rPr>
-          <w:rFonts w:ascii="Menlo" w:eastAsia="Times New Roman" w:hAnsi="Menlo" w:cs="Menlo"/>
-          <w:kern w:val="0"/>
-          <w:sz w:val="18"/>
-          <w:szCs w:val="18"/>
-          <w:lang w:val="en-IN" w:eastAsia="en-GB"/>
-          <w14:ligatures w14:val="none"/>
-        </w:rPr>
-      </w:pPr>
-      <w:r>
-        <w:rPr>
-          <w:rFonts w:ascii="Menlo" w:eastAsia="Times New Roman" w:hAnsi="Menlo" w:cs="Menlo"/>
-          <w:kern w:val="0"/>
-          <w:sz w:val="18"/>
-          <w:szCs w:val="18"/>
-          <w:lang w:val="en-IN" w:eastAsia="en-GB"/>
-          <w14:ligatures w14:val="none"/>
-        </w:rPr>
-        <w:t xml:space="preserve">    </w:t>
-      </w:r>
-    </w:p>
-    <w:p>
-      <w:pPr>
-        <w:shd w:val="clear" w:color="auto" w:fill="181818"/>
-        <w:rPr>
-          <w:rFonts w:ascii="Menlo" w:eastAsia="Times New Roman" w:hAnsi="Menlo" w:cs="Menlo"/>
-          <w:kern w:val="0"/>
-          <w:sz w:val="18"/>
-          <w:szCs w:val="18"/>
-          <w:lang w:val="en-IN" w:eastAsia="en-GB"/>
-          <w14:ligatures w14:val="none"/>
-        </w:rPr>
-      </w:pPr>
-      <w:r>
-        <w:rPr>
-          <w:rFonts w:ascii="Menlo" w:eastAsia="Times New Roman" w:hAnsi="Menlo" w:cs="Menlo"/>
-          <w:kern w:val="0"/>
-          <w:sz w:val="18"/>
-          <w:szCs w:val="18"/>
-          <w:lang w:val="en-IN" w:eastAsia="en-GB"/>
-          <w14:ligatures w14:val="none"/>
-        </w:rPr>
-        <w:t xml:space="preserve">    </w:t>
-      </w:r>
-      <w:r>
-        <w:rPr>
-          <w:rFonts w:ascii="Menlo" w:eastAsia="Times New Roman" w:hAnsi="Menlo" w:cs="Menlo"/>
-          <w:color w:val="82D2CE"/>
-          <w:kern w:val="0"/>
-          <w:sz w:val="18"/>
-          <w:szCs w:val="18"/>
-          <w:lang w:val="en-IN" w:eastAsia="en-GB"/>
-          <w14:ligatures w14:val="none"/>
-        </w:rPr>
-        <w:t>def</w:t>
-      </w:r>
-      <w:r>
-        <w:rPr>
-          <w:rFonts w:ascii="Menlo" w:eastAsia="Times New Roman" w:hAnsi="Menlo" w:cs="Menlo"/>
-          <w:kern w:val="0"/>
-          <w:sz w:val="18"/>
-          <w:szCs w:val="18"/>
-          <w:lang w:val="en-IN" w:eastAsia="en-GB"/>
-          <w14:ligatures w14:val="none"/>
-        </w:rPr>
-        <w:t xml:space="preserve"> </w:t>
-      </w:r>
-      <w:r>
-        <w:rPr>
-          <w:rFonts w:ascii="Menlo" w:eastAsia="Times New Roman" w:hAnsi="Menlo" w:cs="Menlo"/>
-          <w:color w:val="EFB080"/>
-          <w:kern w:val="0"/>
-          <w:sz w:val="18"/>
-          <w:szCs w:val="18"/>
-          <w:lang w:val="en-IN" w:eastAsia="en-GB"/>
-          <w14:ligatures w14:val="none"/>
-        </w:rPr>
-        <w:t>get_hostname</w:t>
-      </w:r>
-      <w:r>
-        <w:rPr>
-          <w:rFonts w:ascii="Menlo" w:eastAsia="Times New Roman" w:hAnsi="Menlo" w:cs="Menlo"/>
-          <w:kern w:val="0"/>
-          <w:sz w:val="18"/>
-          <w:szCs w:val="18"/>
-          <w:lang w:val="en-IN" w:eastAsia="en-GB"/>
-          <w14:ligatures w14:val="none"/>
-        </w:rPr>
-        <w:t>(</w:t>
-      </w:r>
-      <w:r>
-        <w:rPr>
-          <w:rFonts w:ascii="Menlo" w:eastAsia="Times New Roman" w:hAnsi="Menlo" w:cs="Menlo"/>
-          <w:color w:val="D6D6DD"/>
-          <w:kern w:val="0"/>
-          <w:sz w:val="18"/>
-          <w:szCs w:val="18"/>
-          <w:lang w:val="en-IN" w:eastAsia="en-GB"/>
-          <w14:ligatures w14:val="none"/>
-        </w:rPr>
-        <w:t>self</w:t>
-      </w:r>
-      <w:r>
-        <w:rPr>
-          <w:rFonts w:ascii="Menlo" w:eastAsia="Times New Roman" w:hAnsi="Menlo" w:cs="Menlo"/>
-          <w:kern w:val="0"/>
-          <w:sz w:val="18"/>
-          <w:szCs w:val="18"/>
-          <w:lang w:val="en-IN" w:eastAsia="en-GB"/>
-          <w14:ligatures w14:val="none"/>
-        </w:rPr>
-        <w:t xml:space="preserve">):        </w:t>
-      </w:r>
-      <w:r>
-        <w:rPr>
-          <w:rFonts w:ascii="Menlo" w:eastAsia="Times New Roman" w:hAnsi="Menlo" w:cs="Menlo"/>
-          <w:i/>
-          <w:iCs/>
-          <w:kern w:val="0"/>
-          <w:sz w:val="18"/>
-          <w:szCs w:val="18"/>
-          <w:lang w:val="en-IN" w:eastAsia="en-GB"/>
-          <w14:ligatures w14:val="none"/>
-        </w:rPr>
-        <w:t># 'self' = the object this was called on</w:t>
-      </w:r>
-    </w:p>
-    <w:p>
-      <w:pPr>
-        <w:shd w:val="clear" w:color="auto" w:fill="181818"/>
-        <w:rPr>
-          <w:rFonts w:ascii="Menlo" w:eastAsia="Times New Roman" w:hAnsi="Menlo" w:cs="Menlo"/>
-          <w:kern w:val="0"/>
-          <w:sz w:val="18"/>
-          <w:szCs w:val="18"/>
-          <w:lang w:val="en-IN" w:eastAsia="en-GB"/>
-          <w14:ligatures w14:val="none"/>
-        </w:rPr>
-      </w:pPr>
-      <w:r>
-        <w:rPr>
-          <w:rFonts w:ascii="Menlo" w:eastAsia="Times New Roman" w:hAnsi="Menlo" w:cs="Menlo"/>
-          <w:kern w:val="0"/>
-          <w:sz w:val="18"/>
-          <w:szCs w:val="18"/>
-          <w:lang w:val="en-IN" w:eastAsia="en-GB"/>
-          <w14:ligatures w14:val="none"/>
-        </w:rPr>
-        <w:t xml:space="preserve">        </w:t>
-      </w:r>
-      <w:r>
-        <w:rPr>
-          <w:rFonts w:ascii="Menlo" w:eastAsia="Times New Roman" w:hAnsi="Menlo" w:cs="Menlo"/>
-          <w:color w:val="82D2CE"/>
-          <w:kern w:val="0"/>
-          <w:sz w:val="18"/>
-          <w:szCs w:val="18"/>
-          <w:lang w:val="en-IN" w:eastAsia="en-GB"/>
-          <w14:ligatures w14:val="none"/>
-        </w:rPr>
-        <w:t>for</w:t>
-      </w:r>
-      <w:r>
-        <w:rPr>
-          <w:rFonts w:ascii="Menlo" w:eastAsia="Times New Roman" w:hAnsi="Menlo" w:cs="Menlo"/>
-          <w:kern w:val="0"/>
-          <w:sz w:val="18"/>
-          <w:szCs w:val="18"/>
-          <w:lang w:val="en-IN" w:eastAsia="en-GB"/>
-          <w14:ligatures w14:val="none"/>
-        </w:rPr>
-        <w:t xml:space="preserve"> line </w:t>
-      </w:r>
-      <w:r>
-        <w:rPr>
-          <w:rFonts w:ascii="Menlo" w:eastAsia="Times New Roman" w:hAnsi="Menlo" w:cs="Menlo"/>
-          <w:color w:val="82D2CE"/>
-          <w:kern w:val="0"/>
-          <w:sz w:val="18"/>
-          <w:szCs w:val="18"/>
-          <w:lang w:val="en-IN" w:eastAsia="en-GB"/>
-          <w14:ligatures w14:val="none"/>
-        </w:rPr>
-        <w:t>in</w:t>
-      </w:r>
-      <w:r>
-        <w:rPr>
-          <w:rFonts w:ascii="Menlo" w:eastAsia="Times New Roman" w:hAnsi="Menlo" w:cs="Menlo"/>
-          <w:kern w:val="0"/>
-          <w:sz w:val="18"/>
-          <w:szCs w:val="18"/>
-          <w:lang w:val="en-IN" w:eastAsia="en-GB"/>
-          <w14:ligatures w14:val="none"/>
-        </w:rPr>
-        <w:t xml:space="preserve"> </w:t>
-      </w:r>
-      <w:r>
-        <w:rPr>
-          <w:rFonts w:ascii="Menlo" w:eastAsia="Times New Roman" w:hAnsi="Menlo" w:cs="Menlo"/>
-          <w:color w:val="CC7C8A"/>
-          <w:kern w:val="0"/>
-          <w:sz w:val="18"/>
-          <w:szCs w:val="18"/>
-          <w:lang w:val="en-IN" w:eastAsia="en-GB"/>
-          <w14:ligatures w14:val="none"/>
-        </w:rPr>
-        <w:t>self</w:t>
-      </w:r>
-      <w:r>
-        <w:rPr>
-          <w:rFonts w:ascii="Menlo" w:eastAsia="Times New Roman" w:hAnsi="Menlo" w:cs="Menlo"/>
-          <w:kern w:val="0"/>
-          <w:sz w:val="18"/>
-          <w:szCs w:val="18"/>
-          <w:lang w:val="en-IN" w:eastAsia="en-GB"/>
-          <w14:ligatures w14:val="none"/>
-        </w:rPr>
-        <w:t xml:space="preserve">.data:     </w:t>
-      </w:r>
-      <w:r>
-        <w:rPr>
-          <w:rFonts w:ascii="Menlo" w:eastAsia="Times New Roman" w:hAnsi="Menlo" w:cs="Menlo"/>
-          <w:i/>
-          <w:iCs/>
-          <w:kern w:val="0"/>
-          <w:sz w:val="18"/>
-          <w:szCs w:val="18"/>
-          <w:lang w:val="en-IN" w:eastAsia="en-GB"/>
-          <w14:ligatures w14:val="none"/>
-        </w:rPr>
-        <w:t># reach the stored lines via self.data ('lines' is GONE here)</w:t>
-      </w:r>
-    </w:p>
-    <w:p/>
-    <w:p/>
-    <w:p>
-      <w:r>
-        <w:rPr>
-          <w:color w:val="E97132" w:themeColor="accent2"/>
-        </w:rPr>
-        <w:t xml:space="preserve">self.data </w:t>
-      </w:r>
-      <w:r>
-        <w:t xml:space="preserve">and </w:t>
-      </w:r>
-      <w:r>
-        <w:rPr>
-          <w:color w:val="E97132" w:themeColor="accent2"/>
-        </w:rPr>
-        <w:t xml:space="preserve">a.data </w:t>
-      </w:r>
-      <w:r>
-        <w:t>are the same attribute seen from two sides — self.data from inside the class, a.data from outside. self and a are two names for one object: the inside-name and the outside-name.</w:t>
-      </w:r>
-    </w:p>
-    <w:p/>
+    </w:p>
     <w:sectPr>
       <w:footerReference w:type="even" r:id="rId6"/>
       <w:footerReference w:type="default" r:id="rId7"/>
@@ -2813,7 +4698,7 @@
 </file>
 
 <file path=word/endnotes.xml><?xml version="1.0" encoding="utf-8"?>
-<w:endnotes xmlns:wpc="http://schemas.microsoft.com/office/word/2010/wordprocessingCanvas" xmlns:cx="http://schemas.microsoft.com/office/drawing/2014/chartex" xmlns:cx1="http://schemas.microsoft.com/office/drawing/2015/9/8/chartex" xmlns:cx2="http://schemas.microsoft.com/office/drawing/2015/10/21/chartex" xmlns:cx3="http://schemas.microsoft.com/office/drawing/2016/5/9/chartex" xmlns:cx4="http://schemas.microsoft.com/office/drawing/2016/5/10/chartex" xmlns:cx5="http://schemas.microsoft.com/office/drawing/2016/5/11/chartex" xmlns:cx6="http://schemas.microsoft.com/office/drawing/2016/5/12/chartex" xmlns:cx7="http://schemas.microsoft.com/office/drawing/2016/5/13/chartex" xmlns:cx8="http://schemas.microsoft.com/office/drawing/2016/5/14/chartex" xmlns:mc="http://schemas.openxmlformats.org/markup-compatibility/2006" xmlns:aink="http://schemas.microsoft.com/office/drawing/2016/ink" xmlns:am3d="http://schemas.microsoft.com/office/drawing/2017/model3d" xmlns:o="urn:schemas-microsoft-com:office:office" xmlns:oel="http://schemas.microsoft.com/office/2019/extlst" xmlns:r="http://schemas.openxmlformats.org/officeDocument/2006/relationships" xmlns:m="http://schemas.openxmlformats.org/officeDocument/2006/math" xmlns:v="urn:schemas-microsoft-com:vml" xmlns:wp14="http://schemas.microsoft.com/office/word/2010/wordprocessingDrawing" xmlns:wp="http://schemas.openxmlformats.org/drawingml/2006/wordprocessingDrawing" xmlns:w10="urn:schemas-microsoft-com:office:word" xmlns:w="http://schemas.openxmlformats.org/wordprocessingml/2006/main" xmlns:w14="http://schemas.microsoft.com/office/word/2010/wordml" xmlns:w15="http://schemas.microsoft.com/office/word/2012/wordml" xmlns:w16cex="http://schemas.microsoft.com/office/word/2018/wordml/cex" xmlns:w16cid="http://schemas.microsoft.com/office/word/2016/wordml/cid" xmlns:w16="http://schemas.microsoft.com/office/word/2018/wordml" xmlns:w16du="http://schemas.microsoft.com/office/word/2023/wordml/word16du" xmlns:w16sdtdh="http://schemas.microsoft.com/office/word/2020/wordml/sdtdatahash" xmlns:w16sdtfl="http://schemas.microsoft.com/office/word/2024/wordml/sdtformatlock" xmlns:w16se="http://schemas.microsoft.com/office/word/2015/wordml/symex" xmlns:wpg="http://schemas.microsoft.com/office/word/2010/wordprocessingGroup" xmlns:wpi="http://schemas.microsoft.com/office/word/2010/wordprocessingInk" xmlns:wne="http://schemas.microsoft.com/office/word/2006/wordml" xmlns:wps="http://schemas.microsoft.com/office/word/2010/wordprocessingShape" mc:Ignorable="w14 w15 w16se w16cid w16 w16cex w16sdtdh w16sdtfl w16du wp14">
+<w:endnotes xmlns:wpc="http://schemas.microsoft.com/office/word/2010/wordprocessingCanvas" xmlns:cx="http://schemas.microsoft.com/office/drawing/2014/chartex" xmlns:cx1="http://schemas.microsoft.com/office/drawing/2015/9/8/chartex" xmlns:cx2="http://schemas.microsoft.com/office/drawing/2015/10/21/chartex" xmlns:cx3="http://schemas.microsoft.com/office/drawing/2016/5/9/chartex" xmlns:cx4="http://schemas.microsoft.com/office/drawing/2016/5/10/chartex" xmlns:cx5="http://schemas.microsoft.com/office/drawing/2016/5/11/chartex" xmlns:cx6="http://schemas.microsoft.com/office/drawing/2016/5/12/chartex" xmlns:cx7="http://schemas.microsoft.com/office/drawing/2016/5/13/chartex" xmlns:cx8="http://schemas.microsoft.com/office/drawing/2016/5/14/chartex" xmlns:mc="http://schemas.openxmlformats.org/markup-compatibility/2006" xmlns:m="http://schemas.openxmlformats.org/officeDocument/2006/math" xmlns:aink="http://schemas.microsoft.com/office/drawing/2016/ink" xmlns:am3d="http://schemas.microsoft.com/office/drawing/2017/model3d" xmlns:oel="http://schemas.microsoft.com/office/2019/extlst" xmlns:r="http://schemas.openxmlformats.org/officeDocument/2006/relationships" xmlns:wp14="http://schemas.microsoft.com/office/word/2010/wordprocessingDrawing" xmlns:wp="http://schemas.openxmlformats.org/drawingml/2006/wordprocessingDrawing" xmlns:wpg="http://schemas.microsoft.com/office/word/2010/wordprocessingGroup" xmlns:wpi="http://schemas.microsoft.com/office/word/2010/wordprocessingInk" xmlns:wps="http://schemas.microsoft.com/office/word/2010/wordprocessingShape" xmlns:o="urn:schemas-microsoft-com:office:office" xmlns:v="urn:schemas-microsoft-com:vml" xmlns:w10="urn:schemas-microsoft-com:office:word" xmlns:w="http://schemas.openxmlformats.org/wordprocessingml/2006/main" xmlns:w14="http://schemas.microsoft.com/office/word/2010/wordml" xmlns:w15="http://schemas.microsoft.com/office/word/2012/wordml" xmlns:w16cei="http://schemas.microsoft.com/office/word/2026/wordml/cei" xmlns:w16cex="http://schemas.microsoft.com/office/word/2018/wordml/cex" xmlns:w16cid="http://schemas.microsoft.com/office/word/2016/wordml/cid" xmlns:w16="http://schemas.microsoft.com/office/word/2018/wordml" xmlns:w16sdtdh="http://schemas.microsoft.com/office/word/2020/wordml/sdtdatahash" xmlns:w16sdtfl="http://schemas.microsoft.com/office/word/2024/wordml/sdtformatlock" xmlns:w16se="http://schemas.microsoft.com/office/word/2015/wordml/symex" xmlns:w16du="http://schemas.microsoft.com/office/word/2023/wordml/word16du" xmlns:wne="http://schemas.microsoft.com/office/word/2006/wordml" mc:Ignorable="w14 w15 w16se w16cid w16 w16cex w16sdtdh w16sdtfl w16du wp14">
   <w:endnote w:type="separator" w:id="-1">
     <w:p>
       <w:r>
@@ -2832,7 +4717,7 @@
 </file>
 
 <file path=word/footer1.xml><?xml version="1.0" encoding="utf-8"?>
-<w:ftr xmlns:wpc="http://schemas.microsoft.com/office/word/2010/wordprocessingCanvas" xmlns:cx="http://schemas.microsoft.com/office/drawing/2014/chartex" xmlns:cx1="http://schemas.microsoft.com/office/drawing/2015/9/8/chartex" xmlns:cx2="http://schemas.microsoft.com/office/drawing/2015/10/21/chartex" xmlns:cx3="http://schemas.microsoft.com/office/drawing/2016/5/9/chartex" xmlns:cx4="http://schemas.microsoft.com/office/drawing/2016/5/10/chartex" xmlns:cx5="http://schemas.microsoft.com/office/drawing/2016/5/11/chartex" xmlns:cx6="http://schemas.microsoft.com/office/drawing/2016/5/12/chartex" xmlns:cx7="http://schemas.microsoft.com/office/drawing/2016/5/13/chartex" xmlns:cx8="http://schemas.microsoft.com/office/drawing/2016/5/14/chartex" xmlns:mc="http://schemas.openxmlformats.org/markup-compatibility/2006" xmlns:aink="http://schemas.microsoft.com/office/drawing/2016/ink" xmlns:am3d="http://schemas.microsoft.com/office/drawing/2017/model3d" xmlns:o="urn:schemas-microsoft-com:office:office" xmlns:oel="http://schemas.microsoft.com/office/2019/extlst" xmlns:r="http://schemas.openxmlformats.org/officeDocument/2006/relationships" xmlns:m="http://schemas.openxmlformats.org/officeDocument/2006/math" xmlns:v="urn:schemas-microsoft-com:vml" xmlns:wp14="http://schemas.microsoft.com/office/word/2010/wordprocessingDrawing" xmlns:wp="http://schemas.openxmlformats.org/drawingml/2006/wordprocessingDrawing" xmlns:w10="urn:schemas-microsoft-com:office:word" xmlns:w="http://schemas.openxmlformats.org/wordprocessingml/2006/main" xmlns:w14="http://schemas.microsoft.com/office/word/2010/wordml" xmlns:w15="http://schemas.microsoft.com/office/word/2012/wordml" xmlns:w16cex="http://schemas.microsoft.com/office/word/2018/wordml/cex" xmlns:w16cid="http://schemas.microsoft.com/office/word/2016/wordml/cid" xmlns:w16="http://schemas.microsoft.com/office/word/2018/wordml" xmlns:w16du="http://schemas.microsoft.com/office/word/2023/wordml/word16du" xmlns:w16sdtdh="http://schemas.microsoft.com/office/word/2020/wordml/sdtdatahash" xmlns:w16sdtfl="http://schemas.microsoft.com/office/word/2024/wordml/sdtformatlock" xmlns:w16se="http://schemas.microsoft.com/office/word/2015/wordml/symex" xmlns:wpg="http://schemas.microsoft.com/office/word/2010/wordprocessingGroup" xmlns:wpi="http://schemas.microsoft.com/office/word/2010/wordprocessingInk" xmlns:wne="http://schemas.microsoft.com/office/word/2006/wordml" xmlns:wps="http://schemas.microsoft.com/office/word/2010/wordprocessingShape" mc:Ignorable="w14 w15 w16se w16cid w16 w16cex w16sdtdh w16sdtfl w16du wp14">
+<w:ftr xmlns:wpc="http://schemas.microsoft.com/office/word/2010/wordprocessingCanvas" xmlns:cx="http://schemas.microsoft.com/office/drawing/2014/chartex" xmlns:cx1="http://schemas.microsoft.com/office/drawing/2015/9/8/chartex" xmlns:cx2="http://schemas.microsoft.com/office/drawing/2015/10/21/chartex" xmlns:cx3="http://schemas.microsoft.com/office/drawing/2016/5/9/chartex" xmlns:cx4="http://schemas.microsoft.com/office/drawing/2016/5/10/chartex" xmlns:cx5="http://schemas.microsoft.com/office/drawing/2016/5/11/chartex" xmlns:cx6="http://schemas.microsoft.com/office/drawing/2016/5/12/chartex" xmlns:cx7="http://schemas.microsoft.com/office/drawing/2016/5/13/chartex" xmlns:cx8="http://schemas.microsoft.com/office/drawing/2016/5/14/chartex" xmlns:mc="http://schemas.openxmlformats.org/markup-compatibility/2006" xmlns:m="http://schemas.openxmlformats.org/officeDocument/2006/math" xmlns:aink="http://schemas.microsoft.com/office/drawing/2016/ink" xmlns:am3d="http://schemas.microsoft.com/office/drawing/2017/model3d" xmlns:oel="http://schemas.microsoft.com/office/2019/extlst" xmlns:r="http://schemas.openxmlformats.org/officeDocument/2006/relationships" xmlns:wp14="http://schemas.microsoft.com/office/word/2010/wordprocessingDrawing" xmlns:wp="http://schemas.openxmlformats.org/drawingml/2006/wordprocessingDrawing" xmlns:wpg="http://schemas.microsoft.com/office/word/2010/wordprocessingGroup" xmlns:wpi="http://schemas.microsoft.com/office/word/2010/wordprocessingInk" xmlns:wps="http://schemas.microsoft.com/office/word/2010/wordprocessingShape" xmlns:o="urn:schemas-microsoft-com:office:office" xmlns:v="urn:schemas-microsoft-com:vml" xmlns:w10="urn:schemas-microsoft-com:office:word" xmlns:w="http://schemas.openxmlformats.org/wordprocessingml/2006/main" xmlns:w14="http://schemas.microsoft.com/office/word/2010/wordml" xmlns:w15="http://schemas.microsoft.com/office/word/2012/wordml" xmlns:w16cei="http://schemas.microsoft.com/office/word/2026/wordml/cei" xmlns:w16cex="http://schemas.microsoft.com/office/word/2018/wordml/cex" xmlns:w16cid="http://schemas.microsoft.com/office/word/2016/wordml/cid" xmlns:w16="http://schemas.microsoft.com/office/word/2018/wordml" xmlns:w16sdtdh="http://schemas.microsoft.com/office/word/2020/wordml/sdtdatahash" xmlns:w16sdtfl="http://schemas.microsoft.com/office/word/2024/wordml/sdtformatlock" xmlns:w16se="http://schemas.microsoft.com/office/word/2015/wordml/symex" xmlns:w16du="http://schemas.microsoft.com/office/word/2023/wordml/word16du" xmlns:wne="http://schemas.microsoft.com/office/word/2006/wordml" mc:Ignorable="w14 w15 w16se w16cid w16 w16cex w16sdtdh w16sdtfl w16du wp14">
   <w:p>
     <w:pPr>
       <w:pStyle w:val="Footer"/>
@@ -2924,7 +4809,6 @@
               <v:path gradientshapeok="t" o:connecttype="rect"/>
             </v:shapetype>
             <v:shape id="Text Box 2" o:spid="_x0000_s1026" type="#_x0000_t202" alt="Cisco Confidential" style="position:absolute;margin-left:32.95pt;margin-top:0;width:84.15pt;height:24.75pt;z-index:251659264;visibility:visible;mso-wrap-style:none;mso-wrap-distance-left:0;mso-wrap-distance-top:0;mso-wrap-distance-right:0;mso-wrap-distance-bottom:0;mso-position-horizontal:right;mso-position-horizontal-relative:page;mso-position-vertical:bottom;mso-position-vertical-relative:page;v-text-anchor:bottom" o:gfxdata="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" filled="f" stroked="f">
-              <v:fill o:detectmouseclick="t"/>
               <v:textbox style="mso-fit-shape-to-text:t" inset="0,0,20pt,15pt">
                 <w:txbxContent>
                   <w:p>
@@ -2961,7 +4845,7 @@
 </file>
 
 <file path=word/footer2.xml><?xml version="1.0" encoding="utf-8"?>
-<w:ftr xmlns:wpc="http://schemas.microsoft.com/office/word/2010/wordprocessingCanvas" xmlns:cx="http://schemas.microsoft.com/office/drawing/2014/chartex" xmlns:cx1="http://schemas.microsoft.com/office/drawing/2015/9/8/chartex" xmlns:cx2="http://schemas.microsoft.com/office/drawing/2015/10/21/chartex" xmlns:cx3="http://schemas.microsoft.com/office/drawing/2016/5/9/chartex" xmlns:cx4="http://schemas.microsoft.com/office/drawing/2016/5/10/chartex" xmlns:cx5="http://schemas.microsoft.com/office/drawing/2016/5/11/chartex" xmlns:cx6="http://schemas.microsoft.com/office/drawing/2016/5/12/chartex" xmlns:cx7="http://schemas.microsoft.com/office/drawing/2016/5/13/chartex" xmlns:cx8="http://schemas.microsoft.com/office/drawing/2016/5/14/chartex" xmlns:mc="http://schemas.openxmlformats.org/markup-compatibility/2006" xmlns:aink="http://schemas.microsoft.com/office/drawing/2016/ink" xmlns:am3d="http://schemas.microsoft.com/office/drawing/2017/model3d" xmlns:o="urn:schemas-microsoft-com:office:office" xmlns:oel="http://schemas.microsoft.com/office/2019/extlst" xmlns:r="http://schemas.openxmlformats.org/officeDocument/2006/relationships" xmlns:m="http://schemas.openxmlformats.org/officeDocument/2006/math" xmlns:v="urn:schemas-microsoft-com:vml" xmlns:wp14="http://schemas.microsoft.com/office/word/2010/wordprocessingDrawing" xmlns:wp="http://schemas.openxmlformats.org/drawingml/2006/wordprocessingDrawing" xmlns:w10="urn:schemas-microsoft-com:office:word" xmlns:w="http://schemas.openxmlformats.org/wordprocessingml/2006/main" xmlns:w14="http://schemas.microsoft.com/office/word/2010/wordml" xmlns:w15="http://schemas.microsoft.com/office/word/2012/wordml" xmlns:w16cex="http://schemas.microsoft.com/office/word/2018/wordml/cex" xmlns:w16cid="http://schemas.microsoft.com/office/word/2016/wordml/cid" xmlns:w16="http://schemas.microsoft.com/office/word/2018/wordml" xmlns:w16du="http://schemas.microsoft.com/office/word/2023/wordml/word16du" xmlns:w16sdtdh="http://schemas.microsoft.com/office/word/2020/wordml/sdtdatahash" xmlns:w16sdtfl="http://schemas.microsoft.com/office/word/2024/wordml/sdtformatlock" xmlns:w16se="http://schemas.microsoft.com/office/word/2015/wordml/symex" xmlns:wpg="http://schemas.microsoft.com/office/word/2010/wordprocessingGroup" xmlns:wpi="http://schemas.microsoft.com/office/word/2010/wordprocessingInk" xmlns:wne="http://schemas.microsoft.com/office/word/2006/wordml" xmlns:wps="http://schemas.microsoft.com/office/word/2010/wordprocessingShape" mc:Ignorable="w14 w15 w16se w16cid w16 w16cex w16sdtdh w16sdtfl w16du wp14">
+<w:ftr xmlns:wpc="http://schemas.microsoft.com/office/word/2010/wordprocessingCanvas" xmlns:cx="http://schemas.microsoft.com/office/drawing/2014/chartex" xmlns:cx1="http://schemas.microsoft.com/office/drawing/2015/9/8/chartex" xmlns:cx2="http://schemas.microsoft.com/office/drawing/2015/10/21/chartex" xmlns:cx3="http://schemas.microsoft.com/office/drawing/2016/5/9/chartex" xmlns:cx4="http://schemas.microsoft.com/office/drawing/2016/5/10/chartex" xmlns:cx5="http://schemas.microsoft.com/office/drawing/2016/5/11/chartex" xmlns:cx6="http://schemas.microsoft.com/office/drawing/2016/5/12/chartex" xmlns:cx7="http://schemas.microsoft.com/office/drawing/2016/5/13/chartex" xmlns:cx8="http://schemas.microsoft.com/office/drawing/2016/5/14/chartex" xmlns:mc="http://schemas.openxmlformats.org/markup-compatibility/2006" xmlns:m="http://schemas.openxmlformats.org/officeDocument/2006/math" xmlns:aink="http://schemas.microsoft.com/office/drawing/2016/ink" xmlns:am3d="http://schemas.microsoft.com/office/drawing/2017/model3d" xmlns:oel="http://schemas.microsoft.com/office/2019/extlst" xmlns:r="http://schemas.openxmlformats.org/officeDocument/2006/relationships" xmlns:wp14="http://schemas.microsoft.com/office/word/2010/wordprocessingDrawing" xmlns:wp="http://schemas.openxmlformats.org/drawingml/2006/wordprocessingDrawing" xmlns:wpg="http://schemas.microsoft.com/office/word/2010/wordprocessingGroup" xmlns:wpi="http://schemas.microsoft.com/office/word/2010/wordprocessingInk" xmlns:wps="http://schemas.microsoft.com/office/word/2010/wordprocessingShape" xmlns:o="urn:schemas-microsoft-com:office:office" xmlns:v="urn:schemas-microsoft-com:vml" xmlns:w10="urn:schemas-microsoft-com:office:word" xmlns:w="http://schemas.openxmlformats.org/wordprocessingml/2006/main" xmlns:w14="http://schemas.microsoft.com/office/word/2010/wordml" xmlns:w15="http://schemas.microsoft.com/office/word/2012/wordml" xmlns:w16cei="http://schemas.microsoft.com/office/word/2026/wordml/cei" xmlns:w16cex="http://schemas.microsoft.com/office/word/2018/wordml/cex" xmlns:w16cid="http://schemas.microsoft.com/office/word/2016/wordml/cid" xmlns:w16="http://schemas.microsoft.com/office/word/2018/wordml" xmlns:w16sdtdh="http://schemas.microsoft.com/office/word/2020/wordml/sdtdatahash" xmlns:w16sdtfl="http://schemas.microsoft.com/office/word/2024/wordml/sdtformatlock" xmlns:w16se="http://schemas.microsoft.com/office/word/2015/wordml/symex" xmlns:w16du="http://schemas.microsoft.com/office/word/2023/wordml/word16du" xmlns:wne="http://schemas.microsoft.com/office/word/2006/wordml" mc:Ignorable="w14 w15 w16se w16cid w16 w16cex w16sdtdh w16sdtfl w16du wp14">
   <w:p>
     <w:pPr>
       <w:pStyle w:val="Footer"/>
@@ -3053,7 +4937,6 @@
               <v:path gradientshapeok="t" o:connecttype="rect"/>
             </v:shapetype>
             <v:shape id="Text Box 3" o:spid="_x0000_s1027" type="#_x0000_t202" alt="Cisco Confidential" style="position:absolute;margin-left:32.95pt;margin-top:0;width:84.15pt;height:24.75pt;z-index:251660288;visibility:visible;mso-wrap-style:none;mso-wrap-distance-left:0;mso-wrap-distance-top:0;mso-wrap-distance-right:0;mso-wrap-distance-bottom:0;mso-position-horizontal:right;mso-position-horizontal-relative:page;mso-position-vertical:bottom;mso-position-vertical-relative:page;v-text-anchor:bottom" o:gfxdata="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" filled="f" stroked="f">
-              <v:fill o:detectmouseclick="t"/>
               <v:textbox style="mso-fit-shape-to-text:t" inset="0,0,20pt,15pt">
                 <w:txbxContent>
                   <w:p>
@@ -3090,7 +4973,7 @@
 </file>
 
 <file path=word/footer3.xml><?xml version="1.0" encoding="utf-8"?>
-<w:ftr xmlns:wpc="http://schemas.microsoft.com/office/word/2010/wordprocessingCanvas" xmlns:cx="http://schemas.microsoft.com/office/drawing/2014/chartex" xmlns:cx1="http://schemas.microsoft.com/office/drawing/2015/9/8/chartex" xmlns:cx2="http://schemas.microsoft.com/office/drawing/2015/10/21/chartex" xmlns:cx3="http://schemas.microsoft.com/office/drawing/2016/5/9/chartex" xmlns:cx4="http://schemas.microsoft.com/office/drawing/2016/5/10/chartex" xmlns:cx5="http://schemas.microsoft.com/office/drawing/2016/5/11/chartex" xmlns:cx6="http://schemas.microsoft.com/office/drawing/2016/5/12/chartex" xmlns:cx7="http://schemas.microsoft.com/office/drawing/2016/5/13/chartex" xmlns:cx8="http://schemas.microsoft.com/office/drawing/2016/5/14/chartex" xmlns:mc="http://schemas.openxmlformats.org/markup-compatibility/2006" xmlns:aink="http://schemas.microsoft.com/office/drawing/2016/ink" xmlns:am3d="http://schemas.microsoft.com/office/drawing/2017/model3d" xmlns:o="urn:schemas-microsoft-com:office:office" xmlns:oel="http://schemas.microsoft.com/office/2019/extlst" xmlns:r="http://schemas.openxmlformats.org/officeDocument/2006/relationships" xmlns:m="http://schemas.openxmlformats.org/officeDocument/2006/math" xmlns:v="urn:schemas-microsoft-com:vml" xmlns:wp14="http://schemas.microsoft.com/office/word/2010/wordprocessingDrawing" xmlns:wp="http://schemas.openxmlformats.org/drawingml/2006/wordprocessingDrawing" xmlns:w10="urn:schemas-microsoft-com:office:word" xmlns:w="http://schemas.openxmlformats.org/wordprocessingml/2006/main" xmlns:w14="http://schemas.microsoft.com/office/word/2010/wordml" xmlns:w15="http://schemas.microsoft.com/office/word/2012/wordml" xmlns:w16cex="http://schemas.microsoft.com/office/word/2018/wordml/cex" xmlns:w16cid="http://schemas.microsoft.com/office/word/2016/wordml/cid" xmlns:w16="http://schemas.microsoft.com/office/word/2018/wordml" xmlns:w16du="http://schemas.microsoft.com/office/word/2023/wordml/word16du" xmlns:w16sdtdh="http://schemas.microsoft.com/office/word/2020/wordml/sdtdatahash" xmlns:w16sdtfl="http://schemas.microsoft.com/office/word/2024/wordml/sdtformatlock" xmlns:w16se="http://schemas.microsoft.com/office/word/2015/wordml/symex" xmlns:wpg="http://schemas.microsoft.com/office/word/2010/wordprocessingGroup" xmlns:wpi="http://schemas.microsoft.com/office/word/2010/wordprocessingInk" xmlns:wne="http://schemas.microsoft.com/office/word/2006/wordml" xmlns:wps="http://schemas.microsoft.com/office/word/2010/wordprocessingShape" mc:Ignorable="w14 w15 w16se w16cid w16 w16cex w16sdtdh w16sdtfl w16du wp14">
+<w:ftr xmlns:wpc="http://schemas.microsoft.com/office/word/2010/wordprocessingCanvas" xmlns:cx="http://schemas.microsoft.com/office/drawing/2014/chartex" xmlns:cx1="http://schemas.microsoft.com/office/drawing/2015/9/8/chartex" xmlns:cx2="http://schemas.microsoft.com/office/drawing/2015/10/21/chartex" xmlns:cx3="http://schemas.microsoft.com/office/drawing/2016/5/9/chartex" xmlns:cx4="http://schemas.microsoft.com/office/drawing/2016/5/10/chartex" xmlns:cx5="http://schemas.microsoft.com/office/drawing/2016/5/11/chartex" xmlns:cx6="http://schemas.microsoft.com/office/drawing/2016/5/12/chartex" xmlns:cx7="http://schemas.microsoft.com/office/drawing/2016/5/13/chartex" xmlns:cx8="http://schemas.microsoft.com/office/drawing/2016/5/14/chartex" xmlns:mc="http://schemas.openxmlformats.org/markup-compatibility/2006" xmlns:m="http://schemas.openxmlformats.org/officeDocument/2006/math" xmlns:aink="http://schemas.microsoft.com/office/drawing/2016/ink" xmlns:am3d="http://schemas.microsoft.com/office/drawing/2017/model3d" xmlns:oel="http://schemas.microsoft.com/office/2019/extlst" xmlns:r="http://schemas.openxmlformats.org/officeDocument/2006/relationships" xmlns:wp14="http://schemas.microsoft.com/office/word/2010/wordprocessingDrawing" xmlns:wp="http://schemas.openxmlformats.org/drawingml/2006/wordprocessingDrawing" xmlns:wpg="http://schemas.microsoft.com/office/word/2010/wordprocessingGroup" xmlns:wpi="http://schemas.microsoft.com/office/word/2010/wordprocessingInk" xmlns:wps="http://schemas.microsoft.com/office/word/2010/wordprocessingShape" xmlns:o="urn:schemas-microsoft-com:office:office" xmlns:v="urn:schemas-microsoft-com:vml" xmlns:w10="urn:schemas-microsoft-com:office:word" xmlns:w="http://schemas.openxmlformats.org/wordprocessingml/2006/main" xmlns:w14="http://schemas.microsoft.com/office/word/2010/wordml" xmlns:w15="http://schemas.microsoft.com/office/word/2012/wordml" xmlns:w16cei="http://schemas.microsoft.com/office/word/2026/wordml/cei" xmlns:w16cex="http://schemas.microsoft.com/office/word/2018/wordml/cex" xmlns:w16cid="http://schemas.microsoft.com/office/word/2016/wordml/cid" xmlns:w16="http://schemas.microsoft.com/office/word/2018/wordml" xmlns:w16sdtdh="http://schemas.microsoft.com/office/word/2020/wordml/sdtdatahash" xmlns:w16sdtfl="http://schemas.microsoft.com/office/word/2024/wordml/sdtformatlock" xmlns:w16se="http://schemas.microsoft.com/office/word/2015/wordml/symex" xmlns:w16du="http://schemas.microsoft.com/office/word/2023/wordml/word16du" xmlns:wne="http://schemas.microsoft.com/office/word/2006/wordml" mc:Ignorable="w14 w15 w16se w16cid w16 w16cex w16sdtdh w16sdtfl w16du wp14">
   <w:p>
     <w:pPr>
       <w:pStyle w:val="Footer"/>
@@ -3182,7 +5065,6 @@
               <v:path gradientshapeok="t" o:connecttype="rect"/>
             </v:shapetype>
             <v:shape id="Text Box 1" o:spid="_x0000_s1028" type="#_x0000_t202" alt="Cisco Confidential" style="position:absolute;margin-left:32.95pt;margin-top:0;width:84.15pt;height:24.75pt;z-index:251658240;visibility:visible;mso-wrap-style:none;mso-wrap-distance-left:0;mso-wrap-distance-top:0;mso-wrap-distance-right:0;mso-wrap-distance-bottom:0;mso-position-horizontal:right;mso-position-horizontal-relative:page;mso-position-vertical:bottom;mso-position-vertical-relative:page;v-text-anchor:bottom" o:gfxdata="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" filled="f" stroked="f">
-              <v:fill o:detectmouseclick="t"/>
               <v:textbox style="mso-fit-shape-to-text:t" inset="0,0,20pt,15pt">
                 <w:txbxContent>
                   <w:p>
@@ -3219,7 +5101,7 @@
 </file>
 
 <file path=word/footnotes.xml><?xml version="1.0" encoding="utf-8"?>
-<w:footnotes xmlns:wpc="http://schemas.microsoft.com/office/word/2010/wordprocessingCanvas" xmlns:cx="http://schemas.microsoft.com/office/drawing/2014/chartex" xmlns:cx1="http://schemas.microsoft.com/office/drawing/2015/9/8/chartex" xmlns:cx2="http://schemas.microsoft.com/office/drawing/2015/10/21/chartex" xmlns:cx3="http://schemas.microsoft.com/office/drawing/2016/5/9/chartex" xmlns:cx4="http://schemas.microsoft.com/office/drawing/2016/5/10/chartex" xmlns:cx5="http://schemas.microsoft.com/office/drawing/2016/5/11/chartex" xmlns:cx6="http://schemas.microsoft.com/office/drawing/2016/5/12/chartex" xmlns:cx7="http://schemas.microsoft.com/office/drawing/2016/5/13/chartex" xmlns:cx8="http://schemas.microsoft.com/office/drawing/2016/5/14/chartex" xmlns:mc="http://schemas.openxmlformats.org/markup-compatibility/2006" xmlns:aink="http://schemas.microsoft.com/office/drawing/2016/ink" xmlns:am3d="http://schemas.microsoft.com/office/drawing/2017/model3d" xmlns:o="urn:schemas-microsoft-com:office:office" xmlns:oel="http://schemas.microsoft.com/office/2019/extlst" xmlns:r="http://schemas.openxmlformats.org/officeDocument/2006/relationships" xmlns:m="http://schemas.openxmlformats.org/officeDocument/2006/math" xmlns:v="urn:schemas-microsoft-com:vml" xmlns:wp14="http://schemas.microsoft.com/office/word/2010/wordprocessingDrawing" xmlns:wp="http://schemas.openxmlformats.org/drawingml/2006/wordprocessingDrawing" xmlns:w10="urn:schemas-microsoft-com:office:word" xmlns:w="http://schemas.openxmlformats.org/wordprocessingml/2006/main" xmlns:w14="http://schemas.microsoft.com/office/word/2010/wordml" xmlns:w15="http://schemas.microsoft.com/office/word/2012/wordml" xmlns:w16cex="http://schemas.microsoft.com/office/word/2018/wordml/cex" xmlns:w16cid="http://schemas.microsoft.com/office/word/2016/wordml/cid" xmlns:w16="http://schemas.microsoft.com/office/word/2018/wordml" xmlns:w16du="http://schemas.microsoft.com/office/word/2023/wordml/word16du" xmlns:w16sdtdh="http://schemas.microsoft.com/office/word/2020/wordml/sdtdatahash" xmlns:w16sdtfl="http://schemas.microsoft.com/office/word/2024/wordml/sdtformatlock" xmlns:w16se="http://schemas.microsoft.com/office/word/2015/wordml/symex" xmlns:wpg="http://schemas.microsoft.com/office/word/2010/wordprocessingGroup" xmlns:wpi="http://schemas.microsoft.com/office/word/2010/wordprocessingInk" xmlns:wne="http://schemas.microsoft.com/office/word/2006/wordml" xmlns:wps="http://schemas.microsoft.com/office/word/2010/wordprocessingShape" mc:Ignorable="w14 w15 w16se w16cid w16 w16cex w16sdtdh w16sdtfl w16du wp14">
+<w:footnotes xmlns:wpc="http://schemas.microsoft.com/office/word/2010/wordprocessingCanvas" xmlns:cx="http://schemas.microsoft.com/office/drawing/2014/chartex" xmlns:cx1="http://schemas.microsoft.com/office/drawing/2015/9/8/chartex" xmlns:cx2="http://schemas.microsoft.com/office/drawing/2015/10/21/chartex" xmlns:cx3="http://schemas.microsoft.com/office/drawing/2016/5/9/chartex" xmlns:cx4="http://schemas.microsoft.com/office/drawing/2016/5/10/chartex" xmlns:cx5="http://schemas.microsoft.com/office/drawing/2016/5/11/chartex" xmlns:cx6="http://schemas.microsoft.com/office/drawing/2016/5/12/chartex" xmlns:cx7="http://schemas.microsoft.com/office/drawing/2016/5/13/chartex" xmlns:cx8="http://schemas.microsoft.com/office/drawing/2016/5/14/chartex" xmlns:mc="http://schemas.openxmlformats.org/markup-compatibility/2006" xmlns:m="http://schemas.openxmlformats.org/officeDocument/2006/math" xmlns:aink="http://schemas.microsoft.com/office/drawing/2016/ink" xmlns:am3d="http://schemas.microsoft.com/office/drawing/2017/model3d" xmlns:oel="http://schemas.microsoft.com/office/2019/extlst" xmlns:r="http://schemas.openxmlformats.org/officeDocument/2006/relationships" xmlns:wp14="http://schemas.microsoft.com/office/word/2010/wordprocessingDrawing" xmlns:wp="http://schemas.openxmlformats.org/drawingml/2006/wordprocessingDrawing" xmlns:wpg="http://schemas.microsoft.com/office/word/2010/wordprocessingGroup" xmlns:wpi="http://schemas.microsoft.com/office/word/2010/wordprocessingInk" xmlns:wps="http://schemas.microsoft.com/office/word/2010/wordprocessingShape" xmlns:o="urn:schemas-microsoft-com:office:office" xmlns:v="urn:schemas-microsoft-com:vml" xmlns:w10="urn:schemas-microsoft-com:office:word" xmlns:w="http://schemas.openxmlformats.org/wordprocessingml/2006/main" xmlns:w14="http://schemas.microsoft.com/office/word/2010/wordml" xmlns:w15="http://schemas.microsoft.com/office/word/2012/wordml" xmlns:w16cei="http://schemas.microsoft.com/office/word/2026/wordml/cei" xmlns:w16cex="http://schemas.microsoft.com/office/word/2018/wordml/cex" xmlns:w16cid="http://schemas.microsoft.com/office/word/2016/wordml/cid" xmlns:w16="http://schemas.microsoft.com/office/word/2018/wordml" xmlns:w16sdtdh="http://schemas.microsoft.com/office/word/2020/wordml/sdtdatahash" xmlns:w16sdtfl="http://schemas.microsoft.com/office/word/2024/wordml/sdtformatlock" xmlns:w16se="http://schemas.microsoft.com/office/word/2015/wordml/symex" xmlns:w16du="http://schemas.microsoft.com/office/word/2023/wordml/word16du" xmlns:wne="http://schemas.microsoft.com/office/word/2006/wordml" mc:Ignorable="w14 w15 w16se w16cid w16 w16cex w16sdtdh w16sdtfl w16du wp14">
   <w:footnote w:type="separator" w:id="-1">
     <w:p>
       <w:r>
@@ -3238,7 +5120,7 @@
 </file>
 
 <file path=word/styles.xml><?xml version="1.0" encoding="utf-8"?>
-<w:styles xmlns:mc="http://schemas.openxmlformats.org/markup-compatibility/2006" xmlns:r="http://schemas.openxmlformats.org/officeDocument/2006/relationships" xmlns:w="http://schemas.openxmlformats.org/wordprocessingml/2006/main" xmlns:w14="http://schemas.microsoft.com/office/word/2010/wordml" xmlns:w15="http://schemas.microsoft.com/office/word/2012/wordml" xmlns:w16cex="http://schemas.microsoft.com/office/word/2018/wordml/cex" xmlns:w16cid="http://schemas.microsoft.com/office/word/2016/wordml/cid" xmlns:w16="http://schemas.microsoft.com/office/word/2018/wordml" xmlns:w16du="http://schemas.microsoft.com/office/word/2023/wordml/word16du" xmlns:w16sdtdh="http://schemas.microsoft.com/office/word/2020/wordml/sdtdatahash" xmlns:w16sdtfl="http://schemas.microsoft.com/office/word/2024/wordml/sdtformatlock" xmlns:w16se="http://schemas.microsoft.com/office/word/2015/wordml/symex" mc:Ignorable="w14 w15 w16se w16cid w16 w16cex w16sdtdh w16sdtfl w16du">
+<w:styles xmlns:mc="http://schemas.openxmlformats.org/markup-compatibility/2006" xmlns:r="http://schemas.openxmlformats.org/officeDocument/2006/relationships" xmlns:w="http://schemas.openxmlformats.org/wordprocessingml/2006/main" xmlns:w14="http://schemas.microsoft.com/office/word/2010/wordml" xmlns:w15="http://schemas.microsoft.com/office/word/2012/wordml" xmlns:w16cex="http://schemas.microsoft.com/office/word/2018/wordml/cex" xmlns:w16cid="http://schemas.microsoft.com/office/word/2016/wordml/cid" xmlns:w16="http://schemas.microsoft.com/office/word/2018/wordml" xmlns:w16sdtdh="http://schemas.microsoft.com/office/word/2020/wordml/sdtdatahash" xmlns:w16sdtfl="http://schemas.microsoft.com/office/word/2024/wordml/sdtformatlock" xmlns:w16se="http://schemas.microsoft.com/office/word/2015/wordml/symex" xmlns:w16du="http://schemas.microsoft.com/office/word/2023/wordml/word16du" mc:Ignorable="w14 w15 w16se w16cid w16 w16cex w16sdtdh w16sdtfl w16du">
   <w:docDefaults>
     <w:rPrDefault>
       <w:rPr>
@@ -3832,7 +5714,6 @@
   <w:style w:type="character" w:default="1" w:styleId="DefaultParagraphFont">
     <w:name w:val="Default Paragraph Font"/>
     <w:uiPriority w:val="1"/>
-    <w:semiHidden/>
     <w:unhideWhenUsed/>
   </w:style>
   <w:style w:type="table" w:default="1" w:styleId="TableNormal">
@@ -4184,6 +6065,35 @@
       <w:iCs/>
     </w:rPr>
   </w:style>
+  <w:style w:type="table" w:styleId="TableGrid">
+    <w:name w:val="Table Grid"/>
+    <w:basedOn w:val="TableNormal"/>
+    <w:uiPriority w:val="39"/>
+    <w:rsid w:val="00B20EF0"/>
+    <w:tblPr>
+      <w:tblBorders>
+        <w:top w:val="single" w:sz="4" w:space="0" w:color="auto"/>
+        <w:left w:val="single" w:sz="4" w:space="0" w:color="auto"/>
+        <w:bottom w:val="single" w:sz="4" w:space="0" w:color="auto"/>
+        <w:right w:val="single" w:sz="4" w:space="0" w:color="auto"/>
+        <w:insideH w:val="single" w:sz="4" w:space="0" w:color="auto"/>
+        <w:insideV w:val="single" w:sz="4" w:space="0" w:color="auto"/>
+      </w:tblBorders>
+    </w:tblPr>
+  </w:style>
+  <w:style w:type="character" w:styleId="HTMLCode">
+    <w:name w:val="HTML Code"/>
+    <w:basedOn w:val="DefaultParagraphFont"/>
+    <w:uiPriority w:val="99"/>
+    <w:semiHidden/>
+    <w:unhideWhenUsed/>
+    <w:rsid w:val="00B20EF0"/>
+    <w:rPr>
+      <w:rFonts w:ascii="Courier New" w:eastAsia="Times New Roman" w:hAnsi="Courier New" w:cs="Courier New"/>
+      <w:sz w:val="20"/>
+      <w:szCs w:val="20"/>
+    </w:rPr>
+  </w:style>
 </w:styles>
 </file>
 

</xml_diff>

<commit_message>
module3: walk each CML lab and print its nodes
</commit_message>
<xml_diff>
--- a/Blog/Network Automation Blog.docx
+++ b/Blog/Network Automation Blog.docx
@@ -1,6 +1,6 @@
 
 <file path=word/document.xml><?xml version="1.0" encoding="utf-8"?>
-<w:document xmlns:wpc="http://schemas.microsoft.com/office/word/2010/wordprocessingCanvas" xmlns:cx="http://schemas.microsoft.com/office/drawing/2014/chartex" xmlns:cx1="http://schemas.microsoft.com/office/drawing/2015/9/8/chartex" xmlns:cx2="http://schemas.microsoft.com/office/drawing/2015/10/21/chartex" xmlns:cx3="http://schemas.microsoft.com/office/drawing/2016/5/9/chartex" xmlns:cx4="http://schemas.microsoft.com/office/drawing/2016/5/10/chartex" xmlns:cx5="http://schemas.microsoft.com/office/drawing/2016/5/11/chartex" xmlns:cx6="http://schemas.microsoft.com/office/drawing/2016/5/12/chartex" xmlns:cx7="http://schemas.microsoft.com/office/drawing/2016/5/13/chartex" xmlns:cx8="http://schemas.microsoft.com/office/drawing/2016/5/14/chartex" xmlns:mc="http://schemas.openxmlformats.org/markup-compatibility/2006" xmlns:m="http://schemas.openxmlformats.org/officeDocument/2006/math" xmlns:aink="http://schemas.microsoft.com/office/drawing/2016/ink" xmlns:am3d="http://schemas.microsoft.com/office/drawing/2017/model3d" xmlns:oel="http://schemas.microsoft.com/office/2019/extlst" xmlns:r="http://schemas.openxmlformats.org/officeDocument/2006/relationships" xmlns:wp14="http://schemas.microsoft.com/office/word/2010/wordprocessingDrawing" xmlns:wp="http://schemas.openxmlformats.org/drawingml/2006/wordprocessingDrawing" xmlns:wpg="http://schemas.microsoft.com/office/word/2010/wordprocessingGroup" xmlns:wpi="http://schemas.microsoft.com/office/word/2010/wordprocessingInk" xmlns:wps="http://schemas.microsoft.com/office/word/2010/wordprocessingShape" xmlns:o="urn:schemas-microsoft-com:office:office" xmlns:v="urn:schemas-microsoft-com:vml" xmlns:w10="urn:schemas-microsoft-com:office:word" xmlns:w="http://schemas.openxmlformats.org/wordprocessingml/2006/main" xmlns:w14="http://schemas.microsoft.com/office/word/2010/wordml" xmlns:w15="http://schemas.microsoft.com/office/word/2012/wordml" xmlns:w16cei="http://schemas.microsoft.com/office/word/2026/wordml/cei" xmlns:w16cex="http://schemas.microsoft.com/office/word/2018/wordml/cex" xmlns:w16cid="http://schemas.microsoft.com/office/word/2016/wordml/cid" xmlns:w16="http://schemas.microsoft.com/office/word/2018/wordml" xmlns:w16sdtdh="http://schemas.microsoft.com/office/word/2020/wordml/sdtdatahash" xmlns:w16sdtfl="http://schemas.microsoft.com/office/word/2024/wordml/sdtformatlock" xmlns:w16se="http://schemas.microsoft.com/office/word/2015/wordml/symex" xmlns:w16du="http://schemas.microsoft.com/office/word/2023/wordml/word16du" xmlns:wne="http://schemas.microsoft.com/office/word/2006/wordml" mc:Ignorable="w14 w15 w16se w16cid w16 w16cex w16sdtdh w16sdtfl w16du wp14">
+<w:document xmlns:wpc="http://schemas.microsoft.com/office/word/2010/wordprocessingCanvas" xmlns:cx="http://schemas.microsoft.com/office/drawing/2014/chartex" xmlns:cx1="http://schemas.microsoft.com/office/drawing/2015/9/8/chartex" xmlns:cx2="http://schemas.microsoft.com/office/drawing/2015/10/21/chartex" xmlns:cx3="http://schemas.microsoft.com/office/drawing/2016/5/9/chartex" xmlns:cx4="http://schemas.microsoft.com/office/drawing/2016/5/10/chartex" xmlns:cx5="http://schemas.microsoft.com/office/drawing/2016/5/11/chartex" xmlns:cx6="http://schemas.microsoft.com/office/drawing/2016/5/12/chartex" xmlns:cx7="http://schemas.microsoft.com/office/drawing/2016/5/13/chartex" xmlns:cx8="http://schemas.microsoft.com/office/drawing/2016/5/14/chartex" xmlns:mc="http://schemas.openxmlformats.org/markup-compatibility/2006" xmlns:m="http://schemas.openxmlformats.org/officeDocument/2006/math" xmlns:aink="http://schemas.microsoft.com/office/drawing/2016/ink" xmlns:am3d="http://schemas.microsoft.com/office/drawing/2017/model3d" xmlns:oel="http://schemas.microsoft.com/office/2019/extlst" xmlns:r="http://schemas.openxmlformats.org/officeDocument/2006/relationships" xmlns:wp14="http://schemas.microsoft.com/office/word/2010/wordprocessingDrawing" xmlns:wp="http://schemas.openxmlformats.org/drawingml/2006/wordprocessingDrawing" xmlns:wpg="http://schemas.microsoft.com/office/word/2010/wordprocessingGroup" xmlns:wpi="http://schemas.microsoft.com/office/word/2010/wordprocessingInk" xmlns:wps="http://schemas.microsoft.com/office/word/2010/wordprocessingShape" xmlns:o="urn:schemas-microsoft-com:office:office" xmlns:v="urn:schemas-microsoft-com:vml" xmlns:w10="urn:schemas-microsoft-com:office:word" xmlns:w="http://schemas.openxmlformats.org/wordprocessingml/2006/main" xmlns:w14="http://schemas.microsoft.com/office/word/2010/wordml" xmlns:w15="http://schemas.microsoft.com/office/word/2012/wordml" xmlns:w16cex="http://schemas.microsoft.com/office/word/2018/wordml/cex" xmlns:w16cid="http://schemas.microsoft.com/office/word/2016/wordml/cid" xmlns:w16="http://schemas.microsoft.com/office/word/2018/wordml" xmlns:w16sdtdh="http://schemas.microsoft.com/office/word/2020/wordml/sdtdatahash" xmlns:w16sdtfl="http://schemas.microsoft.com/office/word/2024/wordml/sdtformatlock" xmlns:w16se="http://schemas.microsoft.com/office/word/2015/wordml/symex" xmlns:w16du="http://schemas.microsoft.com/office/word/2023/wordml/word16du" xmlns:wne="http://schemas.microsoft.com/office/word/2006/wordml" mc:Ignorable="w14 w15 w16se w16cid w16 w16cex w16sdtdh w16sdtfl w16du wp14">
   <w:body>
     <w:p>
       <w:r>
@@ -28,18 +28,25 @@
         <w:t xml:space="preserve"> </w:t>
       </w:r>
       <w:proofErr w:type="spellStart"/>
+      <w:proofErr w:type="gramStart"/>
       <w:r>
         <w:t>logging.basicConfig</w:t>
       </w:r>
       <w:proofErr w:type="spellEnd"/>
-      <w:r>
-        <w:t>(level=</w:t>
+      <w:proofErr w:type="gramEnd"/>
+      <w:r>
+        <w:t>(</w:t>
+      </w:r>
+      <w:proofErr w:type="gramStart"/>
+      <w:r>
+        <w:t>level=</w:t>
       </w:r>
       <w:proofErr w:type="spellStart"/>
       <w:r>
         <w:t>logging.INFO,format</w:t>
       </w:r>
       <w:proofErr w:type="spellEnd"/>
+      <w:proofErr w:type="gramEnd"/>
       <w:r>
         <w:t>="%(</w:t>
       </w:r>
@@ -104,10 +111,12 @@
         <w:t xml:space="preserve">logger = </w:t>
       </w:r>
       <w:proofErr w:type="spellStart"/>
+      <w:proofErr w:type="gramStart"/>
       <w:r>
         <w:t>logging.getLogger</w:t>
       </w:r>
       <w:proofErr w:type="spellEnd"/>
+      <w:proofErr w:type="gramEnd"/>
       <w:r>
         <w:t>(__name__) #just grab a logger to talk to, not configured anything yet</w:t>
       </w:r>
@@ -1289,10 +1298,12 @@
         <w:t xml:space="preserve">: </w:t>
       </w:r>
       <w:proofErr w:type="spellStart"/>
+      <w:proofErr w:type="gramStart"/>
       <w:r>
         <w:t>logger.error</w:t>
       </w:r>
       <w:proofErr w:type="spellEnd"/>
+      <w:proofErr w:type="gramEnd"/>
       <w:r>
         <w:t>(</w:t>
       </w:r>
@@ -1302,22 +1313,37 @@
       </w:r>
       <w:proofErr w:type="spellEnd"/>
       <w:r>
-        <w:t xml:space="preserve"> to open '{filename}' : {e}")</w:t>
+        <w:t xml:space="preserve"> to open '{filename}</w:t>
+      </w:r>
+      <w:proofErr w:type="gramStart"/>
+      <w:r>
+        <w:t>' :</w:t>
+      </w:r>
+      <w:proofErr w:type="gramEnd"/>
+      <w:r>
+        <w:t xml:space="preserve"> {e}")</w:t>
       </w:r>
     </w:p>
     <w:p/>
     <w:p>
-      <w:r>
-        <w:t xml:space="preserve">interesting lazy formatting: </w:t>
+      <w:proofErr w:type="gramStart"/>
+      <w:r>
+        <w:t>interesting lazy</w:t>
+      </w:r>
+      <w:proofErr w:type="gramEnd"/>
+      <w:r>
+        <w:t xml:space="preserve"> formatting: </w:t>
       </w:r>
       <w:r>
         <w:t xml:space="preserve"> </w:t>
       </w:r>
       <w:proofErr w:type="spellStart"/>
+      <w:proofErr w:type="gramStart"/>
       <w:r>
         <w:t>logger.debug</w:t>
       </w:r>
       <w:proofErr w:type="spellEnd"/>
+      <w:proofErr w:type="gramEnd"/>
       <w:r>
         <w:t xml:space="preserve">(" file %s with hostname %s has %s interfaces and %d OSPF networks", filename, hostname, </w:t>
       </w:r>
@@ -2192,8 +2218,13 @@
         <w:t>@</w:t>
       </w:r>
       <w:proofErr w:type="spellStart"/>
-      <w:r>
-        <w:t>pytest.mark.parametrize</w:t>
+      <w:proofErr w:type="gramStart"/>
+      <w:r>
+        <w:t>pytest.mark</w:t>
+      </w:r>
+      <w:proofErr w:type="gramEnd"/>
+      <w:r>
+        <w:t>.parametrize</w:t>
       </w:r>
       <w:proofErr w:type="spellEnd"/>
       <w:r>
@@ -2259,7 +2290,15 @@
       </w:r>
       <w:proofErr w:type="spellEnd"/>
       <w:r>
-        <w:t xml:space="preserve"> gives you a brand-new, empty temporary directory — unique to that one test, and automatically deleted afterward.</w:t>
+        <w:t xml:space="preserve"> gives you a brand-new, empty temporary directory — unique to that one </w:t>
+      </w:r>
+      <w:proofErr w:type="gramStart"/>
+      <w:r>
+        <w:t>test, and</w:t>
+      </w:r>
+      <w:proofErr w:type="gramEnd"/>
+      <w:r>
+        <w:t xml:space="preserve"> automatically deleted afterward.</w:t>
       </w:r>
     </w:p>
     <w:p/>
@@ -2299,7 +2338,15 @@
     <w:p/>
     <w:p>
       <w:r>
-        <w:t>break does not act on if statements at all. if is not a loop, so there's nothing to "break out of." break only ever targets the nearest enclosing loop — here that's the for j loop</w:t>
+        <w:t xml:space="preserve">break does not act on if statements at all. if is not a loop, so there's nothing to "break out of." break only ever targets the nearest enclosing loop — here that's the </w:t>
+      </w:r>
+      <w:proofErr w:type="gramStart"/>
+      <w:r>
+        <w:t>for j</w:t>
+      </w:r>
+      <w:proofErr w:type="gramEnd"/>
+      <w:r>
+        <w:t xml:space="preserve"> loop</w:t>
       </w:r>
     </w:p>
     <w:p/>
@@ -2364,7 +2411,29 @@
           <w:szCs w:val="22"/>
           <w:shd w:val="clear" w:color="auto" w:fill="181818"/>
         </w:rPr>
-        <w:t>catch the narrowest exception you can actually act on; let everything else propagate.</w:t>
+        <w:t xml:space="preserve">catch the narrowest exception you can </w:t>
+      </w:r>
+      <w:proofErr w:type="gramStart"/>
+      <w:r>
+        <w:rPr>
+          <w:rStyle w:val="Emphasis"/>
+          <w:rFonts w:ascii="Arial" w:hAnsi="Arial" w:cs="Arial"/>
+          <w:sz w:val="22"/>
+          <w:szCs w:val="22"/>
+          <w:shd w:val="clear" w:color="auto" w:fill="181818"/>
+        </w:rPr>
+        <w:t>actually act</w:t>
+      </w:r>
+      <w:proofErr w:type="gramEnd"/>
+      <w:r>
+        <w:rPr>
+          <w:rStyle w:val="Emphasis"/>
+          <w:rFonts w:ascii="Arial" w:hAnsi="Arial" w:cs="Arial"/>
+          <w:sz w:val="22"/>
+          <w:szCs w:val="22"/>
+          <w:shd w:val="clear" w:color="auto" w:fill="181818"/>
+        </w:rPr>
+        <w:t xml:space="preserve"> on; let everything else propagate.</w:t>
       </w:r>
     </w:p>
     <w:p/>
@@ -2388,7 +2457,15 @@
         <w:t>When</w:t>
       </w:r>
       <w:r>
-        <w:t xml:space="preserve"> you keep passing the same argument into a group of related functions, that's the universe telling you "make a class." Bundle the data (state) with the behavior that acts on it.</w:t>
+        <w:t xml:space="preserve"> you keep passing the same argument into a group of related functions, that's the universe telling </w:t>
+      </w:r>
+      <w:proofErr w:type="gramStart"/>
+      <w:r>
+        <w:t>you</w:t>
+      </w:r>
+      <w:proofErr w:type="gramEnd"/>
+      <w:r>
+        <w:t xml:space="preserve"> "make a class." Bundle the data (state) with the behavior that acts on it.</w:t>
       </w:r>
     </w:p>
     <w:p/>
@@ -2411,7 +2488,15 @@
         <w:t>self</w:t>
       </w:r>
       <w:r>
-        <w:t xml:space="preserve"> — a parameter; it's how the object arrives into the method. Written bare because it is the object.</w:t>
+        <w:t xml:space="preserve"> — a parameter; it's how the object arrives </w:t>
+      </w:r>
+      <w:proofErr w:type="gramStart"/>
+      <w:r>
+        <w:t>into</w:t>
+      </w:r>
+      <w:proofErr w:type="gramEnd"/>
+      <w:r>
+        <w:t xml:space="preserve"> the method. Written bare because it is the object.</w:t>
       </w:r>
     </w:p>
     <w:p>
@@ -2434,7 +2519,15 @@
     <w:p/>
     <w:p>
       <w:r>
-        <w:t xml:space="preserve">Self is handle to the entire object. </w:t>
+        <w:t xml:space="preserve">Self is </w:t>
+      </w:r>
+      <w:proofErr w:type="gramStart"/>
+      <w:r>
+        <w:t>handle</w:t>
+      </w:r>
+      <w:proofErr w:type="gramEnd"/>
+      <w:r>
+        <w:t xml:space="preserve"> to the entire object. </w:t>
       </w:r>
     </w:p>
     <w:p/>
@@ -2494,10 +2587,12 @@
     </w:p>
     <w:p>
       <w:proofErr w:type="spellStart"/>
+      <w:proofErr w:type="gramStart"/>
       <w:r>
         <w:t>a.method</w:t>
       </w:r>
       <w:proofErr w:type="spellEnd"/>
+      <w:proofErr w:type="gramEnd"/>
       <w:r>
         <w:t xml:space="preserve">() = outside the class </w:t>
       </w:r>
@@ -3119,8 +3214,13 @@
       </w:r>
     </w:p>
     <w:p>
-      <w:r>
-        <w:t xml:space="preserve">So before you can save or send an object, you </w:t>
+      <w:proofErr w:type="gramStart"/>
+      <w:r>
+        <w:t>So</w:t>
+      </w:r>
+      <w:proofErr w:type="gramEnd"/>
+      <w:r>
+        <w:t xml:space="preserve"> before you can save or send an object, you </w:t>
       </w:r>
       <w:r>
         <w:rPr>
@@ -3148,15 +3248,31 @@
           <w:b/>
           <w:bCs/>
         </w:rPr>
-        <w:t>to_dict</w:t>
-      </w:r>
-      <w:proofErr w:type="spellEnd"/>
+        <w:t>to_</w:t>
+      </w:r>
+      <w:proofErr w:type="gramStart"/>
       <w:r>
         <w:rPr>
           <w:b/>
           <w:bCs/>
         </w:rPr>
-        <w:t>() is the standard name</w:t>
+        <w:t>dict</w:t>
+      </w:r>
+      <w:proofErr w:type="spellEnd"/>
+      <w:r>
+        <w:rPr>
+          <w:b/>
+          <w:bCs/>
+        </w:rPr>
+        <w:t>(</w:t>
+      </w:r>
+      <w:proofErr w:type="gramEnd"/>
+      <w:r>
+        <w:rPr>
+          <w:b/>
+          <w:bCs/>
+        </w:rPr>
+        <w:t>) is the standard name</w:t>
       </w:r>
       <w:r>
         <w:t xml:space="preserve"> for "serialize me into a dictionary."</w:t>
@@ -3280,7 +3396,15 @@
       </w:r>
       <w:proofErr w:type="spellEnd"/>
       <w:r>
-        <w:t xml:space="preserve"> would be function for that. If there are several functions that all share the same data </w:t>
+        <w:t xml:space="preserve"> would be function for that. If there are several functions that all share the same </w:t>
+      </w:r>
+      <w:proofErr w:type="gramStart"/>
+      <w:r>
+        <w:t>data</w:t>
+      </w:r>
+      <w:proofErr w:type="gramEnd"/>
+      <w:r>
+        <w:t xml:space="preserve"> </w:t>
       </w:r>
       <w:r>
         <w:t>then we need Class. Main</w:t>
@@ -3764,8 +3888,13 @@
       </w:r>
       <w:r>
         <w:br/>
-        <w:t>a         =  3</w:t>
-      </w:r>
+        <w:t xml:space="preserve">a         </w:t>
+      </w:r>
+      <w:proofErr w:type="gramStart"/>
+      <w:r>
+        <w:t>=  3</w:t>
+      </w:r>
+      <w:proofErr w:type="gramEnd"/>
     </w:p>
     <w:p>
       <w:r>
@@ -3843,7 +3972,15 @@
         <w:t xml:space="preserve">. </w:t>
       </w:r>
       <w:r>
-        <w:t xml:space="preserve">So: dict = </w:t>
+        <w:t xml:space="preserve">So: </w:t>
+      </w:r>
+      <w:proofErr w:type="spellStart"/>
+      <w:r>
+        <w:t>dict</w:t>
+      </w:r>
+      <w:proofErr w:type="spellEnd"/>
+      <w:r>
+        <w:t xml:space="preserve"> = </w:t>
       </w:r>
       <w:proofErr w:type="spellStart"/>
       <w:r>
@@ -3887,7 +4024,15 @@
         </w:rPr>
       </w:pPr>
       <w:r>
-        <w:t xml:space="preserve">if an object's contents could change, its hash would change, and it'd be filed in the wrong bucket → lookups break. So Python only allows immutable things to be </w:t>
+        <w:t xml:space="preserve">if an object's contents could change, its hash would change, and it'd be filed in the wrong bucket → lookups break. </w:t>
+      </w:r>
+      <w:proofErr w:type="gramStart"/>
+      <w:r>
+        <w:t>So</w:t>
+      </w:r>
+      <w:proofErr w:type="gramEnd"/>
+      <w:r>
+        <w:t xml:space="preserve"> Python only allows immutable things to be </w:t>
       </w:r>
       <w:proofErr w:type="spellStart"/>
       <w:r>
@@ -3895,10 +4040,18 @@
       </w:r>
       <w:proofErr w:type="spellEnd"/>
       <w:r>
-        <w:t>. Strings, numbers, tuples</w:t>
-      </w:r>
-      <w:r>
-        <w:t>()</w:t>
+        <w:t xml:space="preserve">. Strings, numbers, </w:t>
+      </w:r>
+      <w:proofErr w:type="gramStart"/>
+      <w:r>
+        <w:t>tuples</w:t>
+      </w:r>
+      <w:r>
+        <w:t>(</w:t>
+      </w:r>
+      <w:proofErr w:type="gramEnd"/>
+      <w:r>
+        <w:t>)</w:t>
       </w:r>
       <w:r>
         <w:t xml:space="preserve"> = immutable = </w:t>
@@ -3918,21 +4071,34 @@
         <w:t>✅</w:t>
       </w:r>
       <w:r>
-        <w:t>. Lists</w:t>
-      </w:r>
-      <w:r>
-        <w:t>[]</w:t>
+        <w:t xml:space="preserve">. </w:t>
+      </w:r>
+      <w:proofErr w:type="gramStart"/>
+      <w:r>
+        <w:t>Lists</w:t>
+      </w:r>
+      <w:r>
+        <w:t>[</w:t>
+      </w:r>
+      <w:proofErr w:type="gramEnd"/>
+      <w:r>
+        <w:t>]</w:t>
       </w:r>
       <w:r>
         <w:t xml:space="preserve">, </w:t>
       </w:r>
       <w:proofErr w:type="spellStart"/>
+      <w:proofErr w:type="gramStart"/>
       <w:r>
         <w:t>dicts</w:t>
       </w:r>
       <w:proofErr w:type="spellEnd"/>
       <w:r>
-        <w:t>{}</w:t>
+        <w:t>{</w:t>
+      </w:r>
+      <w:proofErr w:type="gramEnd"/>
+      <w:r>
+        <w:t>}</w:t>
       </w:r>
       <w:r>
         <w:t xml:space="preserve"> = mutable = </w:t>
@@ -4237,7 +4403,7 @@
         <w:tblLook w:val="04A0" w:firstRow="1" w:lastRow="0" w:firstColumn="1" w:lastColumn="0" w:noHBand="0" w:noVBand="1"/>
       </w:tblPr>
       <w:tblGrid>
-        <w:gridCol w:w="4179"/>
+        <w:gridCol w:w="4184"/>
         <w:gridCol w:w="3646"/>
       </w:tblGrid>
       <w:tr>
@@ -4684,6 +4850,725 @@
         </w:rPr>
       </w:pPr>
     </w:p>
+    <w:p>
+      <w:pPr>
+        <w:rPr>
+          <w:b/>
+          <w:bCs/>
+        </w:rPr>
+      </w:pPr>
+    </w:p>
+    <w:p>
+      <w:pPr>
+        <w:rPr>
+          <w:b/>
+          <w:bCs/>
+        </w:rPr>
+      </w:pPr>
+      <w:r>
+        <w:rPr>
+          <w:b/>
+          <w:bCs/>
+        </w:rPr>
+        <w:t xml:space="preserve">REST just </w:t>
+      </w:r>
+      <w:proofErr w:type="gramStart"/>
+      <w:r>
+        <w:rPr>
+          <w:b/>
+          <w:bCs/>
+        </w:rPr>
+        <w:t>means:</w:t>
+      </w:r>
+      <w:proofErr w:type="gramEnd"/>
+      <w:r>
+        <w:rPr>
+          <w:b/>
+          <w:bCs/>
+        </w:rPr>
+        <w:t xml:space="preserve"> resources have addresses (URLs), and you use verbs on them (GET to read, POST to create or log in, PUT/PATCH to change, DELETE to remove).</w:t>
+      </w:r>
+    </w:p>
+    <w:p>
+      <w:pPr>
+        <w:rPr>
+          <w:b/>
+          <w:bCs/>
+        </w:rPr>
+      </w:pPr>
+    </w:p>
+    <w:p>
+      <w:r>
+        <w:t>A REST API is the device (or controller, or cloud) exposing a **machine</w:t>
+      </w:r>
+    </w:p>
+    <w:p>
+      <w:r>
+        <w:t>door** for the same question:</w:t>
+      </w:r>
+    </w:p>
+    <w:p/>
+    <w:p/>
+    <w:p>
+      <w:r>
+        <w:t xml:space="preserve">your </w:t>
+      </w:r>
+      <w:proofErr w:type="gramStart"/>
+      <w:r>
+        <w:t>Python  --</w:t>
+      </w:r>
+      <w:proofErr w:type="gramEnd"/>
+      <w:r>
+        <w:t>HTTP--</w:t>
+      </w:r>
+      <w:proofErr w:type="gramStart"/>
+      <w:r>
+        <w:t>&gt;  API</w:t>
+      </w:r>
+      <w:proofErr w:type="gramEnd"/>
+      <w:r>
+        <w:t xml:space="preserve">  --JSON--</w:t>
+      </w:r>
+      <w:proofErr w:type="gramStart"/>
+      <w:r>
+        <w:t>&gt;  your</w:t>
+      </w:r>
+      <w:proofErr w:type="gramEnd"/>
+      <w:r>
+        <w:t xml:space="preserve"> script</w:t>
+      </w:r>
+    </w:p>
+    <w:p/>
+    <w:p/>
+    <w:p>
+      <w:r>
+        <w:t>You still "ask for interface data." You just send an HTTP request to a URL</w:t>
+      </w:r>
+    </w:p>
+    <w:p>
+      <w:r>
+        <w:t>instead of typing a CLI command, and you get **JSON** (structured data) instead</w:t>
+      </w:r>
+    </w:p>
+    <w:p>
+      <w:r>
+        <w:t>of a paragraph of text.</w:t>
+      </w:r>
+    </w:p>
+    <w:p/>
+    <w:p>
+      <w:r>
+        <w:t>SSH scrapes a human interface; REST consumes a machine</w:t>
+      </w:r>
+    </w:p>
+    <w:p>
+      <w:r>
+        <w:t>interface.</w:t>
+      </w:r>
+    </w:p>
+    <w:p/>
+    <w:p>
+      <w:r>
+        <w:t>Quick test for sorting: is it a thing the object has (noun → state) or a thing the object does (verb → method)? "token" is a thing it has; "login" is a thing it does.</w:t>
+      </w:r>
+      <w:r>
+        <w:br/>
+      </w:r>
+      <w:r>
+        <w:br/>
+      </w:r>
+    </w:p>
+    <w:tbl>
+      <w:tblPr>
+        <w:tblW w:w="0" w:type="auto"/>
+        <w:tblCellMar>
+          <w:top w:w="15" w:type="dxa"/>
+          <w:left w:w="15" w:type="dxa"/>
+          <w:bottom w:w="15" w:type="dxa"/>
+          <w:right w:w="15" w:type="dxa"/>
+        </w:tblCellMar>
+        <w:tblLook w:val="04A0" w:firstRow="1" w:lastRow="0" w:firstColumn="1" w:lastColumn="0" w:noHBand="0" w:noVBand="1"/>
+      </w:tblPr>
+      <w:tblGrid>
+        <w:gridCol w:w="1132"/>
+        <w:gridCol w:w="3311"/>
+        <w:gridCol w:w="4577"/>
+      </w:tblGrid>
+      <w:tr>
+        <w:trPr>
+          <w:tblHeader/>
+        </w:trPr>
+        <w:tc>
+          <w:tcPr>
+            <w:tcW w:w="0" w:type="auto"/>
+            <w:noWrap/>
+            <w:tcMar>
+              <w:top w:w="75" w:type="dxa"/>
+              <w:left w:w="135" w:type="dxa"/>
+              <w:bottom w:w="75" w:type="dxa"/>
+              <w:right w:w="135" w:type="dxa"/>
+            </w:tcMar>
+            <w:hideMark/>
+          </w:tcPr>
+          <w:p>
+            <w:pPr>
+              <w:rPr>
+                <w:rFonts w:ascii="Arial" w:eastAsia="Times New Roman" w:hAnsi="Arial" w:cs="Arial"/>
+                <w:color w:val="000000" w:themeColor="text1"/>
+                <w:kern w:val="0"/>
+                <w:sz w:val="20"/>
+                <w:szCs w:val="20"/>
+                <w:lang w:val="en-IN" w:eastAsia="en-GB"/>
+                <w14:ligatures w14:val="none"/>
+              </w:rPr>
+            </w:pPr>
+          </w:p>
+        </w:tc>
+        <w:tc>
+          <w:tcPr>
+            <w:tcW w:w="0" w:type="auto"/>
+            <w:noWrap/>
+            <w:tcMar>
+              <w:top w:w="75" w:type="dxa"/>
+              <w:left w:w="135" w:type="dxa"/>
+              <w:bottom w:w="75" w:type="dxa"/>
+              <w:right w:w="135" w:type="dxa"/>
+            </w:tcMar>
+            <w:hideMark/>
+          </w:tcPr>
+          <w:p>
+            <w:pPr>
+              <w:rPr>
+                <w:rFonts w:ascii="Times New Roman" w:eastAsia="Times New Roman" w:hAnsi="Times New Roman" w:cs="Times New Roman"/>
+                <w:b/>
+                <w:bCs/>
+                <w:color w:val="000000" w:themeColor="text1"/>
+                <w:kern w:val="0"/>
+                <w:lang w:val="en-IN" w:eastAsia="en-GB"/>
+                <w14:ligatures w14:val="none"/>
+              </w:rPr>
+            </w:pPr>
+            <w:r>
+              <w:rPr>
+                <w:rFonts w:ascii="Menlo" w:eastAsia="Times New Roman" w:hAnsi="Menlo" w:cs="Menlo"/>
+                <w:b/>
+                <w:bCs/>
+                <w:color w:val="000000" w:themeColor="text1"/>
+                <w:kern w:val="0"/>
+                <w:sz w:val="22"/>
+                <w:szCs w:val="22"/>
+                <w:lang w:val="en-IN" w:eastAsia="en-GB"/>
+                <w14:ligatures w14:val="none"/>
+              </w:rPr>
+              <w:t>__</w:t>
+            </w:r>
+            <w:proofErr w:type="spellStart"/>
+            <w:r>
+              <w:rPr>
+                <w:rFonts w:ascii="Menlo" w:eastAsia="Times New Roman" w:hAnsi="Menlo" w:cs="Menlo"/>
+                <w:b/>
+                <w:bCs/>
+                <w:color w:val="000000" w:themeColor="text1"/>
+                <w:kern w:val="0"/>
+                <w:sz w:val="22"/>
+                <w:szCs w:val="22"/>
+                <w:lang w:val="en-IN" w:eastAsia="en-GB"/>
+                <w14:ligatures w14:val="none"/>
+              </w:rPr>
+              <w:t>init</w:t>
+            </w:r>
+            <w:proofErr w:type="spellEnd"/>
+            <w:r>
+              <w:rPr>
+                <w:rFonts w:ascii="Menlo" w:eastAsia="Times New Roman" w:hAnsi="Menlo" w:cs="Menlo"/>
+                <w:b/>
+                <w:bCs/>
+                <w:color w:val="000000" w:themeColor="text1"/>
+                <w:kern w:val="0"/>
+                <w:sz w:val="22"/>
+                <w:szCs w:val="22"/>
+                <w:lang w:val="en-IN" w:eastAsia="en-GB"/>
+                <w14:ligatures w14:val="none"/>
+              </w:rPr>
+              <w:t>__</w:t>
+            </w:r>
+          </w:p>
+        </w:tc>
+        <w:tc>
+          <w:tcPr>
+            <w:tcW w:w="0" w:type="auto"/>
+            <w:noWrap/>
+            <w:tcMar>
+              <w:top w:w="75" w:type="dxa"/>
+              <w:left w:w="135" w:type="dxa"/>
+              <w:bottom w:w="75" w:type="dxa"/>
+              <w:right w:w="135" w:type="dxa"/>
+            </w:tcMar>
+            <w:hideMark/>
+          </w:tcPr>
+          <w:p>
+            <w:pPr>
+              <w:rPr>
+                <w:rFonts w:ascii="Times New Roman" w:eastAsia="Times New Roman" w:hAnsi="Times New Roman" w:cs="Times New Roman"/>
+                <w:b/>
+                <w:bCs/>
+                <w:color w:val="000000" w:themeColor="text1"/>
+                <w:kern w:val="0"/>
+                <w:lang w:val="en-IN" w:eastAsia="en-GB"/>
+                <w14:ligatures w14:val="none"/>
+              </w:rPr>
+            </w:pPr>
+            <w:r>
+              <w:rPr>
+                <w:rFonts w:ascii="Menlo" w:eastAsia="Times New Roman" w:hAnsi="Menlo" w:cs="Menlo"/>
+                <w:b/>
+                <w:bCs/>
+                <w:color w:val="000000" w:themeColor="text1"/>
+                <w:kern w:val="0"/>
+                <w:sz w:val="22"/>
+                <w:szCs w:val="22"/>
+                <w:lang w:val="en-IN" w:eastAsia="en-GB"/>
+                <w14:ligatures w14:val="none"/>
+              </w:rPr>
+              <w:t>if __name__ == "__main__":</w:t>
+            </w:r>
+          </w:p>
+        </w:tc>
+      </w:tr>
+      <w:tr>
+        <w:tc>
+          <w:tcPr>
+            <w:tcW w:w="0" w:type="auto"/>
+            <w:tcMar>
+              <w:top w:w="75" w:type="dxa"/>
+              <w:left w:w="135" w:type="dxa"/>
+              <w:bottom w:w="75" w:type="dxa"/>
+              <w:right w:w="135" w:type="dxa"/>
+            </w:tcMar>
+            <w:hideMark/>
+          </w:tcPr>
+          <w:p>
+            <w:pPr>
+              <w:rPr>
+                <w:rFonts w:ascii="Times New Roman" w:eastAsia="Times New Roman" w:hAnsi="Times New Roman" w:cs="Times New Roman"/>
+                <w:color w:val="000000" w:themeColor="text1"/>
+                <w:kern w:val="0"/>
+                <w:lang w:val="en-IN" w:eastAsia="en-GB"/>
+                <w14:ligatures w14:val="none"/>
+              </w:rPr>
+            </w:pPr>
+            <w:r>
+              <w:rPr>
+                <w:rFonts w:ascii="Times New Roman" w:eastAsia="Times New Roman" w:hAnsi="Times New Roman" w:cs="Times New Roman"/>
+                <w:color w:val="000000" w:themeColor="text1"/>
+                <w:kern w:val="0"/>
+                <w:lang w:val="en-IN" w:eastAsia="en-GB"/>
+                <w14:ligatures w14:val="none"/>
+              </w:rPr>
+              <w:t>What it is</w:t>
+            </w:r>
+          </w:p>
+        </w:tc>
+        <w:tc>
+          <w:tcPr>
+            <w:tcW w:w="0" w:type="auto"/>
+            <w:tcMar>
+              <w:top w:w="75" w:type="dxa"/>
+              <w:left w:w="135" w:type="dxa"/>
+              <w:bottom w:w="75" w:type="dxa"/>
+              <w:right w:w="135" w:type="dxa"/>
+            </w:tcMar>
+            <w:hideMark/>
+          </w:tcPr>
+          <w:p>
+            <w:pPr>
+              <w:rPr>
+                <w:rFonts w:ascii="Times New Roman" w:eastAsia="Times New Roman" w:hAnsi="Times New Roman" w:cs="Times New Roman"/>
+                <w:color w:val="000000" w:themeColor="text1"/>
+                <w:kern w:val="0"/>
+                <w:lang w:val="en-IN" w:eastAsia="en-GB"/>
+                <w14:ligatures w14:val="none"/>
+              </w:rPr>
+            </w:pPr>
+            <w:r>
+              <w:rPr>
+                <w:rFonts w:ascii="Times New Roman" w:eastAsia="Times New Roman" w:hAnsi="Times New Roman" w:cs="Times New Roman"/>
+                <w:color w:val="000000" w:themeColor="text1"/>
+                <w:kern w:val="0"/>
+                <w:lang w:val="en-IN" w:eastAsia="en-GB"/>
+                <w14:ligatures w14:val="none"/>
+              </w:rPr>
+              <w:t>a method inside the class</w:t>
+            </w:r>
+          </w:p>
+        </w:tc>
+        <w:tc>
+          <w:tcPr>
+            <w:tcW w:w="0" w:type="auto"/>
+            <w:tcMar>
+              <w:top w:w="75" w:type="dxa"/>
+              <w:left w:w="135" w:type="dxa"/>
+              <w:bottom w:w="75" w:type="dxa"/>
+              <w:right w:w="135" w:type="dxa"/>
+            </w:tcMar>
+            <w:hideMark/>
+          </w:tcPr>
+          <w:p>
+            <w:pPr>
+              <w:rPr>
+                <w:rFonts w:ascii="Times New Roman" w:eastAsia="Times New Roman" w:hAnsi="Times New Roman" w:cs="Times New Roman"/>
+                <w:color w:val="000000" w:themeColor="text1"/>
+                <w:kern w:val="0"/>
+                <w:lang w:val="en-IN" w:eastAsia="en-GB"/>
+                <w14:ligatures w14:val="none"/>
+              </w:rPr>
+            </w:pPr>
+            <w:r>
+              <w:rPr>
+                <w:rFonts w:ascii="Times New Roman" w:eastAsia="Times New Roman" w:hAnsi="Times New Roman" w:cs="Times New Roman"/>
+                <w:color w:val="000000" w:themeColor="text1"/>
+                <w:kern w:val="0"/>
+                <w:lang w:val="en-IN" w:eastAsia="en-GB"/>
+                <w14:ligatures w14:val="none"/>
+              </w:rPr>
+              <w:t>a block at the bottom of the file</w:t>
+            </w:r>
+          </w:p>
+        </w:tc>
+      </w:tr>
+      <w:tr>
+        <w:tc>
+          <w:tcPr>
+            <w:tcW w:w="0" w:type="auto"/>
+            <w:tcMar>
+              <w:top w:w="75" w:type="dxa"/>
+              <w:left w:w="135" w:type="dxa"/>
+              <w:bottom w:w="75" w:type="dxa"/>
+              <w:right w:w="135" w:type="dxa"/>
+            </w:tcMar>
+            <w:hideMark/>
+          </w:tcPr>
+          <w:p>
+            <w:pPr>
+              <w:rPr>
+                <w:rFonts w:ascii="Times New Roman" w:eastAsia="Times New Roman" w:hAnsi="Times New Roman" w:cs="Times New Roman"/>
+                <w:color w:val="000000" w:themeColor="text1"/>
+                <w:kern w:val="0"/>
+                <w:lang w:val="en-IN" w:eastAsia="en-GB"/>
+                <w14:ligatures w14:val="none"/>
+              </w:rPr>
+            </w:pPr>
+            <w:r>
+              <w:rPr>
+                <w:rFonts w:ascii="Times New Roman" w:eastAsia="Times New Roman" w:hAnsi="Times New Roman" w:cs="Times New Roman"/>
+                <w:color w:val="000000" w:themeColor="text1"/>
+                <w:kern w:val="0"/>
+                <w:lang w:val="en-IN" w:eastAsia="en-GB"/>
+                <w14:ligatures w14:val="none"/>
+              </w:rPr>
+              <w:t>When it runs</w:t>
+            </w:r>
+          </w:p>
+        </w:tc>
+        <w:tc>
+          <w:tcPr>
+            <w:tcW w:w="0" w:type="auto"/>
+            <w:tcMar>
+              <w:top w:w="75" w:type="dxa"/>
+              <w:left w:w="135" w:type="dxa"/>
+              <w:bottom w:w="75" w:type="dxa"/>
+              <w:right w:w="135" w:type="dxa"/>
+            </w:tcMar>
+            <w:hideMark/>
+          </w:tcPr>
+          <w:p>
+            <w:pPr>
+              <w:rPr>
+                <w:rFonts w:ascii="Times New Roman" w:eastAsia="Times New Roman" w:hAnsi="Times New Roman" w:cs="Times New Roman"/>
+                <w:color w:val="000000" w:themeColor="text1"/>
+                <w:kern w:val="0"/>
+                <w:lang w:val="en-IN" w:eastAsia="en-GB"/>
+                <w14:ligatures w14:val="none"/>
+              </w:rPr>
+            </w:pPr>
+            <w:r>
+              <w:rPr>
+                <w:rFonts w:ascii="Times New Roman" w:eastAsia="Times New Roman" w:hAnsi="Times New Roman" w:cs="Times New Roman"/>
+                <w:color w:val="000000" w:themeColor="text1"/>
+                <w:kern w:val="0"/>
+                <w:lang w:val="en-IN" w:eastAsia="en-GB"/>
+                <w14:ligatures w14:val="none"/>
+              </w:rPr>
+              <w:t>every time you create a </w:t>
+            </w:r>
+            <w:proofErr w:type="spellStart"/>
+            <w:r>
+              <w:rPr>
+                <w:rFonts w:ascii="Menlo" w:eastAsia="Times New Roman" w:hAnsi="Menlo" w:cs="Menlo"/>
+                <w:color w:val="000000" w:themeColor="text1"/>
+                <w:kern w:val="0"/>
+                <w:sz w:val="22"/>
+                <w:szCs w:val="22"/>
+                <w:lang w:val="en-IN" w:eastAsia="en-GB"/>
+                <w14:ligatures w14:val="none"/>
+              </w:rPr>
+              <w:t>CmlClient</w:t>
+            </w:r>
+            <w:proofErr w:type="spellEnd"/>
+            <w:r>
+              <w:rPr>
+                <w:rFonts w:ascii="Menlo" w:eastAsia="Times New Roman" w:hAnsi="Menlo" w:cs="Menlo"/>
+                <w:color w:val="000000" w:themeColor="text1"/>
+                <w:kern w:val="0"/>
+                <w:sz w:val="22"/>
+                <w:szCs w:val="22"/>
+                <w:lang w:val="en-IN" w:eastAsia="en-GB"/>
+                <w14:ligatures w14:val="none"/>
+              </w:rPr>
+              <w:t>(...)</w:t>
+            </w:r>
+          </w:p>
+        </w:tc>
+        <w:tc>
+          <w:tcPr>
+            <w:tcW w:w="0" w:type="auto"/>
+            <w:tcMar>
+              <w:top w:w="75" w:type="dxa"/>
+              <w:left w:w="135" w:type="dxa"/>
+              <w:bottom w:w="75" w:type="dxa"/>
+              <w:right w:w="135" w:type="dxa"/>
+            </w:tcMar>
+            <w:hideMark/>
+          </w:tcPr>
+          <w:p>
+            <w:pPr>
+              <w:rPr>
+                <w:rFonts w:ascii="Times New Roman" w:eastAsia="Times New Roman" w:hAnsi="Times New Roman" w:cs="Times New Roman"/>
+                <w:color w:val="000000" w:themeColor="text1"/>
+                <w:kern w:val="0"/>
+                <w:lang w:val="en-IN" w:eastAsia="en-GB"/>
+                <w14:ligatures w14:val="none"/>
+              </w:rPr>
+            </w:pPr>
+            <w:r>
+              <w:rPr>
+                <w:rFonts w:ascii="Times New Roman" w:eastAsia="Times New Roman" w:hAnsi="Times New Roman" w:cs="Times New Roman"/>
+                <w:color w:val="000000" w:themeColor="text1"/>
+                <w:kern w:val="0"/>
+                <w:lang w:val="en-IN" w:eastAsia="en-GB"/>
+                <w14:ligatures w14:val="none"/>
+              </w:rPr>
+              <w:t>only when you run </w:t>
+            </w:r>
+            <w:r>
+              <w:rPr>
+                <w:rFonts w:ascii="Menlo" w:eastAsia="Times New Roman" w:hAnsi="Menlo" w:cs="Menlo"/>
+                <w:color w:val="000000" w:themeColor="text1"/>
+                <w:kern w:val="0"/>
+                <w:sz w:val="22"/>
+                <w:szCs w:val="22"/>
+                <w:lang w:val="en-IN" w:eastAsia="en-GB"/>
+                <w14:ligatures w14:val="none"/>
+              </w:rPr>
+              <w:t xml:space="preserve">python3 </w:t>
+            </w:r>
+            <w:proofErr w:type="spellStart"/>
+            <w:r>
+              <w:rPr>
+                <w:rFonts w:ascii="Menlo" w:eastAsia="Times New Roman" w:hAnsi="Menlo" w:cs="Menlo"/>
+                <w:color w:val="000000" w:themeColor="text1"/>
+                <w:kern w:val="0"/>
+                <w:sz w:val="22"/>
+                <w:szCs w:val="22"/>
+                <w:lang w:val="en-IN" w:eastAsia="en-GB"/>
+                <w14:ligatures w14:val="none"/>
+              </w:rPr>
+              <w:t>cml_client.py</w:t>
+            </w:r>
+            <w:proofErr w:type="spellEnd"/>
+            <w:r>
+              <w:rPr>
+                <w:rFonts w:ascii="Times New Roman" w:eastAsia="Times New Roman" w:hAnsi="Times New Roman" w:cs="Times New Roman"/>
+                <w:color w:val="000000" w:themeColor="text1"/>
+                <w:kern w:val="0"/>
+                <w:lang w:val="en-IN" w:eastAsia="en-GB"/>
+                <w14:ligatures w14:val="none"/>
+              </w:rPr>
+              <w:t> directly</w:t>
+            </w:r>
+          </w:p>
+        </w:tc>
+      </w:tr>
+      <w:tr>
+        <w:tc>
+          <w:tcPr>
+            <w:tcW w:w="0" w:type="auto"/>
+            <w:tcMar>
+              <w:top w:w="75" w:type="dxa"/>
+              <w:left w:w="135" w:type="dxa"/>
+              <w:bottom w:w="75" w:type="dxa"/>
+              <w:right w:w="135" w:type="dxa"/>
+            </w:tcMar>
+            <w:hideMark/>
+          </w:tcPr>
+          <w:p>
+            <w:pPr>
+              <w:rPr>
+                <w:rFonts w:ascii="Times New Roman" w:eastAsia="Times New Roman" w:hAnsi="Times New Roman" w:cs="Times New Roman"/>
+                <w:color w:val="000000" w:themeColor="text1"/>
+                <w:kern w:val="0"/>
+                <w:lang w:val="en-IN" w:eastAsia="en-GB"/>
+                <w14:ligatures w14:val="none"/>
+              </w:rPr>
+            </w:pPr>
+            <w:r>
+              <w:rPr>
+                <w:rFonts w:ascii="Times New Roman" w:eastAsia="Times New Roman" w:hAnsi="Times New Roman" w:cs="Times New Roman"/>
+                <w:color w:val="000000" w:themeColor="text1"/>
+                <w:kern w:val="0"/>
+                <w:lang w:val="en-IN" w:eastAsia="en-GB"/>
+                <w14:ligatures w14:val="none"/>
+              </w:rPr>
+              <w:t>Its job</w:t>
+            </w:r>
+          </w:p>
+        </w:tc>
+        <w:tc>
+          <w:tcPr>
+            <w:tcW w:w="0" w:type="auto"/>
+            <w:tcMar>
+              <w:top w:w="75" w:type="dxa"/>
+              <w:left w:w="135" w:type="dxa"/>
+              <w:bottom w:w="75" w:type="dxa"/>
+              <w:right w:w="135" w:type="dxa"/>
+            </w:tcMar>
+            <w:hideMark/>
+          </w:tcPr>
+          <w:p>
+            <w:pPr>
+              <w:rPr>
+                <w:rFonts w:ascii="Times New Roman" w:eastAsia="Times New Roman" w:hAnsi="Times New Roman" w:cs="Times New Roman"/>
+                <w:color w:val="000000" w:themeColor="text1"/>
+                <w:kern w:val="0"/>
+                <w:lang w:val="en-IN" w:eastAsia="en-GB"/>
+                <w14:ligatures w14:val="none"/>
+              </w:rPr>
+            </w:pPr>
+            <w:r>
+              <w:rPr>
+                <w:rFonts w:ascii="Times New Roman" w:eastAsia="Times New Roman" w:hAnsi="Times New Roman" w:cs="Times New Roman"/>
+                <w:color w:val="000000" w:themeColor="text1"/>
+                <w:kern w:val="0"/>
+                <w:lang w:val="en-IN" w:eastAsia="en-GB"/>
+                <w14:ligatures w14:val="none"/>
+              </w:rPr>
+              <w:t>initialize </w:t>
+            </w:r>
+            <w:r>
+              <w:rPr>
+                <w:rFonts w:ascii="Menlo" w:eastAsia="Times New Roman" w:hAnsi="Menlo" w:cs="Menlo"/>
+                <w:color w:val="000000" w:themeColor="text1"/>
+                <w:kern w:val="0"/>
+                <w:sz w:val="22"/>
+                <w:szCs w:val="22"/>
+                <w:lang w:val="en-IN" w:eastAsia="en-GB"/>
+                <w14:ligatures w14:val="none"/>
+              </w:rPr>
+              <w:t>self.*</w:t>
+            </w:r>
+            <w:r>
+              <w:rPr>
+                <w:rFonts w:ascii="Times New Roman" w:eastAsia="Times New Roman" w:hAnsi="Times New Roman" w:cs="Times New Roman"/>
+                <w:color w:val="000000" w:themeColor="text1"/>
+                <w:kern w:val="0"/>
+                <w:lang w:val="en-IN" w:eastAsia="en-GB"/>
+                <w14:ligatures w14:val="none"/>
+              </w:rPr>
+              <w:t> state</w:t>
+            </w:r>
+          </w:p>
+        </w:tc>
+        <w:tc>
+          <w:tcPr>
+            <w:tcW w:w="0" w:type="auto"/>
+            <w:tcMar>
+              <w:top w:w="75" w:type="dxa"/>
+              <w:left w:w="135" w:type="dxa"/>
+              <w:bottom w:w="75" w:type="dxa"/>
+              <w:right w:w="135" w:type="dxa"/>
+            </w:tcMar>
+            <w:hideMark/>
+          </w:tcPr>
+          <w:p>
+            <w:pPr>
+              <w:rPr>
+                <w:rFonts w:ascii="Times New Roman" w:eastAsia="Times New Roman" w:hAnsi="Times New Roman" w:cs="Times New Roman"/>
+                <w:color w:val="000000" w:themeColor="text1"/>
+                <w:kern w:val="0"/>
+                <w:lang w:val="en-IN" w:eastAsia="en-GB"/>
+                <w14:ligatures w14:val="none"/>
+              </w:rPr>
+            </w:pPr>
+            <w:r>
+              <w:rPr>
+                <w:rFonts w:ascii="Times New Roman" w:eastAsia="Times New Roman" w:hAnsi="Times New Roman" w:cs="Times New Roman"/>
+                <w:color w:val="000000" w:themeColor="text1"/>
+                <w:kern w:val="0"/>
+                <w:lang w:val="en-IN" w:eastAsia="en-GB"/>
+                <w14:ligatures w14:val="none"/>
+              </w:rPr>
+              <w:t>the "demo/entry point" that creates a client and calls it</w:t>
+            </w:r>
+          </w:p>
+        </w:tc>
+      </w:tr>
+    </w:tbl>
+    <w:p/>
+    <w:p/>
+    <w:p/>
+    <w:p>
+      <w:r>
+        <w:lastRenderedPageBreak/>
+        <w:t xml:space="preserve">Data models lie </w:t>
+      </w:r>
+      <w:r>
+        <w:t xml:space="preserve">CLI configs to ensure only valid config is applied to the device. </w:t>
+      </w:r>
+    </w:p>
+    <w:p>
+      <w:proofErr w:type="gramStart"/>
+      <w:r>
+        <w:t>So</w:t>
+      </w:r>
+      <w:proofErr w:type="gramEnd"/>
+      <w:r>
+        <w:t xml:space="preserve"> YANG is a data model suite, and JSON and XML are data model formats that we/admins use to manipulate YANG </w:t>
+      </w:r>
+      <w:r>
+        <w:t xml:space="preserve">model </w:t>
+      </w:r>
+      <w:proofErr w:type="gramStart"/>
+      <w:r>
+        <w:t>to be then be</w:t>
+      </w:r>
+      <w:proofErr w:type="gramEnd"/>
+      <w:r>
+        <w:t xml:space="preserve"> able to configure devices. </w:t>
+      </w:r>
+    </w:p>
+    <w:p>
+      <w:r>
+        <w:t xml:space="preserve">RESTCONF and NETCONF are protocols (?) that help pushing the payload to device. They have various verification tools </w:t>
+      </w:r>
+      <w:proofErr w:type="spellStart"/>
+      <w:r>
+        <w:t>etc</w:t>
+      </w:r>
+      <w:proofErr w:type="spellEnd"/>
+      <w:r>
+        <w:t xml:space="preserve"> that can be run. </w:t>
+      </w:r>
+    </w:p>
     <w:sectPr>
       <w:footerReference w:type="even" r:id="rId6"/>
       <w:footerReference w:type="default" r:id="rId7"/>
@@ -4698,7 +5583,7 @@
 </file>
 
 <file path=word/endnotes.xml><?xml version="1.0" encoding="utf-8"?>
-<w:endnotes xmlns:wpc="http://schemas.microsoft.com/office/word/2010/wordprocessingCanvas" xmlns:cx="http://schemas.microsoft.com/office/drawing/2014/chartex" xmlns:cx1="http://schemas.microsoft.com/office/drawing/2015/9/8/chartex" xmlns:cx2="http://schemas.microsoft.com/office/drawing/2015/10/21/chartex" xmlns:cx3="http://schemas.microsoft.com/office/drawing/2016/5/9/chartex" xmlns:cx4="http://schemas.microsoft.com/office/drawing/2016/5/10/chartex" xmlns:cx5="http://schemas.microsoft.com/office/drawing/2016/5/11/chartex" xmlns:cx6="http://schemas.microsoft.com/office/drawing/2016/5/12/chartex" xmlns:cx7="http://schemas.microsoft.com/office/drawing/2016/5/13/chartex" xmlns:cx8="http://schemas.microsoft.com/office/drawing/2016/5/14/chartex" xmlns:mc="http://schemas.openxmlformats.org/markup-compatibility/2006" xmlns:m="http://schemas.openxmlformats.org/officeDocument/2006/math" xmlns:aink="http://schemas.microsoft.com/office/drawing/2016/ink" xmlns:am3d="http://schemas.microsoft.com/office/drawing/2017/model3d" xmlns:oel="http://schemas.microsoft.com/office/2019/extlst" xmlns:r="http://schemas.openxmlformats.org/officeDocument/2006/relationships" xmlns:wp14="http://schemas.microsoft.com/office/word/2010/wordprocessingDrawing" xmlns:wp="http://schemas.openxmlformats.org/drawingml/2006/wordprocessingDrawing" xmlns:wpg="http://schemas.microsoft.com/office/word/2010/wordprocessingGroup" xmlns:wpi="http://schemas.microsoft.com/office/word/2010/wordprocessingInk" xmlns:wps="http://schemas.microsoft.com/office/word/2010/wordprocessingShape" xmlns:o="urn:schemas-microsoft-com:office:office" xmlns:v="urn:schemas-microsoft-com:vml" xmlns:w10="urn:schemas-microsoft-com:office:word" xmlns:w="http://schemas.openxmlformats.org/wordprocessingml/2006/main" xmlns:w14="http://schemas.microsoft.com/office/word/2010/wordml" xmlns:w15="http://schemas.microsoft.com/office/word/2012/wordml" xmlns:w16cei="http://schemas.microsoft.com/office/word/2026/wordml/cei" xmlns:w16cex="http://schemas.microsoft.com/office/word/2018/wordml/cex" xmlns:w16cid="http://schemas.microsoft.com/office/word/2016/wordml/cid" xmlns:w16="http://schemas.microsoft.com/office/word/2018/wordml" xmlns:w16sdtdh="http://schemas.microsoft.com/office/word/2020/wordml/sdtdatahash" xmlns:w16sdtfl="http://schemas.microsoft.com/office/word/2024/wordml/sdtformatlock" xmlns:w16se="http://schemas.microsoft.com/office/word/2015/wordml/symex" xmlns:w16du="http://schemas.microsoft.com/office/word/2023/wordml/word16du" xmlns:wne="http://schemas.microsoft.com/office/word/2006/wordml" mc:Ignorable="w14 w15 w16se w16cid w16 w16cex w16sdtdh w16sdtfl w16du wp14">
+<w:endnotes xmlns:wpc="http://schemas.microsoft.com/office/word/2010/wordprocessingCanvas" xmlns:cx="http://schemas.microsoft.com/office/drawing/2014/chartex" xmlns:cx1="http://schemas.microsoft.com/office/drawing/2015/9/8/chartex" xmlns:cx2="http://schemas.microsoft.com/office/drawing/2015/10/21/chartex" xmlns:cx3="http://schemas.microsoft.com/office/drawing/2016/5/9/chartex" xmlns:cx4="http://schemas.microsoft.com/office/drawing/2016/5/10/chartex" xmlns:cx5="http://schemas.microsoft.com/office/drawing/2016/5/11/chartex" xmlns:cx6="http://schemas.microsoft.com/office/drawing/2016/5/12/chartex" xmlns:cx7="http://schemas.microsoft.com/office/drawing/2016/5/13/chartex" xmlns:cx8="http://schemas.microsoft.com/office/drawing/2016/5/14/chartex" xmlns:mc="http://schemas.openxmlformats.org/markup-compatibility/2006" xmlns:m="http://schemas.openxmlformats.org/officeDocument/2006/math" xmlns:aink="http://schemas.microsoft.com/office/drawing/2016/ink" xmlns:am3d="http://schemas.microsoft.com/office/drawing/2017/model3d" xmlns:oel="http://schemas.microsoft.com/office/2019/extlst" xmlns:r="http://schemas.openxmlformats.org/officeDocument/2006/relationships" xmlns:wp14="http://schemas.microsoft.com/office/word/2010/wordprocessingDrawing" xmlns:wp="http://schemas.openxmlformats.org/drawingml/2006/wordprocessingDrawing" xmlns:wpg="http://schemas.microsoft.com/office/word/2010/wordprocessingGroup" xmlns:wpi="http://schemas.microsoft.com/office/word/2010/wordprocessingInk" xmlns:wps="http://schemas.microsoft.com/office/word/2010/wordprocessingShape" xmlns:o="urn:schemas-microsoft-com:office:office" xmlns:v="urn:schemas-microsoft-com:vml" xmlns:w10="urn:schemas-microsoft-com:office:word" xmlns:w="http://schemas.openxmlformats.org/wordprocessingml/2006/main" xmlns:w14="http://schemas.microsoft.com/office/word/2010/wordml" xmlns:w15="http://schemas.microsoft.com/office/word/2012/wordml" xmlns:w16cex="http://schemas.microsoft.com/office/word/2018/wordml/cex" xmlns:w16cid="http://schemas.microsoft.com/office/word/2016/wordml/cid" xmlns:w16="http://schemas.microsoft.com/office/word/2018/wordml" xmlns:w16sdtdh="http://schemas.microsoft.com/office/word/2020/wordml/sdtdatahash" xmlns:w16sdtfl="http://schemas.microsoft.com/office/word/2024/wordml/sdtformatlock" xmlns:w16se="http://schemas.microsoft.com/office/word/2015/wordml/symex" xmlns:w16du="http://schemas.microsoft.com/office/word/2023/wordml/word16du" xmlns:wne="http://schemas.microsoft.com/office/word/2006/wordml" mc:Ignorable="w14 w15 w16se w16cid w16 w16cex w16sdtdh w16sdtfl w16du wp14">
   <w:endnote w:type="separator" w:id="-1">
     <w:p>
       <w:r>
@@ -4717,7 +5602,7 @@
 </file>
 
 <file path=word/footer1.xml><?xml version="1.0" encoding="utf-8"?>
-<w:ftr xmlns:wpc="http://schemas.microsoft.com/office/word/2010/wordprocessingCanvas" xmlns:cx="http://schemas.microsoft.com/office/drawing/2014/chartex" xmlns:cx1="http://schemas.microsoft.com/office/drawing/2015/9/8/chartex" xmlns:cx2="http://schemas.microsoft.com/office/drawing/2015/10/21/chartex" xmlns:cx3="http://schemas.microsoft.com/office/drawing/2016/5/9/chartex" xmlns:cx4="http://schemas.microsoft.com/office/drawing/2016/5/10/chartex" xmlns:cx5="http://schemas.microsoft.com/office/drawing/2016/5/11/chartex" xmlns:cx6="http://schemas.microsoft.com/office/drawing/2016/5/12/chartex" xmlns:cx7="http://schemas.microsoft.com/office/drawing/2016/5/13/chartex" xmlns:cx8="http://schemas.microsoft.com/office/drawing/2016/5/14/chartex" xmlns:mc="http://schemas.openxmlformats.org/markup-compatibility/2006" xmlns:m="http://schemas.openxmlformats.org/officeDocument/2006/math" xmlns:aink="http://schemas.microsoft.com/office/drawing/2016/ink" xmlns:am3d="http://schemas.microsoft.com/office/drawing/2017/model3d" xmlns:oel="http://schemas.microsoft.com/office/2019/extlst" xmlns:r="http://schemas.openxmlformats.org/officeDocument/2006/relationships" xmlns:wp14="http://schemas.microsoft.com/office/word/2010/wordprocessingDrawing" xmlns:wp="http://schemas.openxmlformats.org/drawingml/2006/wordprocessingDrawing" xmlns:wpg="http://schemas.microsoft.com/office/word/2010/wordprocessingGroup" xmlns:wpi="http://schemas.microsoft.com/office/word/2010/wordprocessingInk" xmlns:wps="http://schemas.microsoft.com/office/word/2010/wordprocessingShape" xmlns:o="urn:schemas-microsoft-com:office:office" xmlns:v="urn:schemas-microsoft-com:vml" xmlns:w10="urn:schemas-microsoft-com:office:word" xmlns:w="http://schemas.openxmlformats.org/wordprocessingml/2006/main" xmlns:w14="http://schemas.microsoft.com/office/word/2010/wordml" xmlns:w15="http://schemas.microsoft.com/office/word/2012/wordml" xmlns:w16cei="http://schemas.microsoft.com/office/word/2026/wordml/cei" xmlns:w16cex="http://schemas.microsoft.com/office/word/2018/wordml/cex" xmlns:w16cid="http://schemas.microsoft.com/office/word/2016/wordml/cid" xmlns:w16="http://schemas.microsoft.com/office/word/2018/wordml" xmlns:w16sdtdh="http://schemas.microsoft.com/office/word/2020/wordml/sdtdatahash" xmlns:w16sdtfl="http://schemas.microsoft.com/office/word/2024/wordml/sdtformatlock" xmlns:w16se="http://schemas.microsoft.com/office/word/2015/wordml/symex" xmlns:w16du="http://schemas.microsoft.com/office/word/2023/wordml/word16du" xmlns:wne="http://schemas.microsoft.com/office/word/2006/wordml" mc:Ignorable="w14 w15 w16se w16cid w16 w16cex w16sdtdh w16sdtfl w16du wp14">
+<w:ftr xmlns:wpc="http://schemas.microsoft.com/office/word/2010/wordprocessingCanvas" xmlns:cx="http://schemas.microsoft.com/office/drawing/2014/chartex" xmlns:cx1="http://schemas.microsoft.com/office/drawing/2015/9/8/chartex" xmlns:cx2="http://schemas.microsoft.com/office/drawing/2015/10/21/chartex" xmlns:cx3="http://schemas.microsoft.com/office/drawing/2016/5/9/chartex" xmlns:cx4="http://schemas.microsoft.com/office/drawing/2016/5/10/chartex" xmlns:cx5="http://schemas.microsoft.com/office/drawing/2016/5/11/chartex" xmlns:cx6="http://schemas.microsoft.com/office/drawing/2016/5/12/chartex" xmlns:cx7="http://schemas.microsoft.com/office/drawing/2016/5/13/chartex" xmlns:cx8="http://schemas.microsoft.com/office/drawing/2016/5/14/chartex" xmlns:mc="http://schemas.openxmlformats.org/markup-compatibility/2006" xmlns:m="http://schemas.openxmlformats.org/officeDocument/2006/math" xmlns:aink="http://schemas.microsoft.com/office/drawing/2016/ink" xmlns:am3d="http://schemas.microsoft.com/office/drawing/2017/model3d" xmlns:oel="http://schemas.microsoft.com/office/2019/extlst" xmlns:r="http://schemas.openxmlformats.org/officeDocument/2006/relationships" xmlns:wp14="http://schemas.microsoft.com/office/word/2010/wordprocessingDrawing" xmlns:wp="http://schemas.openxmlformats.org/drawingml/2006/wordprocessingDrawing" xmlns:wpg="http://schemas.microsoft.com/office/word/2010/wordprocessingGroup" xmlns:wpi="http://schemas.microsoft.com/office/word/2010/wordprocessingInk" xmlns:wps="http://schemas.microsoft.com/office/word/2010/wordprocessingShape" xmlns:o="urn:schemas-microsoft-com:office:office" xmlns:v="urn:schemas-microsoft-com:vml" xmlns:w10="urn:schemas-microsoft-com:office:word" xmlns:w="http://schemas.openxmlformats.org/wordprocessingml/2006/main" xmlns:w14="http://schemas.microsoft.com/office/word/2010/wordml" xmlns:w15="http://schemas.microsoft.com/office/word/2012/wordml" xmlns:w16cex="http://schemas.microsoft.com/office/word/2018/wordml/cex" xmlns:w16cid="http://schemas.microsoft.com/office/word/2016/wordml/cid" xmlns:w16="http://schemas.microsoft.com/office/word/2018/wordml" xmlns:w16sdtdh="http://schemas.microsoft.com/office/word/2020/wordml/sdtdatahash" xmlns:w16sdtfl="http://schemas.microsoft.com/office/word/2024/wordml/sdtformatlock" xmlns:w16se="http://schemas.microsoft.com/office/word/2015/wordml/symex" xmlns:w16du="http://schemas.microsoft.com/office/word/2023/wordml/word16du" xmlns:wne="http://schemas.microsoft.com/office/word/2006/wordml" mc:Ignorable="w14 w15 w16se w16cid w16 w16cex w16sdtdh w16sdtfl w16du wp14">
   <w:p>
     <w:pPr>
       <w:pStyle w:val="Footer"/>
@@ -4845,7 +5730,7 @@
 </file>
 
 <file path=word/footer2.xml><?xml version="1.0" encoding="utf-8"?>
-<w:ftr xmlns:wpc="http://schemas.microsoft.com/office/word/2010/wordprocessingCanvas" xmlns:cx="http://schemas.microsoft.com/office/drawing/2014/chartex" xmlns:cx1="http://schemas.microsoft.com/office/drawing/2015/9/8/chartex" xmlns:cx2="http://schemas.microsoft.com/office/drawing/2015/10/21/chartex" xmlns:cx3="http://schemas.microsoft.com/office/drawing/2016/5/9/chartex" xmlns:cx4="http://schemas.microsoft.com/office/drawing/2016/5/10/chartex" xmlns:cx5="http://schemas.microsoft.com/office/drawing/2016/5/11/chartex" xmlns:cx6="http://schemas.microsoft.com/office/drawing/2016/5/12/chartex" xmlns:cx7="http://schemas.microsoft.com/office/drawing/2016/5/13/chartex" xmlns:cx8="http://schemas.microsoft.com/office/drawing/2016/5/14/chartex" xmlns:mc="http://schemas.openxmlformats.org/markup-compatibility/2006" xmlns:m="http://schemas.openxmlformats.org/officeDocument/2006/math" xmlns:aink="http://schemas.microsoft.com/office/drawing/2016/ink" xmlns:am3d="http://schemas.microsoft.com/office/drawing/2017/model3d" xmlns:oel="http://schemas.microsoft.com/office/2019/extlst" xmlns:r="http://schemas.openxmlformats.org/officeDocument/2006/relationships" xmlns:wp14="http://schemas.microsoft.com/office/word/2010/wordprocessingDrawing" xmlns:wp="http://schemas.openxmlformats.org/drawingml/2006/wordprocessingDrawing" xmlns:wpg="http://schemas.microsoft.com/office/word/2010/wordprocessingGroup" xmlns:wpi="http://schemas.microsoft.com/office/word/2010/wordprocessingInk" xmlns:wps="http://schemas.microsoft.com/office/word/2010/wordprocessingShape" xmlns:o="urn:schemas-microsoft-com:office:office" xmlns:v="urn:schemas-microsoft-com:vml" xmlns:w10="urn:schemas-microsoft-com:office:word" xmlns:w="http://schemas.openxmlformats.org/wordprocessingml/2006/main" xmlns:w14="http://schemas.microsoft.com/office/word/2010/wordml" xmlns:w15="http://schemas.microsoft.com/office/word/2012/wordml" xmlns:w16cei="http://schemas.microsoft.com/office/word/2026/wordml/cei" xmlns:w16cex="http://schemas.microsoft.com/office/word/2018/wordml/cex" xmlns:w16cid="http://schemas.microsoft.com/office/word/2016/wordml/cid" xmlns:w16="http://schemas.microsoft.com/office/word/2018/wordml" xmlns:w16sdtdh="http://schemas.microsoft.com/office/word/2020/wordml/sdtdatahash" xmlns:w16sdtfl="http://schemas.microsoft.com/office/word/2024/wordml/sdtformatlock" xmlns:w16se="http://schemas.microsoft.com/office/word/2015/wordml/symex" xmlns:w16du="http://schemas.microsoft.com/office/word/2023/wordml/word16du" xmlns:wne="http://schemas.microsoft.com/office/word/2006/wordml" mc:Ignorable="w14 w15 w16se w16cid w16 w16cex w16sdtdh w16sdtfl w16du wp14">
+<w:ftr xmlns:wpc="http://schemas.microsoft.com/office/word/2010/wordprocessingCanvas" xmlns:cx="http://schemas.microsoft.com/office/drawing/2014/chartex" xmlns:cx1="http://schemas.microsoft.com/office/drawing/2015/9/8/chartex" xmlns:cx2="http://schemas.microsoft.com/office/drawing/2015/10/21/chartex" xmlns:cx3="http://schemas.microsoft.com/office/drawing/2016/5/9/chartex" xmlns:cx4="http://schemas.microsoft.com/office/drawing/2016/5/10/chartex" xmlns:cx5="http://schemas.microsoft.com/office/drawing/2016/5/11/chartex" xmlns:cx6="http://schemas.microsoft.com/office/drawing/2016/5/12/chartex" xmlns:cx7="http://schemas.microsoft.com/office/drawing/2016/5/13/chartex" xmlns:cx8="http://schemas.microsoft.com/office/drawing/2016/5/14/chartex" xmlns:mc="http://schemas.openxmlformats.org/markup-compatibility/2006" xmlns:m="http://schemas.openxmlformats.org/officeDocument/2006/math" xmlns:aink="http://schemas.microsoft.com/office/drawing/2016/ink" xmlns:am3d="http://schemas.microsoft.com/office/drawing/2017/model3d" xmlns:oel="http://schemas.microsoft.com/office/2019/extlst" xmlns:r="http://schemas.openxmlformats.org/officeDocument/2006/relationships" xmlns:wp14="http://schemas.microsoft.com/office/word/2010/wordprocessingDrawing" xmlns:wp="http://schemas.openxmlformats.org/drawingml/2006/wordprocessingDrawing" xmlns:wpg="http://schemas.microsoft.com/office/word/2010/wordprocessingGroup" xmlns:wpi="http://schemas.microsoft.com/office/word/2010/wordprocessingInk" xmlns:wps="http://schemas.microsoft.com/office/word/2010/wordprocessingShape" xmlns:o="urn:schemas-microsoft-com:office:office" xmlns:v="urn:schemas-microsoft-com:vml" xmlns:w10="urn:schemas-microsoft-com:office:word" xmlns:w="http://schemas.openxmlformats.org/wordprocessingml/2006/main" xmlns:w14="http://schemas.microsoft.com/office/word/2010/wordml" xmlns:w15="http://schemas.microsoft.com/office/word/2012/wordml" xmlns:w16cex="http://schemas.microsoft.com/office/word/2018/wordml/cex" xmlns:w16cid="http://schemas.microsoft.com/office/word/2016/wordml/cid" xmlns:w16="http://schemas.microsoft.com/office/word/2018/wordml" xmlns:w16sdtdh="http://schemas.microsoft.com/office/word/2020/wordml/sdtdatahash" xmlns:w16sdtfl="http://schemas.microsoft.com/office/word/2024/wordml/sdtformatlock" xmlns:w16se="http://schemas.microsoft.com/office/word/2015/wordml/symex" xmlns:w16du="http://schemas.microsoft.com/office/word/2023/wordml/word16du" xmlns:wne="http://schemas.microsoft.com/office/word/2006/wordml" mc:Ignorable="w14 w15 w16se w16cid w16 w16cex w16sdtdh w16sdtfl w16du wp14">
   <w:p>
     <w:pPr>
       <w:pStyle w:val="Footer"/>
@@ -4973,7 +5858,7 @@
 </file>
 
 <file path=word/footer3.xml><?xml version="1.0" encoding="utf-8"?>
-<w:ftr xmlns:wpc="http://schemas.microsoft.com/office/word/2010/wordprocessingCanvas" xmlns:cx="http://schemas.microsoft.com/office/drawing/2014/chartex" xmlns:cx1="http://schemas.microsoft.com/office/drawing/2015/9/8/chartex" xmlns:cx2="http://schemas.microsoft.com/office/drawing/2015/10/21/chartex" xmlns:cx3="http://schemas.microsoft.com/office/drawing/2016/5/9/chartex" xmlns:cx4="http://schemas.microsoft.com/office/drawing/2016/5/10/chartex" xmlns:cx5="http://schemas.microsoft.com/office/drawing/2016/5/11/chartex" xmlns:cx6="http://schemas.microsoft.com/office/drawing/2016/5/12/chartex" xmlns:cx7="http://schemas.microsoft.com/office/drawing/2016/5/13/chartex" xmlns:cx8="http://schemas.microsoft.com/office/drawing/2016/5/14/chartex" xmlns:mc="http://schemas.openxmlformats.org/markup-compatibility/2006" xmlns:m="http://schemas.openxmlformats.org/officeDocument/2006/math" xmlns:aink="http://schemas.microsoft.com/office/drawing/2016/ink" xmlns:am3d="http://schemas.microsoft.com/office/drawing/2017/model3d" xmlns:oel="http://schemas.microsoft.com/office/2019/extlst" xmlns:r="http://schemas.openxmlformats.org/officeDocument/2006/relationships" xmlns:wp14="http://schemas.microsoft.com/office/word/2010/wordprocessingDrawing" xmlns:wp="http://schemas.openxmlformats.org/drawingml/2006/wordprocessingDrawing" xmlns:wpg="http://schemas.microsoft.com/office/word/2010/wordprocessingGroup" xmlns:wpi="http://schemas.microsoft.com/office/word/2010/wordprocessingInk" xmlns:wps="http://schemas.microsoft.com/office/word/2010/wordprocessingShape" xmlns:o="urn:schemas-microsoft-com:office:office" xmlns:v="urn:schemas-microsoft-com:vml" xmlns:w10="urn:schemas-microsoft-com:office:word" xmlns:w="http://schemas.openxmlformats.org/wordprocessingml/2006/main" xmlns:w14="http://schemas.microsoft.com/office/word/2010/wordml" xmlns:w15="http://schemas.microsoft.com/office/word/2012/wordml" xmlns:w16cei="http://schemas.microsoft.com/office/word/2026/wordml/cei" xmlns:w16cex="http://schemas.microsoft.com/office/word/2018/wordml/cex" xmlns:w16cid="http://schemas.microsoft.com/office/word/2016/wordml/cid" xmlns:w16="http://schemas.microsoft.com/office/word/2018/wordml" xmlns:w16sdtdh="http://schemas.microsoft.com/office/word/2020/wordml/sdtdatahash" xmlns:w16sdtfl="http://schemas.microsoft.com/office/word/2024/wordml/sdtformatlock" xmlns:w16se="http://schemas.microsoft.com/office/word/2015/wordml/symex" xmlns:w16du="http://schemas.microsoft.com/office/word/2023/wordml/word16du" xmlns:wne="http://schemas.microsoft.com/office/word/2006/wordml" mc:Ignorable="w14 w15 w16se w16cid w16 w16cex w16sdtdh w16sdtfl w16du wp14">
+<w:ftr xmlns:wpc="http://schemas.microsoft.com/office/word/2010/wordprocessingCanvas" xmlns:cx="http://schemas.microsoft.com/office/drawing/2014/chartex" xmlns:cx1="http://schemas.microsoft.com/office/drawing/2015/9/8/chartex" xmlns:cx2="http://schemas.microsoft.com/office/drawing/2015/10/21/chartex" xmlns:cx3="http://schemas.microsoft.com/office/drawing/2016/5/9/chartex" xmlns:cx4="http://schemas.microsoft.com/office/drawing/2016/5/10/chartex" xmlns:cx5="http://schemas.microsoft.com/office/drawing/2016/5/11/chartex" xmlns:cx6="http://schemas.microsoft.com/office/drawing/2016/5/12/chartex" xmlns:cx7="http://schemas.microsoft.com/office/drawing/2016/5/13/chartex" xmlns:cx8="http://schemas.microsoft.com/office/drawing/2016/5/14/chartex" xmlns:mc="http://schemas.openxmlformats.org/markup-compatibility/2006" xmlns:m="http://schemas.openxmlformats.org/officeDocument/2006/math" xmlns:aink="http://schemas.microsoft.com/office/drawing/2016/ink" xmlns:am3d="http://schemas.microsoft.com/office/drawing/2017/model3d" xmlns:oel="http://schemas.microsoft.com/office/2019/extlst" xmlns:r="http://schemas.openxmlformats.org/officeDocument/2006/relationships" xmlns:wp14="http://schemas.microsoft.com/office/word/2010/wordprocessingDrawing" xmlns:wp="http://schemas.openxmlformats.org/drawingml/2006/wordprocessingDrawing" xmlns:wpg="http://schemas.microsoft.com/office/word/2010/wordprocessingGroup" xmlns:wpi="http://schemas.microsoft.com/office/word/2010/wordprocessingInk" xmlns:wps="http://schemas.microsoft.com/office/word/2010/wordprocessingShape" xmlns:o="urn:schemas-microsoft-com:office:office" xmlns:v="urn:schemas-microsoft-com:vml" xmlns:w10="urn:schemas-microsoft-com:office:word" xmlns:w="http://schemas.openxmlformats.org/wordprocessingml/2006/main" xmlns:w14="http://schemas.microsoft.com/office/word/2010/wordml" xmlns:w15="http://schemas.microsoft.com/office/word/2012/wordml" xmlns:w16cex="http://schemas.microsoft.com/office/word/2018/wordml/cex" xmlns:w16cid="http://schemas.microsoft.com/office/word/2016/wordml/cid" xmlns:w16="http://schemas.microsoft.com/office/word/2018/wordml" xmlns:w16sdtdh="http://schemas.microsoft.com/office/word/2020/wordml/sdtdatahash" xmlns:w16sdtfl="http://schemas.microsoft.com/office/word/2024/wordml/sdtformatlock" xmlns:w16se="http://schemas.microsoft.com/office/word/2015/wordml/symex" xmlns:w16du="http://schemas.microsoft.com/office/word/2023/wordml/word16du" xmlns:wne="http://schemas.microsoft.com/office/word/2006/wordml" mc:Ignorable="w14 w15 w16se w16cid w16 w16cex w16sdtdh w16sdtfl w16du wp14">
   <w:p>
     <w:pPr>
       <w:pStyle w:val="Footer"/>
@@ -5101,7 +5986,7 @@
 </file>
 
 <file path=word/footnotes.xml><?xml version="1.0" encoding="utf-8"?>
-<w:footnotes xmlns:wpc="http://schemas.microsoft.com/office/word/2010/wordprocessingCanvas" xmlns:cx="http://schemas.microsoft.com/office/drawing/2014/chartex" xmlns:cx1="http://schemas.microsoft.com/office/drawing/2015/9/8/chartex" xmlns:cx2="http://schemas.microsoft.com/office/drawing/2015/10/21/chartex" xmlns:cx3="http://schemas.microsoft.com/office/drawing/2016/5/9/chartex" xmlns:cx4="http://schemas.microsoft.com/office/drawing/2016/5/10/chartex" xmlns:cx5="http://schemas.microsoft.com/office/drawing/2016/5/11/chartex" xmlns:cx6="http://schemas.microsoft.com/office/drawing/2016/5/12/chartex" xmlns:cx7="http://schemas.microsoft.com/office/drawing/2016/5/13/chartex" xmlns:cx8="http://schemas.microsoft.com/office/drawing/2016/5/14/chartex" xmlns:mc="http://schemas.openxmlformats.org/markup-compatibility/2006" xmlns:m="http://schemas.openxmlformats.org/officeDocument/2006/math" xmlns:aink="http://schemas.microsoft.com/office/drawing/2016/ink" xmlns:am3d="http://schemas.microsoft.com/office/drawing/2017/model3d" xmlns:oel="http://schemas.microsoft.com/office/2019/extlst" xmlns:r="http://schemas.openxmlformats.org/officeDocument/2006/relationships" xmlns:wp14="http://schemas.microsoft.com/office/word/2010/wordprocessingDrawing" xmlns:wp="http://schemas.openxmlformats.org/drawingml/2006/wordprocessingDrawing" xmlns:wpg="http://schemas.microsoft.com/office/word/2010/wordprocessingGroup" xmlns:wpi="http://schemas.microsoft.com/office/word/2010/wordprocessingInk" xmlns:wps="http://schemas.microsoft.com/office/word/2010/wordprocessingShape" xmlns:o="urn:schemas-microsoft-com:office:office" xmlns:v="urn:schemas-microsoft-com:vml" xmlns:w10="urn:schemas-microsoft-com:office:word" xmlns:w="http://schemas.openxmlformats.org/wordprocessingml/2006/main" xmlns:w14="http://schemas.microsoft.com/office/word/2010/wordml" xmlns:w15="http://schemas.microsoft.com/office/word/2012/wordml" xmlns:w16cei="http://schemas.microsoft.com/office/word/2026/wordml/cei" xmlns:w16cex="http://schemas.microsoft.com/office/word/2018/wordml/cex" xmlns:w16cid="http://schemas.microsoft.com/office/word/2016/wordml/cid" xmlns:w16="http://schemas.microsoft.com/office/word/2018/wordml" xmlns:w16sdtdh="http://schemas.microsoft.com/office/word/2020/wordml/sdtdatahash" xmlns:w16sdtfl="http://schemas.microsoft.com/office/word/2024/wordml/sdtformatlock" xmlns:w16se="http://schemas.microsoft.com/office/word/2015/wordml/symex" xmlns:w16du="http://schemas.microsoft.com/office/word/2023/wordml/word16du" xmlns:wne="http://schemas.microsoft.com/office/word/2006/wordml" mc:Ignorable="w14 w15 w16se w16cid w16 w16cex w16sdtdh w16sdtfl w16du wp14">
+<w:footnotes xmlns:wpc="http://schemas.microsoft.com/office/word/2010/wordprocessingCanvas" xmlns:cx="http://schemas.microsoft.com/office/drawing/2014/chartex" xmlns:cx1="http://schemas.microsoft.com/office/drawing/2015/9/8/chartex" xmlns:cx2="http://schemas.microsoft.com/office/drawing/2015/10/21/chartex" xmlns:cx3="http://schemas.microsoft.com/office/drawing/2016/5/9/chartex" xmlns:cx4="http://schemas.microsoft.com/office/drawing/2016/5/10/chartex" xmlns:cx5="http://schemas.microsoft.com/office/drawing/2016/5/11/chartex" xmlns:cx6="http://schemas.microsoft.com/office/drawing/2016/5/12/chartex" xmlns:cx7="http://schemas.microsoft.com/office/drawing/2016/5/13/chartex" xmlns:cx8="http://schemas.microsoft.com/office/drawing/2016/5/14/chartex" xmlns:mc="http://schemas.openxmlformats.org/markup-compatibility/2006" xmlns:m="http://schemas.openxmlformats.org/officeDocument/2006/math" xmlns:aink="http://schemas.microsoft.com/office/drawing/2016/ink" xmlns:am3d="http://schemas.microsoft.com/office/drawing/2017/model3d" xmlns:oel="http://schemas.microsoft.com/office/2019/extlst" xmlns:r="http://schemas.openxmlformats.org/officeDocument/2006/relationships" xmlns:wp14="http://schemas.microsoft.com/office/word/2010/wordprocessingDrawing" xmlns:wp="http://schemas.openxmlformats.org/drawingml/2006/wordprocessingDrawing" xmlns:wpg="http://schemas.microsoft.com/office/word/2010/wordprocessingGroup" xmlns:wpi="http://schemas.microsoft.com/office/word/2010/wordprocessingInk" xmlns:wps="http://schemas.microsoft.com/office/word/2010/wordprocessingShape" xmlns:o="urn:schemas-microsoft-com:office:office" xmlns:v="urn:schemas-microsoft-com:vml" xmlns:w10="urn:schemas-microsoft-com:office:word" xmlns:w="http://schemas.openxmlformats.org/wordprocessingml/2006/main" xmlns:w14="http://schemas.microsoft.com/office/word/2010/wordml" xmlns:w15="http://schemas.microsoft.com/office/word/2012/wordml" xmlns:w16cex="http://schemas.microsoft.com/office/word/2018/wordml/cex" xmlns:w16cid="http://schemas.microsoft.com/office/word/2016/wordml/cid" xmlns:w16="http://schemas.microsoft.com/office/word/2018/wordml" xmlns:w16sdtdh="http://schemas.microsoft.com/office/word/2020/wordml/sdtdatahash" xmlns:w16sdtfl="http://schemas.microsoft.com/office/word/2024/wordml/sdtformatlock" xmlns:w16se="http://schemas.microsoft.com/office/word/2015/wordml/symex" xmlns:w16du="http://schemas.microsoft.com/office/word/2023/wordml/word16du" xmlns:wne="http://schemas.microsoft.com/office/word/2006/wordml" mc:Ignorable="w14 w15 w16se w16cid w16 w16cex w16sdtdh w16sdtfl w16du wp14">
   <w:footnote w:type="separator" w:id="-1">
     <w:p>
       <w:r>
@@ -6094,6 +6979,20 @@
       <w:szCs w:val="20"/>
     </w:rPr>
   </w:style>
+  <w:style w:type="paragraph" w:customStyle="1" w:styleId="ui-markdownparagraph">
+    <w:name w:val="ui-markdown__paragraph"/>
+    <w:basedOn w:val="Normal"/>
+    <w:rsid w:val="00FE58B1"/>
+    <w:pPr>
+      <w:spacing w:before="100" w:beforeAutospacing="1" w:after="100" w:afterAutospacing="1"/>
+    </w:pPr>
+    <w:rPr>
+      <w:rFonts w:ascii="Times New Roman" w:eastAsia="Times New Roman" w:hAnsi="Times New Roman" w:cs="Times New Roman"/>
+      <w:kern w:val="0"/>
+      <w:lang w:val="en-IN" w:eastAsia="en-GB"/>
+      <w14:ligatures w14:val="none"/>
+    </w:rPr>
+  </w:style>
 </w:styles>
 </file>
 

</xml_diff>